<commit_message>
Adiciona João Vitor Cossettin Napoleão ao esboço do relatório
</commit_message>
<xml_diff>
--- a/relatorio/Esboço do relatório.docx
+++ b/relatorio/Esboço do relatório.docx
@@ -84,32 +84,12 @@
         </w:rPr>
         <w:t xml:space="preserve">Bernardo Soares Nunes</w:t>
         <w:br/>
-      </w:r>
-      <w:r>
-        <w:rPr>
-          <w:rFonts w:ascii="Arial" w:hAnsi="Arial" w:eastAsia="Arial" w:cs="Arial"/>
-          <w:sz w:val="24"/>
-          <w:szCs w:val="24"/>
-        </w:rPr>
-      </w:r>
-      <w:r>
-        <w:rPr>
-          <w:rFonts w:ascii="Arial" w:hAnsi="Arial" w:eastAsia="Arial" w:cs="Arial"/>
-          <w:sz w:val="24"/>
-          <w:szCs w:val="24"/>
-        </w:rPr>
+        <w:t xml:space="preserve">João Vitor Cossettin Napoleão</w:t>
+        <w:br/>
         <w:t xml:space="preserve">Lorenzo Farias</w:t>
         <w:br/>
       </w:r>
       <w:r/>
-      <w:r/>
-      <w:r>
-        <w:rPr>
-          <w:rFonts w:ascii="Arial" w:hAnsi="Arial" w:eastAsia="Arial" w:cs="Arial"/>
-          <w:sz w:val="24"/>
-          <w:szCs w:val="24"/>
-        </w:rPr>
-      </w:r>
       <w:r>
         <w:rPr>
           <w:rFonts w:ascii="Arial" w:hAnsi="Arial" w:eastAsia="Arial" w:cs="Arial"/>
@@ -165,7 +145,7 @@
     </w:p>
     <w:p>
       <w:pPr>
-        <w:spacing w:after="3000"/>
+        <w:spacing w:after="2500"/>
         <w:ind w:left="4536"/>
         <w:jc w:val="both"/>
         <w:rPr/>
@@ -217,12 +197,9 @@
         </w:rPr>
         <w:t xml:space="preserve">2026</w:t>
       </w:r>
-      <w:r/>
       <w:r>
         <w:br w:type="page" w:clear="all"/>
       </w:r>
-      <w:r/>
-      <w:r/>
     </w:p>
     <w:p>
       <w:pPr>
@@ -256,15 +233,24 @@
           <w:sz w:val="24"/>
           <w:szCs w:val="24"/>
         </w:rPr>
-        <w:t xml:space="preserve">Este trabalho tem como objetivo desenvolver um simulador de Autômatos Fi</w:t>
+        <w:t xml:space="preserve">Este trabalho tem como objetivo desenvolver um simulador de Autômatos Finitos Não Determinísticos, tanto na forma convencional (AFND) quanto com transições vazias (AFND-ε), permitindo acompanhar passo a passo o reconhecimento de uma sentença e visualizar todos os caminhos de execução gerados pelas escolhas não determinísticas.</w:t>
       </w:r>
+      <w:r/>
+    </w:p>
+    <w:p>
+      <w:pPr>
+        <w:spacing w:after="0" w:before="0" w:line="360" w:lineRule="auto"/>
+        <w:ind w:firstLine="709"/>
+        <w:jc w:val="both"/>
+        <w:rPr/>
+      </w:pPr>
       <w:r>
         <w:rPr>
           <w:rFonts w:ascii="Arial" w:hAnsi="Arial" w:eastAsia="Arial" w:cs="Arial"/>
           <w:sz w:val="24"/>
           <w:szCs w:val="24"/>
         </w:rPr>
-        <w:t xml:space="preserve">nitos Não Determinísticos, tanto na forma convencional (AFND) quanto com transições vazias (AFND-ε), permitindo acompanhar passo a passo o reconhecimento de uma sentença e visualizar todos os caminhos de execução gerados pelas escolhas não determinísticas.</w:t>
+        <w:t xml:space="preserve">Para a implementação, o grupo optou por dividir o simulador em duas partes, cada uma escrita na linguagem mais adequada à sua função. O núcleo do simulador será desenvolvido na linguagem C, utilizando o CMake como sistema de compilação e o CLion como ambiente de desenvolvimento. A escolha do C se deve ao controle direto sobre as estruturas de dados e a memória, o que torna explícita a representação do autômato (alfabeto, conjunto de estados, estado inicial, estados finais e a tabela de transições, em que cada par estado/símbolo aponta para um conjunto de estados de destino) e o próprio algoritmo de reconhecimento. Toda a lógica ficará no C: leitura e gravação da especificação, validação da sentença, cálculo do fecho-ε e simulação passo a passo com a construção da árvore de caminhos.</w:t>
       </w:r>
       <w:r/>
     </w:p>
@@ -281,122 +267,41 @@
           <w:sz w:val="24"/>
           <w:szCs w:val="24"/>
         </w:rPr>
-        <w:t xml:space="preserve">Para a implementação, o g</w:t>
+        <w:t xml:space="preserve">A parte visual será desenvolvida em Python, linguagem que oferece bibliotecas prontas para interfaces gráficas e desenho de grafos, como Tkinter e Graphviz. O Python será responsável apenas pela interação com o usuário e pela exibição dos resultados, sem reimplementar a lógica do autômato. A comunicação entre as duas partes será feita executando o programa em C como um processo, que devolve o resultado da simulação em formato JSON para ser interpretado e desenhado pela interface.</w:t>
       </w:r>
+      <w:r/>
+    </w:p>
+    <w:p>
+      <w:pPr>
+        <w:spacing w:after="0" w:before="0" w:line="360" w:lineRule="auto"/>
+        <w:ind w:firstLine="709"/>
+        <w:jc w:val="both"/>
+        <w:rPr/>
+      </w:pPr>
       <w:r>
         <w:rPr>
           <w:rFonts w:ascii="Arial" w:hAnsi="Arial" w:eastAsia="Arial" w:cs="Arial"/>
           <w:sz w:val="24"/>
           <w:szCs w:val="24"/>
         </w:rPr>
-        <w:t xml:space="preserve">rupo optou por dividir o simulador em duas partes, cada uma escrita na linguagem mais adequada à sua função. O núcleo do simulador será desenvolvido na linguagem C, utilizando o CMake como sistema de compilação e o CLion como ambiente de desenvolvimento. A</w:t>
+        <w:t xml:space="preserve">Como entrada, o usuário poderá especificar o autômato pela própria interface, informando o alfabeto, a lista de estados, o estado inicial, os estados finais e as transições por meio de uma lista ou tabela. As transições permitirão múltiplos estados de destino para uma mesma combinação de estado e símbolo, além de transições ε, que não consomem símbolos da entrada. A especificação poderá ser salva em um arquivo de texto e reaberta posteriormente. Em seguida, o usuário informará a sentença a ser testada, que será validada de acordo com o alfabeto definido.</w:t>
       </w:r>
+      <w:r/>
+    </w:p>
+    <w:p>
+      <w:pPr>
+        <w:spacing w:after="0" w:before="0" w:line="360" w:lineRule="auto"/>
+        <w:ind w:firstLine="709"/>
+        <w:jc w:val="both"/>
+        <w:rPr/>
+      </w:pPr>
       <w:r>
         <w:rPr>
           <w:rFonts w:ascii="Arial" w:hAnsi="Arial" w:eastAsia="Arial" w:cs="Arial"/>
           <w:sz w:val="24"/>
           <w:szCs w:val="24"/>
         </w:rPr>
-        <w:t xml:space="preserve"> escolha do C se deve ao controle direto sobre as estruturas de dados e a memória, o que torna explícita a representação do autômato (alfabeto, conjunto de estados, estado inicial, estados finais e a tabela de transições, em que cada par estado/símbolo apo</w:t>
-      </w:r>
-      <w:r>
-        <w:rPr>
-          <w:rFonts w:ascii="Arial" w:hAnsi="Arial" w:eastAsia="Arial" w:cs="Arial"/>
-          <w:sz w:val="24"/>
-          <w:szCs w:val="24"/>
-        </w:rPr>
-        <w:t xml:space="preserve">nta para um conjunto de estados de destino) e o próprio algoritmo de reconhecimento. Toda a lógica ficará no C: leitura e gravação da especificação, validação da sentença, cálculo do fecho-ε e simulação passo a passo com a construção da árvore de caminhos.</w:t>
-      </w:r>
-      <w:r/>
-    </w:p>
-    <w:p>
-      <w:pPr>
-        <w:spacing w:after="0" w:before="0" w:line="360" w:lineRule="auto"/>
-        <w:ind w:firstLine="709"/>
-        <w:jc w:val="both"/>
-        <w:rPr/>
-      </w:pPr>
-      <w:r>
-        <w:rPr>
-          <w:rFonts w:ascii="Arial" w:hAnsi="Arial" w:eastAsia="Arial" w:cs="Arial"/>
-          <w:sz w:val="24"/>
-          <w:szCs w:val="24"/>
-        </w:rPr>
-        <w:t xml:space="preserve">A parte visual será desenvolvida em Python, linguagem que oferece bibliotecas prontas para interfaces gráficas e desenho de grafos, como Tkinter e Graphviz. O Python será responsável apenas pela interação com o usuário e pela ex</w:t>
-      </w:r>
-      <w:r>
-        <w:rPr>
-          <w:rFonts w:ascii="Arial" w:hAnsi="Arial" w:eastAsia="Arial" w:cs="Arial"/>
-          <w:sz w:val="24"/>
-          <w:szCs w:val="24"/>
-        </w:rPr>
-        <w:t xml:space="preserve">ibição dos resultados, sem reimplementar a lógica do autômato. A comunicação entre as duas partes será feita executando o programa em C como um processo, que devolve o resultado da simulação em formato JSON para ser interpretado e desenhado pela interface.</w:t>
-      </w:r>
-      <w:r/>
-    </w:p>
-    <w:p>
-      <w:pPr>
-        <w:spacing w:after="0" w:before="0" w:line="360" w:lineRule="auto"/>
-        <w:ind w:firstLine="709"/>
-        <w:jc w:val="both"/>
-        <w:rPr/>
-      </w:pPr>
-      <w:r>
-        <w:rPr>
-          <w:rFonts w:ascii="Arial" w:hAnsi="Arial" w:eastAsia="Arial" w:cs="Arial"/>
-          <w:sz w:val="24"/>
-          <w:szCs w:val="24"/>
-        </w:rPr>
-        <w:t xml:space="preserve">Como entrada, o usuário poderá especificar o aut</w:t>
-      </w:r>
-      <w:r>
-        <w:rPr>
-          <w:rFonts w:ascii="Arial" w:hAnsi="Arial" w:eastAsia="Arial" w:cs="Arial"/>
-          <w:sz w:val="24"/>
-          <w:szCs w:val="24"/>
-        </w:rPr>
-        <w:t xml:space="preserve">ômato pela própria interface, informando o alfabeto, a lista de estados, o estado inicial, os estados finais e as transições por meio de uma lista ou tabela. As transições permitirão múltiplos estados de destino para uma mesma combinação de estado e símbol</w:t>
-      </w:r>
-      <w:r>
-        <w:rPr>
-          <w:rFonts w:ascii="Arial" w:hAnsi="Arial" w:eastAsia="Arial" w:cs="Arial"/>
-          <w:sz w:val="24"/>
-          <w:szCs w:val="24"/>
-        </w:rPr>
-        <w:t xml:space="preserve">o, além de transições ε, que não consomem símbolos da entrada. A especificação poderá ser salva em um arquivo de texto e reaberta posteriormente. Em seguida, o usuário informará a sentença a ser testada, que será validada de acordo com o alfabeto definido.</w:t>
-      </w:r>
-      <w:r/>
-    </w:p>
-    <w:p>
-      <w:pPr>
-        <w:spacing w:after="0" w:before="0" w:line="360" w:lineRule="auto"/>
-        <w:ind w:firstLine="709"/>
-        <w:jc w:val="both"/>
-        <w:rPr/>
-      </w:pPr>
-      <w:r>
-        <w:rPr>
-          <w:rFonts w:ascii="Arial" w:hAnsi="Arial" w:eastAsia="Arial" w:cs="Arial"/>
-          <w:sz w:val="24"/>
-          <w:szCs w:val="24"/>
-        </w:rPr>
-        <w:t xml:space="preserve">Como saída, o simulador apresentará o desenho do aut</w:t>
-      </w:r>
-      <w:r>
-        <w:rPr>
-          <w:rFonts w:ascii="Arial" w:hAnsi="Arial" w:eastAsia="Arial" w:cs="Arial"/>
-          <w:sz w:val="24"/>
-          <w:szCs w:val="24"/>
-        </w:rPr>
-        <w:t xml:space="preserve">ômato, destacando os estados ativos em cada instante, e uma tela de execução passo a passo que mostra o estado atual, o conjunto de estados possíveis e a situação da entrada (parte já consumida e parte restante). Também será exibida a árvore de fluxos de e</w:t>
-      </w:r>
-      <w:r>
-        <w:rPr>
-          <w:rFonts w:ascii="Arial" w:hAnsi="Arial" w:eastAsia="Arial" w:cs="Arial"/>
-          <w:sz w:val="24"/>
-          <w:szCs w:val="24"/>
-        </w:rPr>
-        <w:t xml:space="preserve">xecução, em que cada escolha não determinística gera um novo ramo, diferenciando visualmente os caminhos ainda ativos, os que foram descartados e os que levaram à aceitação. Ao final da execução, o simulador informará se a sentença foi ACEITA ou REJEITADA.</w:t>
+        <w:t xml:space="preserve">Como saída, o simulador apresentará o desenho do autômato, destacando os estados ativos em cada instante, e uma tela de execução passo a passo que mostra o estado atual, o conjunto de estados possíveis e a situação da entrada (parte já consumida e parte restante). Também será exibida a árvore de fluxos de execução, em que cada escolha não determinística gera um novo ramo, diferenciando visualmente os caminhos ainda ativos, os que foram descartados e os que levaram à aceitação. Ao final da execução, o simulador informará se a sentença foi ACEITA ou REJEITADA.</w:t>
       </w:r>
       <w:r/>
     </w:p>
@@ -432,39 +337,7 @@
           <w:sz w:val="24"/>
           <w:szCs w:val="24"/>
         </w:rPr>
-        <w:t xml:space="preserve">As tarefas foram distribuídas de acordo com a divisão do simulador em núcleo e interface. Lore</w:t>
-      </w:r>
-      <w:r>
-        <w:rPr>
-          <w:rFonts w:ascii="Arial" w:hAnsi="Arial" w:eastAsia="Arial" w:cs="Arial"/>
-          <w:sz w:val="24"/>
-          <w:szCs w:val="24"/>
-        </w:rPr>
-        <w:t xml:space="preserve">nzo Farias ficará responsável pelo núcleo em C, incluindo a definição do formato do arquivo, as estruturas de dados do autômato, as funções de abrir e salvar, o cálculo do fecho-ε, o motor de execução passo a passo com a árvore de caminhos e a geração da s</w:t>
-      </w:r>
-      <w:r>
-        <w:rPr>
-          <w:rFonts w:ascii="Arial" w:hAnsi="Arial" w:eastAsia="Arial" w:cs="Arial"/>
-          <w:sz w:val="24"/>
-          <w:szCs w:val="24"/>
-        </w:rPr>
-        <w:t xml:space="preserve">aída em JSON. Pedro Buchaim ficará responsável pela interface em Python, desenvolvendo o desenho do autômato, a visualização da árvore de fluxos de execução, a tela de execução passo a passo e a tela de especificação do autômato. Bernardo Soares Nunes fica</w:t>
-      </w:r>
-      <w:r>
-        <w:rPr>
-          <w:rFonts w:ascii="Arial" w:hAnsi="Arial" w:eastAsia="Arial" w:cs="Arial"/>
-          <w:sz w:val="24"/>
-          <w:szCs w:val="24"/>
-        </w:rPr>
-        <w:t xml:space="preserve">rá responsável pelos autômatos de exemplo (reconhecedor de números reais com sinal e notação científica opcionais, reconhecedor de palavras-chave de uma linguagem de programação e dois reconhecedores de livre escolha), pelas instruções de execução e pela r</w:t>
-      </w:r>
-      <w:r>
-        <w:rPr>
-          <w:rFonts w:ascii="Arial" w:hAnsi="Arial" w:eastAsia="Arial" w:cs="Arial"/>
-          <w:sz w:val="24"/>
-          <w:szCs w:val="24"/>
-        </w:rPr>
-        <w:t xml:space="preserve">edação do relatório. A integração entre as partes, os testes e a preparação da apresentação serão realizados por todos os integrantes, de modo que cada um conheça a solução como um todo. As pendências estão organizadas como issues no repositório do GitHub.</w:t>
+        <w:t xml:space="preserve">As tarefas foram distribuídas de acordo com a divisão do simulador em núcleo e interface. Lorenzo Farias ficará responsável pelo núcleo em C, incluindo a definição do formato do arquivo, as estruturas de dados do autômato, as funções de abrir e salvar, o cálculo do fecho-ε, o motor de execução passo a passo com a árvore de caminhos e a geração da saída em JSON. Pedro Buchaim ficará responsável pela lógica da interface em Python, implementando a comunicação com o núcleo em C, a leitura do resultado em JSON e o desenho do autômato e da árvore de fluxos de execução. João Vitor Cossettin Napoleão ficará responsável pela interface gráfica (front-end), projetando o layout e a usabilidade das telas de especificação do autômato e de execução passo a passo, além da identidade visual do simulador, como cores, destaques de estados e legendas. Bernardo Soares Nunes ficará responsável pelos autômatos de exemplo (reconhecedor de números reais com sinal e notação científica opcionais, reconhecedor de palavras-chave de uma linguagem de programação e dois reconhecedores de livre escolha), pelas instruções de execução e pela redação do relatório. A integração entre as partes, os testes e a preparação da apresentação serão realizados por todos os integrantes, de modo que cada um conheça a solução como um todo. As pendências estão organizadas como issues no repositório do GitHub.</w:t>
       </w:r>
       <w:r/>
     </w:p>
@@ -563,7 +436,9 @@
         </w:tc>
       </w:tr>
       <w:tr>
-        <w:trPr/>
+        <w:trPr>
+          <w:cantSplit/>
+        </w:trPr>
         <w:tc>
           <w:tcPr>
             <w:tcBorders>
@@ -632,7 +507,9 @@
         </w:tc>
       </w:tr>
       <w:tr>
-        <w:trPr/>
+        <w:trPr>
+          <w:cantSplit/>
+        </w:trPr>
         <w:tc>
           <w:tcPr>
             <w:tcBorders>
@@ -694,14 +571,87 @@
                 <w:sz w:val="22"/>
                 <w:szCs w:val="22"/>
               </w:rPr>
-              <w:t xml:space="preserve">Interface em Python: desenho do autômato, árvore de execução, tela de passo a passo e tela de especificação do autômato</w:t>
+              <w:t xml:space="preserve">Lógica da interface em Python: comunicação com o núcleo em C, leitura do JSON e desenho do autômato e da árvore de execução</w:t>
             </w:r>
             <w:r/>
           </w:p>
         </w:tc>
       </w:tr>
       <w:tr>
-        <w:trPr/>
+        <w:trPr>
+          <w:cantSplit/>
+        </w:trPr>
+        <w:tc>
+          <w:tcPr>
+            <w:tcBorders>
+              <w:top w:val="single" w:color="808080" w:sz="4" w:space="0"/>
+              <w:left w:val="single" w:color="808080" w:sz="4" w:space="0"/>
+              <w:bottom w:val="single" w:color="808080" w:sz="4" w:space="0"/>
+              <w:right w:val="single" w:color="808080" w:sz="4" w:space="0"/>
+            </w:tcBorders>
+            <w:tcMar>
+              <w:left w:w="100" w:type="dxa"/>
+              <w:top w:w="60" w:type="dxa"/>
+              <w:right w:w="100" w:type="dxa"/>
+              <w:bottom w:w="60" w:type="dxa"/>
+            </w:tcMar>
+            <w:tcW w:w="2552" w:type="dxa"/>
+          </w:tcPr>
+          <w:p>
+            <w:pPr>
+              <w:spacing/>
+              <w:ind/>
+              <w:rPr/>
+            </w:pPr>
+            <w:r>
+              <w:rPr>
+                <w:rFonts w:ascii="Arial" w:hAnsi="Arial" w:eastAsia="Arial" w:cs="Arial"/>
+                <w:sz w:val="22"/>
+                <w:szCs w:val="22"/>
+              </w:rPr>
+              <w:t xml:space="preserve">João Vitor Cossettin Napoleão</w:t>
+            </w:r>
+            <w:r/>
+          </w:p>
+        </w:tc>
+        <w:tc>
+          <w:tcPr>
+            <w:tcBorders>
+              <w:top w:val="single" w:color="808080" w:sz="4" w:space="0"/>
+              <w:left w:val="single" w:color="808080" w:sz="4" w:space="0"/>
+              <w:bottom w:val="single" w:color="808080" w:sz="4" w:space="0"/>
+              <w:right w:val="single" w:color="808080" w:sz="4" w:space="0"/>
+            </w:tcBorders>
+            <w:tcMar>
+              <w:left w:w="100" w:type="dxa"/>
+              <w:top w:w="60" w:type="dxa"/>
+              <w:right w:w="100" w:type="dxa"/>
+              <w:bottom w:w="60" w:type="dxa"/>
+            </w:tcMar>
+            <w:tcW w:w="6521" w:type="dxa"/>
+          </w:tcPr>
+          <w:p>
+            <w:pPr>
+              <w:spacing/>
+              <w:ind/>
+              <w:rPr/>
+            </w:pPr>
+            <w:r>
+              <w:rPr>
+                <w:rFonts w:ascii="Arial" w:hAnsi="Arial" w:eastAsia="Arial" w:cs="Arial"/>
+                <w:sz w:val="22"/>
+                <w:szCs w:val="22"/>
+              </w:rPr>
+              <w:t xml:space="preserve">Interface gráfica (front-end): layout e usabilidade das telas de especificação e de passo a passo, identidade visual do simulador</w:t>
+            </w:r>
+            <w:r/>
+          </w:p>
+        </w:tc>
+      </w:tr>
+      <w:tr>
+        <w:trPr>
+          <w:cantSplit/>
+        </w:trPr>
         <w:tc>
           <w:tcPr>
             <w:tcBorders>
@@ -770,7 +720,9 @@
         </w:tc>
       </w:tr>
       <w:tr>
-        <w:trPr/>
+        <w:trPr>
+          <w:cantSplit/>
+        </w:trPr>
         <w:tc>
           <w:tcPr>
             <w:tcBorders>
@@ -845,10 +797,6 @@
         <w:ind/>
         <w:rPr/>
       </w:pPr>
-      <w:r>
-        <w:br w:type="page" w:clear="all"/>
-      </w:r>
-      <w:r/>
     </w:p>
     <w:p>
       <w:pPr>
@@ -882,15 +830,7 @@
           <w:sz w:val="24"/>
           <w:szCs w:val="24"/>
         </w:rPr>
-        <w:t xml:space="preserve">O projeto foi criado no CLion como um projeto em C com CMake e versiona</w:t>
-      </w:r>
-      <w:r>
-        <w:rPr>
-          <w:rFonts w:ascii="Arial" w:hAnsi="Arial" w:eastAsia="Arial" w:cs="Arial"/>
-          <w:sz w:val="24"/>
-          <w:szCs w:val="24"/>
-        </w:rPr>
-        <w:t xml:space="preserve">do em um repositório privado no GitHub, para o qual todos os integrantes do grupo foram convidados como colaboradores. As pendências do trabalho foram cadastradas como issues no próprio repositório. A Figura 1 mostra a página do repositório, disponível em:</w:t>
+        <w:t xml:space="preserve">O projeto foi criado no CLion como um projeto em C com CMake e versionado em um repositório privado no GitHub, para o qual todos os integrantes do grupo foram convidados como colaboradores. As pendências do trabalho foram cadastradas como issues no próprio repositório. A Figura 1 mostra a página do repositório, disponível em:</w:t>
       </w:r>
       <w:r/>
     </w:p>
@@ -1004,7 +944,6 @@
           </mc:Fallback>
         </mc:AlternateContent>
       </w:r>
-      <w:r/>
     </w:p>
     <w:p>
       <w:pPr>

</xml_diff>

<commit_message>
Simplifica a tarefa do João no esboço do relatório
</commit_message>
<xml_diff>
--- a/relatorio/Esboço do relatório.docx
+++ b/relatorio/Esboço do relatório.docx
@@ -337,7 +337,7 @@
           <w:sz w:val="24"/>
           <w:szCs w:val="24"/>
         </w:rPr>
-        <w:t xml:space="preserve">As tarefas foram distribuídas de acordo com a divisão do simulador em núcleo e interface. Lorenzo Farias ficará responsável pelo núcleo em C, incluindo a definição do formato do arquivo, as estruturas de dados do autômato, as funções de abrir e salvar, o cálculo do fecho-ε, o motor de execução passo a passo com a árvore de caminhos e a geração da saída em JSON. Pedro Buchaim ficará responsável pela lógica da interface em Python, implementando a comunicação com o núcleo em C, a leitura do resultado em JSON e o desenho do autômato e da árvore de fluxos de execução. João Vitor Cossettin Napoleão ficará responsável pela interface gráfica (front-end), projetando o layout e a usabilidade das telas de especificação do autômato e de execução passo a passo, além da identidade visual do simulador, como cores, destaques de estados e legendas. Bernardo Soares Nunes ficará responsável pelos autômatos de exemplo (reconhecedor de números reais com sinal e notação científica opcionais, reconhecedor de palavras-chave de uma linguagem de programação e dois reconhecedores de livre escolha), pelas instruções de execução e pela redação do relatório. A integração entre as partes, os testes e a preparação da apresentação serão realizados por todos os integrantes, de modo que cada um conheça a solução como um todo. As pendências estão organizadas como issues no repositório do GitHub.</w:t>
+        <w:t xml:space="preserve">As tarefas foram distribuídas de acordo com a divisão do simulador em núcleo e interface. Lorenzo Farias ficará responsável pelo núcleo em C, incluindo a definição do formato do arquivo, as estruturas de dados do autômato, as funções de abrir e salvar, o cálculo do fecho-ε, o motor de execução passo a passo com a árvore de caminhos e a geração da saída em JSON. Pedro Buchaim ficará responsável pela interface em Python, desenvolvendo o desenho do autômato, a visualização da árvore de fluxos de execução, a tela de execução passo a passo e a tela de especificação do autômato. João Vitor Cossettin Napoleão dará apoio à parte visual, elaborando o protótipo das telas e a identidade visual do simulador (cores, destaque dos estados ativos e legendas), além de testar o uso da interface com os autômatos de exemplo. Bernardo Soares Nunes ficará responsável pelos autômatos de exemplo (reconhecedor de números reais com sinal e notação científica opcionais, reconhecedor de palavras-chave de uma linguagem de programação e dois reconhecedores de livre escolha), pelas instruções de execução e pela redação do relatório. A integração entre as partes, os testes e a preparação da apresentação serão realizados por todos os integrantes, de modo que cada um conheça a solução como um todo. As pendências estão organizadas como issues no repositório do GitHub.</w:t>
       </w:r>
       <w:r/>
     </w:p>
@@ -571,7 +571,7 @@
                 <w:sz w:val="22"/>
                 <w:szCs w:val="22"/>
               </w:rPr>
-              <w:t xml:space="preserve">Lógica da interface em Python: comunicação com o núcleo em C, leitura do JSON e desenho do autômato e da árvore de execução</w:t>
+              <w:t xml:space="preserve">Interface em Python: desenho do autômato, árvore de execução, tela de passo a passo e tela de especificação do autômato</w:t>
             </w:r>
             <w:r/>
           </w:p>
@@ -642,7 +642,7 @@
                 <w:sz w:val="22"/>
                 <w:szCs w:val="22"/>
               </w:rPr>
-              <w:t xml:space="preserve">Interface gráfica (front-end): layout e usabilidade das telas de especificação e de passo a passo, identidade visual do simulador</w:t>
+              <w:t xml:space="preserve">Apoio à parte visual: protótipo das telas, identidade visual (cores e legendas) e testes de uso da interface</w:t>
             </w:r>
             <w:r/>
           </w:p>

</xml_diff>

<commit_message>
Define interface web (Flask + HTML/CSS/JS) no relatório e no CLAUDE.md
</commit_message>
<xml_diff>
--- a/relatorio/Esboço do relatório.docx
+++ b/relatorio/Esboço do relatório.docx
@@ -63,7 +63,6 @@
         </w:rPr>
         <w:t xml:space="preserve">DISCIPLINA DE COMPUTABILIDADE</w:t>
       </w:r>
-      <w:r/>
     </w:p>
     <w:p>
       <w:pPr>
@@ -88,23 +87,24 @@
         <w:br/>
         <w:t xml:space="preserve">Lorenzo Farias</w:t>
         <w:br/>
+        <w:t xml:space="preserve">Pedro</w:t>
       </w:r>
-      <w:r/>
+      <w:r>
+        <w:rPr>
+          <w:rFonts w:ascii="Arial" w:hAnsi="Arial" w:eastAsia="Arial" w:cs="Arial"/>
+          <w:sz w:val="24"/>
+          <w:szCs w:val="24"/>
+          <w:lang w:val="pt-BR"/>
+        </w:rPr>
+        <w:t xml:space="preserve"> Cabral</w:t>
+      </w:r>
       <w:r>
         <w:rPr>
           <w:rFonts w:ascii="Arial" w:hAnsi="Arial" w:eastAsia="Arial" w:cs="Arial"/>
           <w:sz w:val="24"/>
           <w:szCs w:val="24"/>
         </w:rPr>
-        <w:t xml:space="preserve">Pedro Buchaim</w:t>
-      </w:r>
-      <w:r/>
-      <w:r>
-        <w:rPr>
-          <w:rFonts w:ascii="Arial" w:hAnsi="Arial" w:eastAsia="Arial" w:cs="Arial"/>
-          <w:sz w:val="24"/>
-          <w:szCs w:val="24"/>
-        </w:rPr>
+        <w:t xml:space="preserve"> Buchaim</w:t>
       </w:r>
     </w:p>
     <w:p>
@@ -138,8 +138,17 @@
           <w:rFonts w:ascii="Arial" w:hAnsi="Arial" w:eastAsia="Arial" w:cs="Arial"/>
           <w:sz w:val="24"/>
           <w:szCs w:val="24"/>
+          <w:lang w:val="pt-BR"/>
         </w:rPr>
-        <w:t xml:space="preserve">Esboço do relatório de desenvolvimento</w:t>
+        <w:t xml:space="preserve">R</w:t>
+      </w:r>
+      <w:r>
+        <w:rPr>
+          <w:rFonts w:ascii="Arial" w:hAnsi="Arial" w:eastAsia="Arial" w:cs="Arial"/>
+          <w:sz w:val="24"/>
+          <w:szCs w:val="24"/>
+        </w:rPr>
+        <w:t xml:space="preserve">elatório de desenvolvimento</w:t>
       </w:r>
       <w:r/>
     </w:p>
@@ -150,13 +159,22 @@
         <w:jc w:val="both"/>
         <w:rPr/>
       </w:pPr>
+      <w:r>
+        <w:rPr>
+          <w:rFonts w:ascii="Arial" w:hAnsi="Arial" w:eastAsia="Arial" w:cs="Arial"/>
+          <w:sz w:val="20"/>
+          <w:szCs w:val="20"/>
+          <w:lang w:val="pt-BR"/>
+        </w:rPr>
+        <w:t xml:space="preserve">R</w:t>
+      </w:r>
       <w:r>
         <w:rPr>
           <w:rFonts w:ascii="Arial" w:hAnsi="Arial" w:eastAsia="Arial" w:cs="Arial"/>
           <w:sz w:val="20"/>
           <w:szCs w:val="20"/>
         </w:rPr>
-        <w:t xml:space="preserve">Esboço do relatório do trabalho da disciplina de Computabilidade, ministrada pelo Prof. Ivan L. Süptitz.</w:t>
+        <w:t xml:space="preserve">elatório do trabalho da disciplina de Computabilidade, ministrada pelo Prof. Ivan L. Süptitz.</w:t>
       </w:r>
       <w:r/>
     </w:p>
@@ -203,7 +221,7 @@
     </w:p>
     <w:p>
       <w:pPr>
-        <w:pStyle w:val="709"/>
+        <w:pStyle w:val="878"/>
         <w:spacing w:after="240" w:before="240"/>
         <w:ind/>
         <w:rPr/>
@@ -267,7 +285,7 @@
           <w:sz w:val="24"/>
           <w:szCs w:val="24"/>
         </w:rPr>
-        <w:t xml:space="preserve">A parte visual será desenvolvida em Python, linguagem que oferece bibliotecas prontas para interfaces gráficas e desenho de grafos, como Tkinter e Graphviz. O Python será responsável apenas pela interação com o usuário e pela exibição dos resultados, sem reimplementar a lógica do autômato. A comunicação entre as duas partes será feita executando o programa em C como um processo, que devolve o resultado da simulação em formato JSON para ser interpretado e desenhado pela interface.</w:t>
+        <w:t xml:space="preserve">A interface com o usuário será uma aplicação web, acessada pelo navegador, já que a execução passo a passo, o desenho do autômato e a árvore de fluxos de execução não seriam viáveis em uma interface de terminal. Ela será composta por um pequeno servidor em Python, utilizando o framework Flask, e por páginas em HTML, CSS e JavaScript. O servidor executará o programa em C como um processo e receberá o resultado da simulação em formato JSON, repassando-o às páginas, que exibirão o autômato, a árvore de execução e os controles do passo a passo. Assim, nem o servidor nem as páginas reimplementam a lógica do autômato, que permanece inteiramente no núcleo em C.</w:t>
       </w:r>
       <w:r/>
     </w:p>
@@ -284,7 +302,7 @@
           <w:sz w:val="24"/>
           <w:szCs w:val="24"/>
         </w:rPr>
-        <w:t xml:space="preserve">Como entrada, o usuário poderá especificar o autômato pela própria interface, informando o alfabeto, a lista de estados, o estado inicial, os estados finais e as transições por meio de uma lista ou tabela. As transições permitirão múltiplos estados de destino para uma mesma combinação de estado e símbolo, além de transições ε, que não consomem símbolos da entrada. A especificação poderá ser salva em um arquivo de texto e reaberta posteriormente. Em seguida, o usuário informará a sentença a ser testada, que será validada de acordo com o alfabeto definido.</w:t>
+        <w:t xml:space="preserve">Como entrada, o usuário poderá especificar o autômato pela própria página web, informando o alfabeto, a lista de estados, o estado inicial, os estados finais e as transições por meio de uma lista ou tabela. As transições permitirão múltiplos estados de destino para uma mesma combinação de estado e símbolo, além de transições ε, que não consomem símbolos da entrada. A especificação poderá ser salva em um arquivo de texto e reaberta posteriormente. Em seguida, o usuário informará a sentença a ser testada, que será validada de acordo com o alfabeto definido.</w:t>
       </w:r>
       <w:r/>
     </w:p>
@@ -301,13 +319,13 @@
           <w:sz w:val="24"/>
           <w:szCs w:val="24"/>
         </w:rPr>
-        <w:t xml:space="preserve">Como saída, o simulador apresentará o desenho do autômato, destacando os estados ativos em cada instante, e uma tela de execução passo a passo que mostra o estado atual, o conjunto de estados possíveis e a situação da entrada (parte já consumida e parte restante). Também será exibida a árvore de fluxos de execução, em que cada escolha não determinística gera um novo ramo, diferenciando visualmente os caminhos ainda ativos, os que foram descartados e os que levaram à aceitação. Ao final da execução, o simulador informará se a sentença foi ACEITA ou REJEITADA.</w:t>
+        <w:t xml:space="preserve">Como saída, o simulador apresentará no navegador o desenho do autômato, destacando os estados ativos em cada instante, e uma tela de execução passo a passo que mostra o estado atual, o conjunto de estados possíveis e a situação da entrada (parte já consumida e parte restante). Também será exibida a árvore de fluxos de execução, em que cada escolha não determinística gera um novo ramo, diferenciando visualmente os caminhos ainda ativos, os que foram descartados e os que levaram à aceitação. Ao final da execução, o simulador informará se a sentença foi ACEITA ou REJEITADA.</w:t>
       </w:r>
       <w:r/>
     </w:p>
     <w:p>
       <w:pPr>
-        <w:pStyle w:val="709"/>
+        <w:pStyle w:val="878"/>
         <w:spacing w:after="240" w:before="240"/>
         <w:ind/>
         <w:rPr/>
@@ -329,7 +347,12 @@
         <w:spacing w:after="240" w:before="0" w:line="360" w:lineRule="auto"/>
         <w:ind w:firstLine="709"/>
         <w:jc w:val="both"/>
-        <w:rPr/>
+        <w:rPr>
+          <w:rFonts w:ascii="Arial" w:hAnsi="Arial" w:eastAsia="Arial" w:cs="Arial"/>
+          <w:sz w:val="24"/>
+          <w:szCs w:val="24"/>
+          <w:highlight w:val="none"/>
+        </w:rPr>
       </w:pPr>
       <w:r>
         <w:rPr>
@@ -337,9 +360,17 @@
           <w:sz w:val="24"/>
           <w:szCs w:val="24"/>
         </w:rPr>
-        <w:t xml:space="preserve">As tarefas foram distribuídas de acordo com a divisão do simulador em núcleo e interface. Lorenzo Farias ficará responsável pelo núcleo em C, incluindo a definição do formato do arquivo, as estruturas de dados do autômato, as funções de abrir e salvar, o cálculo do fecho-ε, o motor de execução passo a passo com a árvore de caminhos e a geração da saída em JSON. Pedro Buchaim ficará responsável pela interface em Python, desenvolvendo o desenho do autômato, a visualização da árvore de fluxos de execução, a tela de execução passo a passo e a tela de especificação do autômato. João Vitor Cossettin Napoleão dará apoio à parte visual, elaborando o protótipo das telas e a identidade visual do simulador (cores, destaque dos estados ativos e legendas), além de testar o uso da interface com os autômatos de exemplo. Bernardo Soares Nunes ficará responsável pelos autômatos de exemplo (reconhecedor de números reais com sinal e notação científica opcionais, reconhecedor de palavras-chave de uma linguagem de programação e dois reconhecedores de livre escolha), pelas instruções de execução e pela redação do relatório. A integração entre as partes, os testes e a preparação da apresentação serão realizados por todos os integrantes, de modo que cada um conheça a solução como um todo. As pendências estão organizadas como issues no repositório do GitHub.</w:t>
+        <w:t xml:space="preserve">As tarefas foram distribuídas de acordo com a divisão do simulador em núcleo e interface. Lorenzo Farias ficará responsável pelo núcleo em C, incluindo a definição do formato do arquivo, as estruturas de dados do autômato, as funções de abrir e salvar, o cálculo do fecho-ε, o motor de execução passo a passo com a árvore de caminhos e a geração da saída em JSON. Pedro Cabral Buchaim ficará responsável pelo servidor em Python, que faz a comunicação entre as páginas e o núcleo em C, e pelo desenho do autômato e da árvore de fluxos de execução na página. João Vitor Cossettin Napoleão ficará responsável pelas páginas web em HTML, CSS e JavaScript, desenvolvendo as telas de especificação do autômato e de execução passo a passo, o layout e a identidade visual do simulador, além de testar o uso da interface com os autômatos de exemplo. Bernardo Soares Nunes ficará responsável pelos autômatos de exemplo (reconhecedor de números reais com sinal e notação científica opcionais, reconhecedor de palavras-chave de uma linguagem de programação e dois reconhecedores de livre escolha), pelas instruções de execução e pela redação do relatório. A integração entre as partes, os testes e a preparação da apresentação serão realizados por todos os integrantes, de modo que cada um conheça a solução como um todo. As pendências estão organizadas como issues no repositório do GitHub.</w:t>
       </w:r>
       <w:r/>
+      <w:r>
+        <w:rPr>
+          <w:rFonts w:ascii="Arial" w:hAnsi="Arial" w:eastAsia="Arial" w:cs="Arial"/>
+          <w:sz w:val="24"/>
+          <w:szCs w:val="24"/>
+          <w:highlight w:val="none"/>
+        </w:rPr>
+      </w:r>
     </w:p>
     <w:tbl>
       <w:tblPr>
@@ -364,7 +395,6 @@
         </w:trPr>
         <w:tc>
           <w:tcPr>
-            <w:shd w:val="clear" w:color="auto" w:fill="d9d9d9"/>
             <w:tcBorders>
               <w:top w:val="single" w:color="808080" w:sz="4" w:space="0"/>
               <w:left w:val="single" w:color="808080" w:sz="4" w:space="0"/>
@@ -400,7 +430,6 @@
         </w:tc>
         <w:tc>
           <w:tcPr>
-            <w:shd w:val="clear" w:color="auto" w:fill="d9d9d9"/>
             <w:tcBorders>
               <w:top w:val="single" w:color="808080" w:sz="4" w:space="0"/>
               <w:left w:val="single" w:color="808080" w:sz="4" w:space="0"/>
@@ -538,7 +567,7 @@
                 <w:sz w:val="22"/>
                 <w:szCs w:val="22"/>
               </w:rPr>
-              <w:t xml:space="preserve">Pedro Buchaim</w:t>
+              <w:t xml:space="preserve">Pedro Cabral Buchaim</w:t>
             </w:r>
             <w:r/>
           </w:p>
@@ -571,7 +600,7 @@
                 <w:sz w:val="22"/>
                 <w:szCs w:val="22"/>
               </w:rPr>
-              <w:t xml:space="preserve">Interface em Python: desenho do autômato, árvore de execução, tela de passo a passo e tela de especificação do autômato</w:t>
+              <w:t xml:space="preserve">Servidor em Python (Flask): comunicação entre as páginas e o núcleo em C; desenho do autômato e da árvore de execução</w:t>
             </w:r>
             <w:r/>
           </w:p>
@@ -642,7 +671,7 @@
                 <w:sz w:val="22"/>
                 <w:szCs w:val="22"/>
               </w:rPr>
-              <w:t xml:space="preserve">Apoio à parte visual: protótipo das telas, identidade visual (cores e legendas) e testes de uso da interface</w:t>
+              <w:t xml:space="preserve">Páginas web (HTML, CSS e JavaScript): telas de especificação e de passo a passo, layout, identidade visual e testes de uso</w:t>
             </w:r>
             <w:r/>
           </w:p>
@@ -797,10 +826,11 @@
         <w:ind/>
         <w:rPr/>
       </w:pPr>
+      <w:r/>
     </w:p>
     <w:p>
       <w:pPr>
-        <w:pStyle w:val="709"/>
+        <w:pStyle w:val="878"/>
         <w:spacing w:after="240" w:before="240"/>
         <w:ind/>
         <w:rPr/>
@@ -847,7 +877,21 @@
           <w:sz w:val="24"/>
           <w:szCs w:val="24"/>
         </w:rPr>
-        <w:t xml:space="preserve">https://github.com/onealhtml/TrabalhoComputabilidade</w:t>
+      </w:r>
+      <w:hyperlink r:id="rId9" w:tooltip="https://github.com/onealhtml/TrabalhoComputabilidade" w:history="1">
+        <w:r>
+          <w:rPr>
+            <w:rStyle w:val="886"/>
+          </w:rPr>
+          <w:t xml:space="preserve">https://github.com/onealhtml/TrabalhoComputabilidade</w:t>
+        </w:r>
+      </w:hyperlink>
+      <w:r>
+        <w:rPr>
+          <w:rFonts w:ascii="Arial" w:hAnsi="Arial" w:eastAsia="Arial" w:cs="Arial"/>
+          <w:sz w:val="24"/>
+          <w:szCs w:val="24"/>
+        </w:rPr>
       </w:r>
       <w:r/>
     </w:p>
@@ -897,7 +941,7 @@
                         <pic:nvPr/>
                       </pic:nvPicPr>
                       <pic:blipFill rotWithShape="1">
-                        <a:blip r:embed="rId9"/>
+                        <a:blip r:embed="rId10"/>
                         <a:stretch/>
                       </pic:blipFill>
                       <pic:spPr bwMode="auto">
@@ -937,7 +981,7 @@
                 <o:lock v:ext="edit" aspectratio="t"/>
               </v:shapetype>
               <v:shape id="_x0000_i0" o:spid="_x0000_s0" type="#_x0000_t75" style="width:450.00pt;height:282.75pt;mso-wrap-distance-left:0.00pt;mso-wrap-distance-top:0.00pt;mso-wrap-distance-right:0.00pt;mso-wrap-distance-bottom:0.00pt;z-index:1;" stroked="false">
-                <v:imagedata r:id="rId9" o:title=""/>
+                <v:imagedata r:id="rId10" o:title=""/>
                 <o:lock v:ext="edit" rotation="t"/>
               </v:shape>
             </w:pict>
@@ -983,7 +1027,6 @@
         <w:ind/>
         <w:rPr/>
       </w:pPr>
-      <w:r/>
       <w:r>
         <w:separator/>
       </w:r>
@@ -997,7 +1040,6 @@
         <w:ind/>
         <w:rPr/>
       </w:pPr>
-      <w:r/>
       <w:r>
         <w:continuationSeparator/>
       </w:r>
@@ -1016,7 +1058,6 @@
         <w:ind/>
         <w:rPr/>
       </w:pPr>
-      <w:r/>
       <w:r>
         <w:separator/>
       </w:r>
@@ -1030,7 +1071,6 @@
         <w:ind/>
         <w:rPr/>
       </w:pPr>
-      <w:r/>
       <w:r>
         <w:continuationSeparator/>
       </w:r>
@@ -1336,9 +1376,9 @@
     <w:lsdException w:name="Bibliography" w:uiPriority="37"/>
     <w:lsdException w:name="TOC Heading" w:uiPriority="39" w:qFormat="1"/>
   </w:latentStyles>
-  <w:style w:type="table" w:styleId="12">
+  <w:style w:type="table" w:styleId="703">
     <w:name w:val="Table Grid"/>
-    <w:basedOn w:val="707"/>
+    <w:basedOn w:val="876"/>
     <w:uiPriority w:val="59"/>
     <w:pPr>
       <w:pBdr/>
@@ -1535,9 +1575,9 @@
       </w:tcPr>
     </w:tblStylePr>
   </w:style>
-  <w:style w:type="table" w:styleId="13">
+  <w:style w:type="table" w:styleId="704">
     <w:name w:val="Table Grid Light"/>
-    <w:basedOn w:val="707"/>
+    <w:basedOn w:val="876"/>
     <w:uiPriority w:val="59"/>
     <w:pPr>
       <w:pBdr/>
@@ -1734,9 +1774,9 @@
       </w:tcPr>
     </w:tblStylePr>
   </w:style>
-  <w:style w:type="table" w:styleId="14">
+  <w:style w:type="table" w:styleId="705">
     <w:name w:val="Plain Table 1"/>
-    <w:basedOn w:val="707"/>
+    <w:basedOn w:val="876"/>
     <w:uiPriority w:val="59"/>
     <w:pPr>
       <w:pBdr/>
@@ -1959,9 +1999,9 @@
       </w:tcPr>
     </w:tblStylePr>
   </w:style>
-  <w:style w:type="table" w:styleId="15">
+  <w:style w:type="table" w:styleId="706">
     <w:name w:val="Plain Table 2"/>
-    <w:basedOn w:val="707"/>
+    <w:basedOn w:val="876"/>
     <w:uiPriority w:val="59"/>
     <w:pPr>
       <w:pBdr/>
@@ -2192,9 +2232,9 @@
       </w:tcPr>
     </w:tblStylePr>
   </w:style>
-  <w:style w:type="table" w:styleId="16">
+  <w:style w:type="table" w:styleId="707">
     <w:name w:val="Plain Table 3"/>
-    <w:basedOn w:val="707"/>
+    <w:basedOn w:val="876"/>
     <w:uiPriority w:val="99"/>
     <w:pPr>
       <w:pBdr/>
@@ -2422,9 +2462,9 @@
       </w:tcPr>
     </w:tblStylePr>
   </w:style>
-  <w:style w:type="table" w:styleId="17">
+  <w:style w:type="table" w:styleId="708">
     <w:name w:val="Plain Table 4"/>
-    <w:basedOn w:val="707"/>
+    <w:basedOn w:val="876"/>
     <w:uiPriority w:val="99"/>
     <w:pPr>
       <w:pBdr/>
@@ -2638,9 +2678,9 @@
       </w:tcPr>
     </w:tblStylePr>
   </w:style>
-  <w:style w:type="table" w:styleId="18">
+  <w:style w:type="table" w:styleId="709">
     <w:name w:val="Plain Table 5"/>
-    <w:basedOn w:val="707"/>
+    <w:basedOn w:val="876"/>
     <w:uiPriority w:val="99"/>
     <w:pPr>
       <w:pBdr/>
@@ -2871,9 +2911,9 @@
       </w:tcPr>
     </w:tblStylePr>
   </w:style>
-  <w:style w:type="table" w:styleId="19">
+  <w:style w:type="table" w:styleId="710">
     <w:name w:val="Grid Table 1 Light"/>
-    <w:basedOn w:val="707"/>
+    <w:basedOn w:val="876"/>
     <w:uiPriority w:val="99"/>
     <w:pPr>
       <w:pBdr/>
@@ -3094,9 +3134,9 @@
       </w:tcPr>
     </w:tblStylePr>
   </w:style>
-  <w:style w:type="table" w:styleId="20">
+  <w:style w:type="table" w:styleId="711">
     <w:name w:val="Grid Table 1 Light - Accent 1"/>
-    <w:basedOn w:val="707"/>
+    <w:basedOn w:val="876"/>
     <w:uiPriority w:val="99"/>
     <w:pPr>
       <w:pBdr/>
@@ -3317,9 +3357,9 @@
       </w:tcPr>
     </w:tblStylePr>
   </w:style>
-  <w:style w:type="table" w:styleId="21">
+  <w:style w:type="table" w:styleId="712">
     <w:name w:val="Grid Table 1 Light - Accent 2"/>
-    <w:basedOn w:val="707"/>
+    <w:basedOn w:val="876"/>
     <w:uiPriority w:val="99"/>
     <w:pPr>
       <w:pBdr/>
@@ -3540,9 +3580,9 @@
       </w:tcPr>
     </w:tblStylePr>
   </w:style>
-  <w:style w:type="table" w:styleId="22">
+  <w:style w:type="table" w:styleId="713">
     <w:name w:val="Grid Table 1 Light - Accent 3"/>
-    <w:basedOn w:val="707"/>
+    <w:basedOn w:val="876"/>
     <w:uiPriority w:val="99"/>
     <w:pPr>
       <w:pBdr/>
@@ -3763,9 +3803,9 @@
       </w:tcPr>
     </w:tblStylePr>
   </w:style>
-  <w:style w:type="table" w:styleId="23">
+  <w:style w:type="table" w:styleId="714">
     <w:name w:val="Grid Table 1 Light - Accent 4"/>
-    <w:basedOn w:val="707"/>
+    <w:basedOn w:val="876"/>
     <w:uiPriority w:val="99"/>
     <w:pPr>
       <w:pBdr/>
@@ -3986,9 +4026,9 @@
       </w:tcPr>
     </w:tblStylePr>
   </w:style>
-  <w:style w:type="table" w:styleId="24">
+  <w:style w:type="table" w:styleId="715">
     <w:name w:val="Grid Table 1 Light - Accent 5"/>
-    <w:basedOn w:val="707"/>
+    <w:basedOn w:val="876"/>
     <w:uiPriority w:val="99"/>
     <w:pPr>
       <w:pBdr/>
@@ -4209,9 +4249,9 @@
       </w:tcPr>
     </w:tblStylePr>
   </w:style>
-  <w:style w:type="table" w:styleId="25">
+  <w:style w:type="table" w:styleId="716">
     <w:name w:val="Grid Table 1 Light - Accent 6"/>
-    <w:basedOn w:val="707"/>
+    <w:basedOn w:val="876"/>
     <w:uiPriority w:val="99"/>
     <w:pPr>
       <w:pBdr/>
@@ -4432,9 +4472,9 @@
       </w:tcPr>
     </w:tblStylePr>
   </w:style>
-  <w:style w:type="table" w:styleId="26">
+  <w:style w:type="table" w:styleId="717">
     <w:name w:val="Grid Table 2"/>
-    <w:basedOn w:val="707"/>
+    <w:basedOn w:val="876"/>
     <w:uiPriority w:val="99"/>
     <w:pPr>
       <w:pBdr/>
@@ -4664,9 +4704,9 @@
       </w:tcPr>
     </w:tblStylePr>
   </w:style>
-  <w:style w:type="table" w:styleId="27">
+  <w:style w:type="table" w:styleId="718">
     <w:name w:val="Grid Table 2 - Accent 1"/>
-    <w:basedOn w:val="707"/>
+    <w:basedOn w:val="876"/>
     <w:uiPriority w:val="99"/>
     <w:pPr>
       <w:pBdr/>
@@ -4896,9 +4936,9 @@
       </w:tcPr>
     </w:tblStylePr>
   </w:style>
-  <w:style w:type="table" w:styleId="28">
+  <w:style w:type="table" w:styleId="719">
     <w:name w:val="Grid Table 2 - Accent 2"/>
-    <w:basedOn w:val="707"/>
+    <w:basedOn w:val="876"/>
     <w:uiPriority w:val="99"/>
     <w:pPr>
       <w:pBdr/>
@@ -5128,9 +5168,9 @@
       </w:tcPr>
     </w:tblStylePr>
   </w:style>
-  <w:style w:type="table" w:styleId="29">
+  <w:style w:type="table" w:styleId="720">
     <w:name w:val="Grid Table 2 - Accent 3"/>
-    <w:basedOn w:val="707"/>
+    <w:basedOn w:val="876"/>
     <w:uiPriority w:val="99"/>
     <w:pPr>
       <w:pBdr/>
@@ -5360,9 +5400,9 @@
       </w:tcPr>
     </w:tblStylePr>
   </w:style>
-  <w:style w:type="table" w:styleId="30">
+  <w:style w:type="table" w:styleId="721">
     <w:name w:val="Grid Table 2 - Accent 4"/>
-    <w:basedOn w:val="707"/>
+    <w:basedOn w:val="876"/>
     <w:uiPriority w:val="99"/>
     <w:pPr>
       <w:pBdr/>
@@ -5592,9 +5632,9 @@
       </w:tcPr>
     </w:tblStylePr>
   </w:style>
-  <w:style w:type="table" w:styleId="31">
+  <w:style w:type="table" w:styleId="722">
     <w:name w:val="Grid Table 2 - Accent 5"/>
-    <w:basedOn w:val="707"/>
+    <w:basedOn w:val="876"/>
     <w:uiPriority w:val="99"/>
     <w:pPr>
       <w:pBdr/>
@@ -5824,9 +5864,9 @@
       </w:tcPr>
     </w:tblStylePr>
   </w:style>
-  <w:style w:type="table" w:styleId="32">
+  <w:style w:type="table" w:styleId="723">
     <w:name w:val="Grid Table 2 - Accent 6"/>
-    <w:basedOn w:val="707"/>
+    <w:basedOn w:val="876"/>
     <w:uiPriority w:val="99"/>
     <w:pPr>
       <w:pBdr/>
@@ -6056,9 +6096,9 @@
       </w:tcPr>
     </w:tblStylePr>
   </w:style>
-  <w:style w:type="table" w:styleId="33">
+  <w:style w:type="table" w:styleId="724">
     <w:name w:val="Grid Table 3"/>
-    <w:basedOn w:val="707"/>
+    <w:basedOn w:val="876"/>
     <w:uiPriority w:val="99"/>
     <w:pPr>
       <w:pBdr/>
@@ -6157,29 +6197,6 @@
         <w:tblBorders/>
       </w:tblPr>
       <w:tcPr>
-        <w:shd w:color="ffffff"/>
-        <w:tcBorders>
-          <w:top w:val="none" w:color="000000" w:sz="4" w:space="0"/>
-          <w:left w:val="none" w:color="000000" w:sz="4" w:space="0"/>
-          <w:bottom w:val="none" w:color="000000" w:sz="4" w:space="0"/>
-          <w:right w:val="none" w:color="000000" w:sz="4" w:space="0"/>
-        </w:tcBorders>
-      </w:tcPr>
-    </w:tblStylePr>
-    <w:tblStylePr w:type="firstRow">
-      <w:rPr>
-        <w:b/>
-        <w:color w:val="404040"/>
-      </w:rPr>
-      <w:pPr>
-        <w:pBdr/>
-        <w:spacing/>
-        <w:ind/>
-      </w:pPr>
-      <w:tblPr>
-        <w:tblBorders/>
-      </w:tblPr>
-      <w:tcPr>
         <w:shd w:val="clear" w:color="ffffff"/>
         <w:tcBorders>
           <w:top w:val="none" w:color="000000" w:sz="4" w:space="0"/>
@@ -6189,30 +6206,7 @@
         </w:tcBorders>
       </w:tcPr>
     </w:tblStylePr>
-    <w:tblStylePr w:type="lastCol">
-      <w:rPr>
-        <w:i/>
-        <w:color w:val="404040"/>
-      </w:rPr>
-      <w:pPr>
-        <w:pBdr/>
-        <w:spacing/>
-        <w:ind/>
-      </w:pPr>
-      <w:tblPr>
-        <w:tblBorders/>
-      </w:tblPr>
-      <w:tcPr>
-        <w:shd w:color="ffffff"/>
-        <w:tcBorders>
-          <w:top w:val="none" w:color="000000" w:sz="4" w:space="0"/>
-          <w:left w:val="none" w:color="000000" w:sz="4" w:space="0"/>
-          <w:bottom w:val="none" w:color="000000" w:sz="4" w:space="0"/>
-          <w:right w:val="none" w:color="000000" w:sz="4" w:space="0"/>
-        </w:tcBorders>
-      </w:tcPr>
-    </w:tblStylePr>
-    <w:tblStylePr w:type="lastRow">
+    <w:tblStylePr w:type="firstRow">
       <w:rPr>
         <w:b/>
         <w:color w:val="404040"/>
@@ -6235,6 +6229,52 @@
         </w:tcBorders>
       </w:tcPr>
     </w:tblStylePr>
+    <w:tblStylePr w:type="lastCol">
+      <w:rPr>
+        <w:i/>
+        <w:color w:val="404040"/>
+      </w:rPr>
+      <w:pPr>
+        <w:pBdr/>
+        <w:spacing/>
+        <w:ind/>
+      </w:pPr>
+      <w:tblPr>
+        <w:tblBorders/>
+      </w:tblPr>
+      <w:tcPr>
+        <w:shd w:val="clear" w:color="ffffff"/>
+        <w:tcBorders>
+          <w:top w:val="none" w:color="000000" w:sz="4" w:space="0"/>
+          <w:left w:val="none" w:color="000000" w:sz="4" w:space="0"/>
+          <w:bottom w:val="none" w:color="000000" w:sz="4" w:space="0"/>
+          <w:right w:val="none" w:color="000000" w:sz="4" w:space="0"/>
+        </w:tcBorders>
+      </w:tcPr>
+    </w:tblStylePr>
+    <w:tblStylePr w:type="lastRow">
+      <w:rPr>
+        <w:b/>
+        <w:color w:val="404040"/>
+      </w:rPr>
+      <w:pPr>
+        <w:pBdr/>
+        <w:spacing/>
+        <w:ind/>
+      </w:pPr>
+      <w:tblPr>
+        <w:tblBorders/>
+      </w:tblPr>
+      <w:tcPr>
+        <w:shd w:val="clear" w:color="ffffff"/>
+        <w:tcBorders>
+          <w:top w:val="none" w:color="000000" w:sz="4" w:space="0"/>
+          <w:left w:val="none" w:color="000000" w:sz="4" w:space="0"/>
+          <w:bottom w:val="none" w:color="000000" w:sz="4" w:space="0"/>
+          <w:right w:val="none" w:color="000000" w:sz="4" w:space="0"/>
+        </w:tcBorders>
+      </w:tcPr>
+    </w:tblStylePr>
     <w:tblStylePr w:type="nwCell">
       <w:pPr>
         <w:pBdr/>
@@ -6301,9 +6341,9 @@
       </w:tcPr>
     </w:tblStylePr>
   </w:style>
-  <w:style w:type="table" w:styleId="34">
+  <w:style w:type="table" w:styleId="725">
     <w:name w:val="Grid Table 3 - Accent 1"/>
-    <w:basedOn w:val="707"/>
+    <w:basedOn w:val="876"/>
     <w:uiPriority w:val="99"/>
     <w:pPr>
       <w:pBdr/>
@@ -6402,29 +6442,6 @@
         <w:tblBorders/>
       </w:tblPr>
       <w:tcPr>
-        <w:shd w:color="ffffff"/>
-        <w:tcBorders>
-          <w:top w:val="none" w:color="000000" w:sz="4" w:space="0"/>
-          <w:left w:val="none" w:color="000000" w:sz="4" w:space="0"/>
-          <w:bottom w:val="none" w:color="000000" w:sz="4" w:space="0"/>
-          <w:right w:val="none" w:color="000000" w:sz="4" w:space="0"/>
-        </w:tcBorders>
-      </w:tcPr>
-    </w:tblStylePr>
-    <w:tblStylePr w:type="firstRow">
-      <w:rPr>
-        <w:b/>
-        <w:color w:val="404040"/>
-      </w:rPr>
-      <w:pPr>
-        <w:pBdr/>
-        <w:spacing/>
-        <w:ind/>
-      </w:pPr>
-      <w:tblPr>
-        <w:tblBorders/>
-      </w:tblPr>
-      <w:tcPr>
         <w:shd w:val="clear" w:color="ffffff"/>
         <w:tcBorders>
           <w:top w:val="none" w:color="000000" w:sz="4" w:space="0"/>
@@ -6434,30 +6451,7 @@
         </w:tcBorders>
       </w:tcPr>
     </w:tblStylePr>
-    <w:tblStylePr w:type="lastCol">
-      <w:rPr>
-        <w:i/>
-        <w:color w:val="404040"/>
-      </w:rPr>
-      <w:pPr>
-        <w:pBdr/>
-        <w:spacing/>
-        <w:ind/>
-      </w:pPr>
-      <w:tblPr>
-        <w:tblBorders/>
-      </w:tblPr>
-      <w:tcPr>
-        <w:shd w:color="ffffff"/>
-        <w:tcBorders>
-          <w:top w:val="none" w:color="000000" w:sz="4" w:space="0"/>
-          <w:left w:val="none" w:color="000000" w:sz="4" w:space="0"/>
-          <w:bottom w:val="none" w:color="000000" w:sz="4" w:space="0"/>
-          <w:right w:val="none" w:color="000000" w:sz="4" w:space="0"/>
-        </w:tcBorders>
-      </w:tcPr>
-    </w:tblStylePr>
-    <w:tblStylePr w:type="lastRow">
+    <w:tblStylePr w:type="firstRow">
       <w:rPr>
         <w:b/>
         <w:color w:val="404040"/>
@@ -6480,6 +6474,52 @@
         </w:tcBorders>
       </w:tcPr>
     </w:tblStylePr>
+    <w:tblStylePr w:type="lastCol">
+      <w:rPr>
+        <w:i/>
+        <w:color w:val="404040"/>
+      </w:rPr>
+      <w:pPr>
+        <w:pBdr/>
+        <w:spacing/>
+        <w:ind/>
+      </w:pPr>
+      <w:tblPr>
+        <w:tblBorders/>
+      </w:tblPr>
+      <w:tcPr>
+        <w:shd w:val="clear" w:color="ffffff"/>
+        <w:tcBorders>
+          <w:top w:val="none" w:color="000000" w:sz="4" w:space="0"/>
+          <w:left w:val="none" w:color="000000" w:sz="4" w:space="0"/>
+          <w:bottom w:val="none" w:color="000000" w:sz="4" w:space="0"/>
+          <w:right w:val="none" w:color="000000" w:sz="4" w:space="0"/>
+        </w:tcBorders>
+      </w:tcPr>
+    </w:tblStylePr>
+    <w:tblStylePr w:type="lastRow">
+      <w:rPr>
+        <w:b/>
+        <w:color w:val="404040"/>
+      </w:rPr>
+      <w:pPr>
+        <w:pBdr/>
+        <w:spacing/>
+        <w:ind/>
+      </w:pPr>
+      <w:tblPr>
+        <w:tblBorders/>
+      </w:tblPr>
+      <w:tcPr>
+        <w:shd w:val="clear" w:color="ffffff"/>
+        <w:tcBorders>
+          <w:top w:val="none" w:color="000000" w:sz="4" w:space="0"/>
+          <w:left w:val="none" w:color="000000" w:sz="4" w:space="0"/>
+          <w:bottom w:val="none" w:color="000000" w:sz="4" w:space="0"/>
+          <w:right w:val="none" w:color="000000" w:sz="4" w:space="0"/>
+        </w:tcBorders>
+      </w:tcPr>
+    </w:tblStylePr>
     <w:tblStylePr w:type="nwCell">
       <w:pPr>
         <w:pBdr/>
@@ -6546,9 +6586,9 @@
       </w:tcPr>
     </w:tblStylePr>
   </w:style>
-  <w:style w:type="table" w:styleId="35">
+  <w:style w:type="table" w:styleId="726">
     <w:name w:val="Grid Table 3 - Accent 2"/>
-    <w:basedOn w:val="707"/>
+    <w:basedOn w:val="876"/>
     <w:uiPriority w:val="99"/>
     <w:pPr>
       <w:pBdr/>
@@ -6647,29 +6687,6 @@
         <w:tblBorders/>
       </w:tblPr>
       <w:tcPr>
-        <w:shd w:color="ffffff"/>
-        <w:tcBorders>
-          <w:top w:val="none" w:color="000000" w:sz="4" w:space="0"/>
-          <w:left w:val="none" w:color="000000" w:sz="4" w:space="0"/>
-          <w:bottom w:val="none" w:color="000000" w:sz="4" w:space="0"/>
-          <w:right w:val="none" w:color="000000" w:sz="4" w:space="0"/>
-        </w:tcBorders>
-      </w:tcPr>
-    </w:tblStylePr>
-    <w:tblStylePr w:type="firstRow">
-      <w:rPr>
-        <w:b/>
-        <w:color w:val="404040"/>
-      </w:rPr>
-      <w:pPr>
-        <w:pBdr/>
-        <w:spacing/>
-        <w:ind/>
-      </w:pPr>
-      <w:tblPr>
-        <w:tblBorders/>
-      </w:tblPr>
-      <w:tcPr>
         <w:shd w:val="clear" w:color="ffffff"/>
         <w:tcBorders>
           <w:top w:val="none" w:color="000000" w:sz="4" w:space="0"/>
@@ -6679,30 +6696,7 @@
         </w:tcBorders>
       </w:tcPr>
     </w:tblStylePr>
-    <w:tblStylePr w:type="lastCol">
-      <w:rPr>
-        <w:i/>
-        <w:color w:val="404040"/>
-      </w:rPr>
-      <w:pPr>
-        <w:pBdr/>
-        <w:spacing/>
-        <w:ind/>
-      </w:pPr>
-      <w:tblPr>
-        <w:tblBorders/>
-      </w:tblPr>
-      <w:tcPr>
-        <w:shd w:color="ffffff"/>
-        <w:tcBorders>
-          <w:top w:val="none" w:color="000000" w:sz="4" w:space="0"/>
-          <w:left w:val="none" w:color="000000" w:sz="4" w:space="0"/>
-          <w:bottom w:val="none" w:color="000000" w:sz="4" w:space="0"/>
-          <w:right w:val="none" w:color="000000" w:sz="4" w:space="0"/>
-        </w:tcBorders>
-      </w:tcPr>
-    </w:tblStylePr>
-    <w:tblStylePr w:type="lastRow">
+    <w:tblStylePr w:type="firstRow">
       <w:rPr>
         <w:b/>
         <w:color w:val="404040"/>
@@ -6725,6 +6719,52 @@
         </w:tcBorders>
       </w:tcPr>
     </w:tblStylePr>
+    <w:tblStylePr w:type="lastCol">
+      <w:rPr>
+        <w:i/>
+        <w:color w:val="404040"/>
+      </w:rPr>
+      <w:pPr>
+        <w:pBdr/>
+        <w:spacing/>
+        <w:ind/>
+      </w:pPr>
+      <w:tblPr>
+        <w:tblBorders/>
+      </w:tblPr>
+      <w:tcPr>
+        <w:shd w:val="clear" w:color="ffffff"/>
+        <w:tcBorders>
+          <w:top w:val="none" w:color="000000" w:sz="4" w:space="0"/>
+          <w:left w:val="none" w:color="000000" w:sz="4" w:space="0"/>
+          <w:bottom w:val="none" w:color="000000" w:sz="4" w:space="0"/>
+          <w:right w:val="none" w:color="000000" w:sz="4" w:space="0"/>
+        </w:tcBorders>
+      </w:tcPr>
+    </w:tblStylePr>
+    <w:tblStylePr w:type="lastRow">
+      <w:rPr>
+        <w:b/>
+        <w:color w:val="404040"/>
+      </w:rPr>
+      <w:pPr>
+        <w:pBdr/>
+        <w:spacing/>
+        <w:ind/>
+      </w:pPr>
+      <w:tblPr>
+        <w:tblBorders/>
+      </w:tblPr>
+      <w:tcPr>
+        <w:shd w:val="clear" w:color="ffffff"/>
+        <w:tcBorders>
+          <w:top w:val="none" w:color="000000" w:sz="4" w:space="0"/>
+          <w:left w:val="none" w:color="000000" w:sz="4" w:space="0"/>
+          <w:bottom w:val="none" w:color="000000" w:sz="4" w:space="0"/>
+          <w:right w:val="none" w:color="000000" w:sz="4" w:space="0"/>
+        </w:tcBorders>
+      </w:tcPr>
+    </w:tblStylePr>
     <w:tblStylePr w:type="nwCell">
       <w:pPr>
         <w:pBdr/>
@@ -6791,9 +6831,9 @@
       </w:tcPr>
     </w:tblStylePr>
   </w:style>
-  <w:style w:type="table" w:styleId="36">
+  <w:style w:type="table" w:styleId="727">
     <w:name w:val="Grid Table 3 - Accent 3"/>
-    <w:basedOn w:val="707"/>
+    <w:basedOn w:val="876"/>
     <w:uiPriority w:val="99"/>
     <w:pPr>
       <w:pBdr/>
@@ -6892,29 +6932,6 @@
         <w:tblBorders/>
       </w:tblPr>
       <w:tcPr>
-        <w:shd w:color="ffffff"/>
-        <w:tcBorders>
-          <w:top w:val="none" w:color="000000" w:sz="4" w:space="0"/>
-          <w:left w:val="none" w:color="000000" w:sz="4" w:space="0"/>
-          <w:bottom w:val="none" w:color="000000" w:sz="4" w:space="0"/>
-          <w:right w:val="none" w:color="000000" w:sz="4" w:space="0"/>
-        </w:tcBorders>
-      </w:tcPr>
-    </w:tblStylePr>
-    <w:tblStylePr w:type="firstRow">
-      <w:rPr>
-        <w:b/>
-        <w:color w:val="404040"/>
-      </w:rPr>
-      <w:pPr>
-        <w:pBdr/>
-        <w:spacing/>
-        <w:ind/>
-      </w:pPr>
-      <w:tblPr>
-        <w:tblBorders/>
-      </w:tblPr>
-      <w:tcPr>
         <w:shd w:val="clear" w:color="ffffff"/>
         <w:tcBorders>
           <w:top w:val="none" w:color="000000" w:sz="4" w:space="0"/>
@@ -6924,30 +6941,7 @@
         </w:tcBorders>
       </w:tcPr>
     </w:tblStylePr>
-    <w:tblStylePr w:type="lastCol">
-      <w:rPr>
-        <w:i/>
-        <w:color w:val="404040"/>
-      </w:rPr>
-      <w:pPr>
-        <w:pBdr/>
-        <w:spacing/>
-        <w:ind/>
-      </w:pPr>
-      <w:tblPr>
-        <w:tblBorders/>
-      </w:tblPr>
-      <w:tcPr>
-        <w:shd w:color="ffffff"/>
-        <w:tcBorders>
-          <w:top w:val="none" w:color="000000" w:sz="4" w:space="0"/>
-          <w:left w:val="none" w:color="000000" w:sz="4" w:space="0"/>
-          <w:bottom w:val="none" w:color="000000" w:sz="4" w:space="0"/>
-          <w:right w:val="none" w:color="000000" w:sz="4" w:space="0"/>
-        </w:tcBorders>
-      </w:tcPr>
-    </w:tblStylePr>
-    <w:tblStylePr w:type="lastRow">
+    <w:tblStylePr w:type="firstRow">
       <w:rPr>
         <w:b/>
         <w:color w:val="404040"/>
@@ -6970,6 +6964,52 @@
         </w:tcBorders>
       </w:tcPr>
     </w:tblStylePr>
+    <w:tblStylePr w:type="lastCol">
+      <w:rPr>
+        <w:i/>
+        <w:color w:val="404040"/>
+      </w:rPr>
+      <w:pPr>
+        <w:pBdr/>
+        <w:spacing/>
+        <w:ind/>
+      </w:pPr>
+      <w:tblPr>
+        <w:tblBorders/>
+      </w:tblPr>
+      <w:tcPr>
+        <w:shd w:val="clear" w:color="ffffff"/>
+        <w:tcBorders>
+          <w:top w:val="none" w:color="000000" w:sz="4" w:space="0"/>
+          <w:left w:val="none" w:color="000000" w:sz="4" w:space="0"/>
+          <w:bottom w:val="none" w:color="000000" w:sz="4" w:space="0"/>
+          <w:right w:val="none" w:color="000000" w:sz="4" w:space="0"/>
+        </w:tcBorders>
+      </w:tcPr>
+    </w:tblStylePr>
+    <w:tblStylePr w:type="lastRow">
+      <w:rPr>
+        <w:b/>
+        <w:color w:val="404040"/>
+      </w:rPr>
+      <w:pPr>
+        <w:pBdr/>
+        <w:spacing/>
+        <w:ind/>
+      </w:pPr>
+      <w:tblPr>
+        <w:tblBorders/>
+      </w:tblPr>
+      <w:tcPr>
+        <w:shd w:val="clear" w:color="ffffff"/>
+        <w:tcBorders>
+          <w:top w:val="none" w:color="000000" w:sz="4" w:space="0"/>
+          <w:left w:val="none" w:color="000000" w:sz="4" w:space="0"/>
+          <w:bottom w:val="none" w:color="000000" w:sz="4" w:space="0"/>
+          <w:right w:val="none" w:color="000000" w:sz="4" w:space="0"/>
+        </w:tcBorders>
+      </w:tcPr>
+    </w:tblStylePr>
     <w:tblStylePr w:type="nwCell">
       <w:pPr>
         <w:pBdr/>
@@ -7036,9 +7076,9 @@
       </w:tcPr>
     </w:tblStylePr>
   </w:style>
-  <w:style w:type="table" w:styleId="37">
+  <w:style w:type="table" w:styleId="728">
     <w:name w:val="Grid Table 3 - Accent 4"/>
-    <w:basedOn w:val="707"/>
+    <w:basedOn w:val="876"/>
     <w:uiPriority w:val="99"/>
     <w:pPr>
       <w:pBdr/>
@@ -7137,29 +7177,6 @@
         <w:tblBorders/>
       </w:tblPr>
       <w:tcPr>
-        <w:shd w:color="ffffff"/>
-        <w:tcBorders>
-          <w:top w:val="none" w:color="000000" w:sz="4" w:space="0"/>
-          <w:left w:val="none" w:color="000000" w:sz="4" w:space="0"/>
-          <w:bottom w:val="none" w:color="000000" w:sz="4" w:space="0"/>
-          <w:right w:val="none" w:color="000000" w:sz="4" w:space="0"/>
-        </w:tcBorders>
-      </w:tcPr>
-    </w:tblStylePr>
-    <w:tblStylePr w:type="firstRow">
-      <w:rPr>
-        <w:b/>
-        <w:color w:val="404040"/>
-      </w:rPr>
-      <w:pPr>
-        <w:pBdr/>
-        <w:spacing/>
-        <w:ind/>
-      </w:pPr>
-      <w:tblPr>
-        <w:tblBorders/>
-      </w:tblPr>
-      <w:tcPr>
         <w:shd w:val="clear" w:color="ffffff"/>
         <w:tcBorders>
           <w:top w:val="none" w:color="000000" w:sz="4" w:space="0"/>
@@ -7169,30 +7186,7 @@
         </w:tcBorders>
       </w:tcPr>
     </w:tblStylePr>
-    <w:tblStylePr w:type="lastCol">
-      <w:rPr>
-        <w:i/>
-        <w:color w:val="404040"/>
-      </w:rPr>
-      <w:pPr>
-        <w:pBdr/>
-        <w:spacing/>
-        <w:ind/>
-      </w:pPr>
-      <w:tblPr>
-        <w:tblBorders/>
-      </w:tblPr>
-      <w:tcPr>
-        <w:shd w:color="ffffff"/>
-        <w:tcBorders>
-          <w:top w:val="none" w:color="000000" w:sz="4" w:space="0"/>
-          <w:left w:val="none" w:color="000000" w:sz="4" w:space="0"/>
-          <w:bottom w:val="none" w:color="000000" w:sz="4" w:space="0"/>
-          <w:right w:val="none" w:color="000000" w:sz="4" w:space="0"/>
-        </w:tcBorders>
-      </w:tcPr>
-    </w:tblStylePr>
-    <w:tblStylePr w:type="lastRow">
+    <w:tblStylePr w:type="firstRow">
       <w:rPr>
         <w:b/>
         <w:color w:val="404040"/>
@@ -7215,6 +7209,52 @@
         </w:tcBorders>
       </w:tcPr>
     </w:tblStylePr>
+    <w:tblStylePr w:type="lastCol">
+      <w:rPr>
+        <w:i/>
+        <w:color w:val="404040"/>
+      </w:rPr>
+      <w:pPr>
+        <w:pBdr/>
+        <w:spacing/>
+        <w:ind/>
+      </w:pPr>
+      <w:tblPr>
+        <w:tblBorders/>
+      </w:tblPr>
+      <w:tcPr>
+        <w:shd w:val="clear" w:color="ffffff"/>
+        <w:tcBorders>
+          <w:top w:val="none" w:color="000000" w:sz="4" w:space="0"/>
+          <w:left w:val="none" w:color="000000" w:sz="4" w:space="0"/>
+          <w:bottom w:val="none" w:color="000000" w:sz="4" w:space="0"/>
+          <w:right w:val="none" w:color="000000" w:sz="4" w:space="0"/>
+        </w:tcBorders>
+      </w:tcPr>
+    </w:tblStylePr>
+    <w:tblStylePr w:type="lastRow">
+      <w:rPr>
+        <w:b/>
+        <w:color w:val="404040"/>
+      </w:rPr>
+      <w:pPr>
+        <w:pBdr/>
+        <w:spacing/>
+        <w:ind/>
+      </w:pPr>
+      <w:tblPr>
+        <w:tblBorders/>
+      </w:tblPr>
+      <w:tcPr>
+        <w:shd w:val="clear" w:color="ffffff"/>
+        <w:tcBorders>
+          <w:top w:val="none" w:color="000000" w:sz="4" w:space="0"/>
+          <w:left w:val="none" w:color="000000" w:sz="4" w:space="0"/>
+          <w:bottom w:val="none" w:color="000000" w:sz="4" w:space="0"/>
+          <w:right w:val="none" w:color="000000" w:sz="4" w:space="0"/>
+        </w:tcBorders>
+      </w:tcPr>
+    </w:tblStylePr>
     <w:tblStylePr w:type="nwCell">
       <w:pPr>
         <w:pBdr/>
@@ -7281,9 +7321,9 @@
       </w:tcPr>
     </w:tblStylePr>
   </w:style>
-  <w:style w:type="table" w:styleId="38">
+  <w:style w:type="table" w:styleId="729">
     <w:name w:val="Grid Table 3 - Accent 5"/>
-    <w:basedOn w:val="707"/>
+    <w:basedOn w:val="876"/>
     <w:uiPriority w:val="99"/>
     <w:pPr>
       <w:pBdr/>
@@ -7382,29 +7422,6 @@
         <w:tblBorders/>
       </w:tblPr>
       <w:tcPr>
-        <w:shd w:color="ffffff"/>
-        <w:tcBorders>
-          <w:top w:val="none" w:color="000000" w:sz="4" w:space="0"/>
-          <w:left w:val="none" w:color="000000" w:sz="4" w:space="0"/>
-          <w:bottom w:val="none" w:color="000000" w:sz="4" w:space="0"/>
-          <w:right w:val="none" w:color="000000" w:sz="4" w:space="0"/>
-        </w:tcBorders>
-      </w:tcPr>
-    </w:tblStylePr>
-    <w:tblStylePr w:type="firstRow">
-      <w:rPr>
-        <w:b/>
-        <w:color w:val="404040"/>
-      </w:rPr>
-      <w:pPr>
-        <w:pBdr/>
-        <w:spacing/>
-        <w:ind/>
-      </w:pPr>
-      <w:tblPr>
-        <w:tblBorders/>
-      </w:tblPr>
-      <w:tcPr>
         <w:shd w:val="clear" w:color="ffffff"/>
         <w:tcBorders>
           <w:top w:val="none" w:color="000000" w:sz="4" w:space="0"/>
@@ -7414,30 +7431,7 @@
         </w:tcBorders>
       </w:tcPr>
     </w:tblStylePr>
-    <w:tblStylePr w:type="lastCol">
-      <w:rPr>
-        <w:i/>
-        <w:color w:val="404040"/>
-      </w:rPr>
-      <w:pPr>
-        <w:pBdr/>
-        <w:spacing/>
-        <w:ind/>
-      </w:pPr>
-      <w:tblPr>
-        <w:tblBorders/>
-      </w:tblPr>
-      <w:tcPr>
-        <w:shd w:color="ffffff"/>
-        <w:tcBorders>
-          <w:top w:val="none" w:color="000000" w:sz="4" w:space="0"/>
-          <w:left w:val="none" w:color="000000" w:sz="4" w:space="0"/>
-          <w:bottom w:val="none" w:color="000000" w:sz="4" w:space="0"/>
-          <w:right w:val="none" w:color="000000" w:sz="4" w:space="0"/>
-        </w:tcBorders>
-      </w:tcPr>
-    </w:tblStylePr>
-    <w:tblStylePr w:type="lastRow">
+    <w:tblStylePr w:type="firstRow">
       <w:rPr>
         <w:b/>
         <w:color w:val="404040"/>
@@ -7460,6 +7454,52 @@
         </w:tcBorders>
       </w:tcPr>
     </w:tblStylePr>
+    <w:tblStylePr w:type="lastCol">
+      <w:rPr>
+        <w:i/>
+        <w:color w:val="404040"/>
+      </w:rPr>
+      <w:pPr>
+        <w:pBdr/>
+        <w:spacing/>
+        <w:ind/>
+      </w:pPr>
+      <w:tblPr>
+        <w:tblBorders/>
+      </w:tblPr>
+      <w:tcPr>
+        <w:shd w:val="clear" w:color="ffffff"/>
+        <w:tcBorders>
+          <w:top w:val="none" w:color="000000" w:sz="4" w:space="0"/>
+          <w:left w:val="none" w:color="000000" w:sz="4" w:space="0"/>
+          <w:bottom w:val="none" w:color="000000" w:sz="4" w:space="0"/>
+          <w:right w:val="none" w:color="000000" w:sz="4" w:space="0"/>
+        </w:tcBorders>
+      </w:tcPr>
+    </w:tblStylePr>
+    <w:tblStylePr w:type="lastRow">
+      <w:rPr>
+        <w:b/>
+        <w:color w:val="404040"/>
+      </w:rPr>
+      <w:pPr>
+        <w:pBdr/>
+        <w:spacing/>
+        <w:ind/>
+      </w:pPr>
+      <w:tblPr>
+        <w:tblBorders/>
+      </w:tblPr>
+      <w:tcPr>
+        <w:shd w:val="clear" w:color="ffffff"/>
+        <w:tcBorders>
+          <w:top w:val="none" w:color="000000" w:sz="4" w:space="0"/>
+          <w:left w:val="none" w:color="000000" w:sz="4" w:space="0"/>
+          <w:bottom w:val="none" w:color="000000" w:sz="4" w:space="0"/>
+          <w:right w:val="none" w:color="000000" w:sz="4" w:space="0"/>
+        </w:tcBorders>
+      </w:tcPr>
+    </w:tblStylePr>
     <w:tblStylePr w:type="nwCell">
       <w:pPr>
         <w:pBdr/>
@@ -7526,9 +7566,9 @@
       </w:tcPr>
     </w:tblStylePr>
   </w:style>
-  <w:style w:type="table" w:styleId="39">
+  <w:style w:type="table" w:styleId="730">
     <w:name w:val="Grid Table 3 - Accent 6"/>
-    <w:basedOn w:val="707"/>
+    <w:basedOn w:val="876"/>
     <w:uiPriority w:val="99"/>
     <w:pPr>
       <w:pBdr/>
@@ -7627,29 +7667,6 @@
         <w:tblBorders/>
       </w:tblPr>
       <w:tcPr>
-        <w:shd w:color="ffffff"/>
-        <w:tcBorders>
-          <w:top w:val="none" w:color="000000" w:sz="4" w:space="0"/>
-          <w:left w:val="none" w:color="000000" w:sz="4" w:space="0"/>
-          <w:bottom w:val="none" w:color="000000" w:sz="4" w:space="0"/>
-          <w:right w:val="none" w:color="000000" w:sz="4" w:space="0"/>
-        </w:tcBorders>
-      </w:tcPr>
-    </w:tblStylePr>
-    <w:tblStylePr w:type="firstRow">
-      <w:rPr>
-        <w:b/>
-        <w:color w:val="404040"/>
-      </w:rPr>
-      <w:pPr>
-        <w:pBdr/>
-        <w:spacing/>
-        <w:ind/>
-      </w:pPr>
-      <w:tblPr>
-        <w:tblBorders/>
-      </w:tblPr>
-      <w:tcPr>
         <w:shd w:val="clear" w:color="ffffff"/>
         <w:tcBorders>
           <w:top w:val="none" w:color="000000" w:sz="4" w:space="0"/>
@@ -7659,30 +7676,7 @@
         </w:tcBorders>
       </w:tcPr>
     </w:tblStylePr>
-    <w:tblStylePr w:type="lastCol">
-      <w:rPr>
-        <w:i/>
-        <w:color w:val="404040"/>
-      </w:rPr>
-      <w:pPr>
-        <w:pBdr/>
-        <w:spacing/>
-        <w:ind/>
-      </w:pPr>
-      <w:tblPr>
-        <w:tblBorders/>
-      </w:tblPr>
-      <w:tcPr>
-        <w:shd w:color="ffffff"/>
-        <w:tcBorders>
-          <w:top w:val="none" w:color="000000" w:sz="4" w:space="0"/>
-          <w:left w:val="none" w:color="000000" w:sz="4" w:space="0"/>
-          <w:bottom w:val="none" w:color="000000" w:sz="4" w:space="0"/>
-          <w:right w:val="none" w:color="000000" w:sz="4" w:space="0"/>
-        </w:tcBorders>
-      </w:tcPr>
-    </w:tblStylePr>
-    <w:tblStylePr w:type="lastRow">
+    <w:tblStylePr w:type="firstRow">
       <w:rPr>
         <w:b/>
         <w:color w:val="404040"/>
@@ -7705,6 +7699,52 @@
         </w:tcBorders>
       </w:tcPr>
     </w:tblStylePr>
+    <w:tblStylePr w:type="lastCol">
+      <w:rPr>
+        <w:i/>
+        <w:color w:val="404040"/>
+      </w:rPr>
+      <w:pPr>
+        <w:pBdr/>
+        <w:spacing/>
+        <w:ind/>
+      </w:pPr>
+      <w:tblPr>
+        <w:tblBorders/>
+      </w:tblPr>
+      <w:tcPr>
+        <w:shd w:val="clear" w:color="ffffff"/>
+        <w:tcBorders>
+          <w:top w:val="none" w:color="000000" w:sz="4" w:space="0"/>
+          <w:left w:val="none" w:color="000000" w:sz="4" w:space="0"/>
+          <w:bottom w:val="none" w:color="000000" w:sz="4" w:space="0"/>
+          <w:right w:val="none" w:color="000000" w:sz="4" w:space="0"/>
+        </w:tcBorders>
+      </w:tcPr>
+    </w:tblStylePr>
+    <w:tblStylePr w:type="lastRow">
+      <w:rPr>
+        <w:b/>
+        <w:color w:val="404040"/>
+      </w:rPr>
+      <w:pPr>
+        <w:pBdr/>
+        <w:spacing/>
+        <w:ind/>
+      </w:pPr>
+      <w:tblPr>
+        <w:tblBorders/>
+      </w:tblPr>
+      <w:tcPr>
+        <w:shd w:val="clear" w:color="ffffff"/>
+        <w:tcBorders>
+          <w:top w:val="none" w:color="000000" w:sz="4" w:space="0"/>
+          <w:left w:val="none" w:color="000000" w:sz="4" w:space="0"/>
+          <w:bottom w:val="none" w:color="000000" w:sz="4" w:space="0"/>
+          <w:right w:val="none" w:color="000000" w:sz="4" w:space="0"/>
+        </w:tcBorders>
+      </w:tcPr>
+    </w:tblStylePr>
     <w:tblStylePr w:type="nwCell">
       <w:pPr>
         <w:pBdr/>
@@ -7771,9 +7811,9 @@
       </w:tcPr>
     </w:tblStylePr>
   </w:style>
-  <w:style w:type="table" w:styleId="40">
+  <w:style w:type="table" w:styleId="731">
     <w:name w:val="Grid Table 4"/>
-    <w:basedOn w:val="707"/>
+    <w:basedOn w:val="876"/>
     <w:uiPriority w:val="59"/>
     <w:pPr>
       <w:pBdr/>
@@ -8004,9 +8044,9 @@
       </w:tcPr>
     </w:tblStylePr>
   </w:style>
-  <w:style w:type="table" w:styleId="41">
+  <w:style w:type="table" w:styleId="732">
     <w:name w:val="Grid Table 4 - Accent 1"/>
-    <w:basedOn w:val="707"/>
+    <w:basedOn w:val="876"/>
     <w:uiPriority w:val="59"/>
     <w:pPr>
       <w:pBdr/>
@@ -8237,9 +8277,9 @@
       </w:tcPr>
     </w:tblStylePr>
   </w:style>
-  <w:style w:type="table" w:styleId="42">
+  <w:style w:type="table" w:styleId="733">
     <w:name w:val="Grid Table 4 - Accent 2"/>
-    <w:basedOn w:val="707"/>
+    <w:basedOn w:val="876"/>
     <w:uiPriority w:val="59"/>
     <w:pPr>
       <w:pBdr/>
@@ -8470,9 +8510,9 @@
       </w:tcPr>
     </w:tblStylePr>
   </w:style>
-  <w:style w:type="table" w:styleId="43">
+  <w:style w:type="table" w:styleId="734">
     <w:name w:val="Grid Table 4 - Accent 3"/>
-    <w:basedOn w:val="707"/>
+    <w:basedOn w:val="876"/>
     <w:uiPriority w:val="59"/>
     <w:pPr>
       <w:pBdr/>
@@ -8703,9 +8743,9 @@
       </w:tcPr>
     </w:tblStylePr>
   </w:style>
-  <w:style w:type="table" w:styleId="44">
+  <w:style w:type="table" w:styleId="735">
     <w:name w:val="Grid Table 4 - Accent 4"/>
-    <w:basedOn w:val="707"/>
+    <w:basedOn w:val="876"/>
     <w:uiPriority w:val="59"/>
     <w:pPr>
       <w:pBdr/>
@@ -8936,9 +8976,9 @@
       </w:tcPr>
     </w:tblStylePr>
   </w:style>
-  <w:style w:type="table" w:styleId="45">
+  <w:style w:type="table" w:styleId="736">
     <w:name w:val="Grid Table 4 - Accent 5"/>
-    <w:basedOn w:val="707"/>
+    <w:basedOn w:val="876"/>
     <w:uiPriority w:val="59"/>
     <w:pPr>
       <w:pBdr/>
@@ -9169,9 +9209,9 @@
       </w:tcPr>
     </w:tblStylePr>
   </w:style>
-  <w:style w:type="table" w:styleId="46">
+  <w:style w:type="table" w:styleId="737">
     <w:name w:val="Grid Table 4 - Accent 6"/>
-    <w:basedOn w:val="707"/>
+    <w:basedOn w:val="876"/>
     <w:uiPriority w:val="59"/>
     <w:pPr>
       <w:pBdr/>
@@ -9402,9 +9442,9 @@
       </w:tcPr>
     </w:tblStylePr>
   </w:style>
-  <w:style w:type="table" w:styleId="47">
+  <w:style w:type="table" w:styleId="738">
     <w:name w:val="Grid Table 5 Dark"/>
-    <w:basedOn w:val="707"/>
+    <w:basedOn w:val="876"/>
     <w:uiPriority w:val="99"/>
     <w:pPr>
       <w:pBdr/>
@@ -9630,9 +9670,9 @@
       </w:tcPr>
     </w:tblStylePr>
   </w:style>
-  <w:style w:type="table" w:styleId="48">
+  <w:style w:type="table" w:styleId="739">
     <w:name w:val="Grid Table 5 Dark- Accent 1"/>
-    <w:basedOn w:val="707"/>
+    <w:basedOn w:val="876"/>
     <w:uiPriority w:val="99"/>
     <w:pPr>
       <w:pBdr/>
@@ -9858,9 +9898,9 @@
       </w:tcPr>
     </w:tblStylePr>
   </w:style>
-  <w:style w:type="table" w:styleId="49">
+  <w:style w:type="table" w:styleId="740">
     <w:name w:val="Grid Table 5 Dark - Accent 2"/>
-    <w:basedOn w:val="707"/>
+    <w:basedOn w:val="876"/>
     <w:uiPriority w:val="99"/>
     <w:pPr>
       <w:pBdr/>
@@ -10086,9 +10126,9 @@
       </w:tcPr>
     </w:tblStylePr>
   </w:style>
-  <w:style w:type="table" w:styleId="50">
+  <w:style w:type="table" w:styleId="741">
     <w:name w:val="Grid Table 5 Dark - Accent 3"/>
-    <w:basedOn w:val="707"/>
+    <w:basedOn w:val="876"/>
     <w:uiPriority w:val="99"/>
     <w:pPr>
       <w:pBdr/>
@@ -10314,9 +10354,9 @@
       </w:tcPr>
     </w:tblStylePr>
   </w:style>
-  <w:style w:type="table" w:styleId="51">
+  <w:style w:type="table" w:styleId="742">
     <w:name w:val="Grid Table 5 Dark- Accent 4"/>
-    <w:basedOn w:val="707"/>
+    <w:basedOn w:val="876"/>
     <w:uiPriority w:val="99"/>
     <w:pPr>
       <w:pBdr/>
@@ -10542,9 +10582,9 @@
       </w:tcPr>
     </w:tblStylePr>
   </w:style>
-  <w:style w:type="table" w:styleId="52">
+  <w:style w:type="table" w:styleId="743">
     <w:name w:val="Grid Table 5 Dark - Accent 5"/>
-    <w:basedOn w:val="707"/>
+    <w:basedOn w:val="876"/>
     <w:uiPriority w:val="99"/>
     <w:pPr>
       <w:pBdr/>
@@ -10770,9 +10810,9 @@
       </w:tcPr>
     </w:tblStylePr>
   </w:style>
-  <w:style w:type="table" w:styleId="53">
+  <w:style w:type="table" w:styleId="744">
     <w:name w:val="Grid Table 5 Dark - Accent 6"/>
-    <w:basedOn w:val="707"/>
+    <w:basedOn w:val="876"/>
     <w:uiPriority w:val="99"/>
     <w:pPr>
       <w:pBdr/>
@@ -10998,9 +11038,9 @@
       </w:tcPr>
     </w:tblStylePr>
   </w:style>
-  <w:style w:type="table" w:styleId="54">
+  <w:style w:type="table" w:styleId="745">
     <w:name w:val="Grid Table 6 Colorful"/>
-    <w:basedOn w:val="707"/>
+    <w:basedOn w:val="876"/>
     <w:uiPriority w:val="99"/>
     <w:pPr>
       <w:pBdr/>
@@ -11228,9 +11268,9 @@
       </w:tcPr>
     </w:tblStylePr>
   </w:style>
-  <w:style w:type="table" w:styleId="55">
+  <w:style w:type="table" w:styleId="746">
     <w:name w:val="Grid Table 6 Colorful - Accent 1"/>
-    <w:basedOn w:val="707"/>
+    <w:basedOn w:val="876"/>
     <w:uiPriority w:val="99"/>
     <w:pPr>
       <w:pBdr/>
@@ -11458,9 +11498,9 @@
       </w:tcPr>
     </w:tblStylePr>
   </w:style>
-  <w:style w:type="table" w:styleId="56">
+  <w:style w:type="table" w:styleId="747">
     <w:name w:val="Grid Table 6 Colorful - Accent 2"/>
-    <w:basedOn w:val="707"/>
+    <w:basedOn w:val="876"/>
     <w:uiPriority w:val="99"/>
     <w:pPr>
       <w:pBdr/>
@@ -11688,9 +11728,9 @@
       </w:tcPr>
     </w:tblStylePr>
   </w:style>
-  <w:style w:type="table" w:styleId="57">
+  <w:style w:type="table" w:styleId="748">
     <w:name w:val="Grid Table 6 Colorful - Accent 3"/>
-    <w:basedOn w:val="707"/>
+    <w:basedOn w:val="876"/>
     <w:uiPriority w:val="99"/>
     <w:pPr>
       <w:pBdr/>
@@ -11918,9 +11958,9 @@
       </w:tcPr>
     </w:tblStylePr>
   </w:style>
-  <w:style w:type="table" w:styleId="58">
+  <w:style w:type="table" w:styleId="749">
     <w:name w:val="Grid Table 6 Colorful - Accent 4"/>
-    <w:basedOn w:val="707"/>
+    <w:basedOn w:val="876"/>
     <w:uiPriority w:val="99"/>
     <w:pPr>
       <w:pBdr/>
@@ -12148,9 +12188,9 @@
       </w:tcPr>
     </w:tblStylePr>
   </w:style>
-  <w:style w:type="table" w:styleId="59">
+  <w:style w:type="table" w:styleId="750">
     <w:name w:val="Grid Table 6 Colorful - Accent 5"/>
-    <w:basedOn w:val="707"/>
+    <w:basedOn w:val="876"/>
     <w:uiPriority w:val="99"/>
     <w:pPr>
       <w:pBdr/>
@@ -12378,9 +12418,9 @@
       </w:tcPr>
     </w:tblStylePr>
   </w:style>
-  <w:style w:type="table" w:styleId="60">
+  <w:style w:type="table" w:styleId="751">
     <w:name w:val="Grid Table 6 Colorful - Accent 6"/>
-    <w:basedOn w:val="707"/>
+    <w:basedOn w:val="876"/>
     <w:uiPriority w:val="99"/>
     <w:pPr>
       <w:pBdr/>
@@ -12608,9 +12648,9 @@
       </w:tcPr>
     </w:tblStylePr>
   </w:style>
-  <w:style w:type="table" w:styleId="61">
+  <w:style w:type="table" w:styleId="752">
     <w:name w:val="Grid Table 7 Colorful"/>
-    <w:basedOn w:val="707"/>
+    <w:basedOn w:val="876"/>
     <w:uiPriority w:val="99"/>
     <w:pPr>
       <w:pBdr/>
@@ -12712,11 +12752,11 @@
         <w:tblBorders/>
       </w:tblPr>
       <w:tcPr>
-        <w:shd w:color="ffffff"/>
+        <w:shd w:val="clear" w:color="ffffff"/>
         <w:tcBorders>
-          <w:top w:val="none"/>
-          <w:left w:val="none"/>
-          <w:bottom w:val="none"/>
+          <w:top w:val="none" w:color="000000" w:sz="4" w:space="0"/>
+          <w:left w:val="none" w:color="000000" w:sz="4" w:space="0"/>
+          <w:bottom w:val="none" w:color="000000" w:sz="4" w:space="0"/>
           <w:right w:val="single" w:color="000000" w:themeColor="text1" w:themeTint="80" w:sz="4" w:space="0"/>
         </w:tcBorders>
       </w:tcPr>
@@ -12739,10 +12779,10 @@
       <w:tcPr>
         <w:shd w:val="clear" w:color="ffffff" w:themeColor="light1" w:fill="ffffff" w:themeFill="light1"/>
         <w:tcBorders>
-          <w:top w:val="none"/>
-          <w:left w:val="none"/>
+          <w:top w:val="none" w:color="000000" w:sz="4" w:space="0"/>
+          <w:left w:val="none" w:color="000000" w:sz="4" w:space="0"/>
           <w:bottom w:val="single" w:color="000000" w:themeColor="text1" w:themeTint="80" w:sz="4" w:space="0"/>
-          <w:right w:val="none"/>
+          <w:right w:val="none" w:color="000000" w:sz="4" w:space="0"/>
         </w:tcBorders>
       </w:tcPr>
     </w:tblStylePr>
@@ -12762,12 +12802,12 @@
         <w:tblBorders/>
       </w:tblPr>
       <w:tcPr>
-        <w:shd w:color="ffffff"/>
+        <w:shd w:val="clear" w:color="ffffff"/>
         <w:tcBorders>
-          <w:top w:val="none"/>
+          <w:top w:val="none" w:color="000000" w:sz="4" w:space="0"/>
           <w:left w:val="single" w:color="000000" w:themeColor="text1" w:themeTint="80" w:sz="4" w:space="0"/>
-          <w:bottom w:val="none"/>
-          <w:right w:val="none"/>
+          <w:bottom w:val="none" w:color="000000" w:sz="4" w:space="0"/>
+          <w:right w:val="none" w:color="000000" w:sz="4" w:space="0"/>
         </w:tcBorders>
       </w:tcPr>
     </w:tblStylePr>
@@ -12790,9 +12830,9 @@
         <w:shd w:val="clear" w:color="ffffff" w:themeColor="light1" w:fill="ffffff" w:themeFill="light1"/>
         <w:tcBorders>
           <w:top w:val="single" w:color="000000" w:themeColor="text1" w:themeTint="80" w:sz="4" w:space="0"/>
-          <w:left w:val="none"/>
-          <w:bottom w:val="none"/>
-          <w:right w:val="none"/>
+          <w:left w:val="none" w:color="000000" w:sz="4" w:space="0"/>
+          <w:bottom w:val="none" w:color="000000" w:sz="4" w:space="0"/>
+          <w:right w:val="none" w:color="000000" w:sz="4" w:space="0"/>
         </w:tcBorders>
       </w:tcPr>
     </w:tblStylePr>
@@ -12862,9 +12902,9 @@
       </w:tcPr>
     </w:tblStylePr>
   </w:style>
-  <w:style w:type="table" w:styleId="62">
+  <w:style w:type="table" w:styleId="753">
     <w:name w:val="Grid Table 7 Colorful - Accent 1"/>
-    <w:basedOn w:val="707"/>
+    <w:basedOn w:val="876"/>
     <w:uiPriority w:val="99"/>
     <w:pPr>
       <w:pBdr/>
@@ -12966,11 +13006,11 @@
         <w:tblBorders/>
       </w:tblPr>
       <w:tcPr>
-        <w:shd w:color="ffffff"/>
+        <w:shd w:val="clear" w:color="ffffff"/>
         <w:tcBorders>
-          <w:top w:val="none"/>
-          <w:left w:val="none"/>
-          <w:bottom w:val="none"/>
+          <w:top w:val="none" w:color="000000" w:sz="4" w:space="0"/>
+          <w:left w:val="none" w:color="000000" w:sz="4" w:space="0"/>
+          <w:bottom w:val="none" w:color="000000" w:sz="4" w:space="0"/>
           <w:right w:val="single" w:color="000000" w:themeColor="accent1" w:themeTint="80" w:sz="4" w:space="0"/>
         </w:tcBorders>
       </w:tcPr>
@@ -12993,10 +13033,10 @@
       <w:tcPr>
         <w:shd w:val="clear" w:color="ffffff" w:themeColor="light1" w:fill="ffffff" w:themeFill="light1"/>
         <w:tcBorders>
-          <w:top w:val="none"/>
-          <w:left w:val="none"/>
+          <w:top w:val="none" w:color="000000" w:sz="4" w:space="0"/>
+          <w:left w:val="none" w:color="000000" w:sz="4" w:space="0"/>
           <w:bottom w:val="single" w:color="000000" w:themeColor="accent1" w:themeTint="80" w:sz="4" w:space="0"/>
-          <w:right w:val="none"/>
+          <w:right w:val="none" w:color="000000" w:sz="4" w:space="0"/>
         </w:tcBorders>
       </w:tcPr>
     </w:tblStylePr>
@@ -13016,12 +13056,12 @@
         <w:tblBorders/>
       </w:tblPr>
       <w:tcPr>
-        <w:shd w:color="ffffff"/>
+        <w:shd w:val="clear" w:color="ffffff"/>
         <w:tcBorders>
-          <w:top w:val="none"/>
+          <w:top w:val="none" w:color="000000" w:sz="4" w:space="0"/>
           <w:left w:val="single" w:color="000000" w:themeColor="accent1" w:themeTint="80" w:sz="4" w:space="0"/>
-          <w:bottom w:val="none"/>
-          <w:right w:val="none"/>
+          <w:bottom w:val="none" w:color="000000" w:sz="4" w:space="0"/>
+          <w:right w:val="none" w:color="000000" w:sz="4" w:space="0"/>
         </w:tcBorders>
       </w:tcPr>
     </w:tblStylePr>
@@ -13044,9 +13084,9 @@
         <w:shd w:val="clear" w:color="ffffff" w:themeColor="light1" w:fill="ffffff" w:themeFill="light1"/>
         <w:tcBorders>
           <w:top w:val="single" w:color="000000" w:themeColor="accent1" w:themeTint="80" w:sz="4" w:space="0"/>
-          <w:left w:val="none"/>
-          <w:bottom w:val="none"/>
-          <w:right w:val="none"/>
+          <w:left w:val="none" w:color="000000" w:sz="4" w:space="0"/>
+          <w:bottom w:val="none" w:color="000000" w:sz="4" w:space="0"/>
+          <w:right w:val="none" w:color="000000" w:sz="4" w:space="0"/>
         </w:tcBorders>
       </w:tcPr>
     </w:tblStylePr>
@@ -13116,9 +13156,9 @@
       </w:tcPr>
     </w:tblStylePr>
   </w:style>
-  <w:style w:type="table" w:styleId="63">
+  <w:style w:type="table" w:styleId="754">
     <w:name w:val="Grid Table 7 Colorful - Accent 2"/>
-    <w:basedOn w:val="707"/>
+    <w:basedOn w:val="876"/>
     <w:uiPriority w:val="99"/>
     <w:pPr>
       <w:pBdr/>
@@ -13220,11 +13260,11 @@
         <w:tblBorders/>
       </w:tblPr>
       <w:tcPr>
-        <w:shd w:color="ffffff"/>
+        <w:shd w:val="clear" w:color="ffffff"/>
         <w:tcBorders>
-          <w:top w:val="none"/>
-          <w:left w:val="none"/>
-          <w:bottom w:val="none"/>
+          <w:top w:val="none" w:color="000000" w:sz="4" w:space="0"/>
+          <w:left w:val="none" w:color="000000" w:sz="4" w:space="0"/>
+          <w:bottom w:val="none" w:color="000000" w:sz="4" w:space="0"/>
           <w:right w:val="single" w:color="000000" w:themeColor="accent2" w:themeTint="97" w:sz="4" w:space="0"/>
         </w:tcBorders>
       </w:tcPr>
@@ -13247,10 +13287,10 @@
       <w:tcPr>
         <w:shd w:val="clear" w:color="ffffff" w:themeColor="light1" w:fill="ffffff" w:themeFill="light1"/>
         <w:tcBorders>
-          <w:top w:val="none"/>
-          <w:left w:val="none"/>
+          <w:top w:val="none" w:color="000000" w:sz="4" w:space="0"/>
+          <w:left w:val="none" w:color="000000" w:sz="4" w:space="0"/>
           <w:bottom w:val="single" w:color="000000" w:themeColor="accent2" w:themeTint="97" w:sz="4" w:space="0"/>
-          <w:right w:val="none"/>
+          <w:right w:val="none" w:color="000000" w:sz="4" w:space="0"/>
         </w:tcBorders>
       </w:tcPr>
     </w:tblStylePr>
@@ -13270,12 +13310,12 @@
         <w:tblBorders/>
       </w:tblPr>
       <w:tcPr>
-        <w:shd w:color="ffffff"/>
+        <w:shd w:val="clear" w:color="ffffff"/>
         <w:tcBorders>
-          <w:top w:val="none"/>
+          <w:top w:val="none" w:color="000000" w:sz="4" w:space="0"/>
           <w:left w:val="single" w:color="000000" w:themeColor="accent2" w:themeTint="97" w:sz="4" w:space="0"/>
-          <w:bottom w:val="none"/>
-          <w:right w:val="none"/>
+          <w:bottom w:val="none" w:color="000000" w:sz="4" w:space="0"/>
+          <w:right w:val="none" w:color="000000" w:sz="4" w:space="0"/>
         </w:tcBorders>
       </w:tcPr>
     </w:tblStylePr>
@@ -13298,9 +13338,9 @@
         <w:shd w:val="clear" w:color="ffffff" w:themeColor="light1" w:fill="ffffff" w:themeFill="light1"/>
         <w:tcBorders>
           <w:top w:val="single" w:color="000000" w:themeColor="accent2" w:themeTint="97" w:sz="4" w:space="0"/>
-          <w:left w:val="none"/>
-          <w:bottom w:val="none"/>
-          <w:right w:val="none"/>
+          <w:left w:val="none" w:color="000000" w:sz="4" w:space="0"/>
+          <w:bottom w:val="none" w:color="000000" w:sz="4" w:space="0"/>
+          <w:right w:val="none" w:color="000000" w:sz="4" w:space="0"/>
         </w:tcBorders>
       </w:tcPr>
     </w:tblStylePr>
@@ -13370,9 +13410,9 @@
       </w:tcPr>
     </w:tblStylePr>
   </w:style>
-  <w:style w:type="table" w:styleId="64">
+  <w:style w:type="table" w:styleId="755">
     <w:name w:val="Grid Table 7 Colorful - Accent 3"/>
-    <w:basedOn w:val="707"/>
+    <w:basedOn w:val="876"/>
     <w:uiPriority w:val="99"/>
     <w:pPr>
       <w:pBdr/>
@@ -13474,11 +13514,11 @@
         <w:tblBorders/>
       </w:tblPr>
       <w:tcPr>
-        <w:shd w:color="ffffff"/>
+        <w:shd w:val="clear" w:color="ffffff"/>
         <w:tcBorders>
-          <w:top w:val="none"/>
-          <w:left w:val="none"/>
-          <w:bottom w:val="none"/>
+          <w:top w:val="none" w:color="000000" w:sz="4" w:space="0"/>
+          <w:left w:val="none" w:color="000000" w:sz="4" w:space="0"/>
+          <w:bottom w:val="none" w:color="000000" w:sz="4" w:space="0"/>
           <w:right w:val="single" w:color="000000" w:themeColor="accent3" w:themeTint="FE" w:sz="4" w:space="0"/>
         </w:tcBorders>
       </w:tcPr>
@@ -13501,10 +13541,10 @@
       <w:tcPr>
         <w:shd w:val="clear" w:color="ffffff" w:themeColor="light1" w:fill="ffffff" w:themeFill="light1"/>
         <w:tcBorders>
-          <w:top w:val="none"/>
-          <w:left w:val="none"/>
+          <w:top w:val="none" w:color="000000" w:sz="4" w:space="0"/>
+          <w:left w:val="none" w:color="000000" w:sz="4" w:space="0"/>
           <w:bottom w:val="single" w:color="000000" w:themeColor="accent3" w:themeTint="FE" w:sz="4" w:space="0"/>
-          <w:right w:val="none"/>
+          <w:right w:val="none" w:color="000000" w:sz="4" w:space="0"/>
         </w:tcBorders>
       </w:tcPr>
     </w:tblStylePr>
@@ -13524,12 +13564,12 @@
         <w:tblBorders/>
       </w:tblPr>
       <w:tcPr>
-        <w:shd w:color="ffffff"/>
+        <w:shd w:val="clear" w:color="ffffff"/>
         <w:tcBorders>
-          <w:top w:val="none"/>
+          <w:top w:val="none" w:color="000000" w:sz="4" w:space="0"/>
           <w:left w:val="single" w:color="000000" w:themeColor="accent3" w:themeTint="FE" w:sz="4" w:space="0"/>
-          <w:bottom w:val="none"/>
-          <w:right w:val="none"/>
+          <w:bottom w:val="none" w:color="000000" w:sz="4" w:space="0"/>
+          <w:right w:val="none" w:color="000000" w:sz="4" w:space="0"/>
         </w:tcBorders>
       </w:tcPr>
     </w:tblStylePr>
@@ -13552,9 +13592,9 @@
         <w:shd w:val="clear" w:color="ffffff" w:themeColor="light1" w:fill="ffffff" w:themeFill="light1"/>
         <w:tcBorders>
           <w:top w:val="single" w:color="000000" w:themeColor="accent3" w:themeTint="FE" w:sz="4" w:space="0"/>
-          <w:left w:val="none"/>
-          <w:bottom w:val="none"/>
-          <w:right w:val="none"/>
+          <w:left w:val="none" w:color="000000" w:sz="4" w:space="0"/>
+          <w:bottom w:val="none" w:color="000000" w:sz="4" w:space="0"/>
+          <w:right w:val="none" w:color="000000" w:sz="4" w:space="0"/>
         </w:tcBorders>
       </w:tcPr>
     </w:tblStylePr>
@@ -13624,9 +13664,9 @@
       </w:tcPr>
     </w:tblStylePr>
   </w:style>
-  <w:style w:type="table" w:styleId="65">
+  <w:style w:type="table" w:styleId="756">
     <w:name w:val="Grid Table 7 Colorful - Accent 4"/>
-    <w:basedOn w:val="707"/>
+    <w:basedOn w:val="876"/>
     <w:uiPriority w:val="99"/>
     <w:pPr>
       <w:pBdr/>
@@ -13728,11 +13768,11 @@
         <w:tblBorders/>
       </w:tblPr>
       <w:tcPr>
-        <w:shd w:color="ffffff"/>
+        <w:shd w:val="clear" w:color="ffffff"/>
         <w:tcBorders>
-          <w:top w:val="none"/>
-          <w:left w:val="none"/>
-          <w:bottom w:val="none"/>
+          <w:top w:val="none" w:color="000000" w:sz="4" w:space="0"/>
+          <w:left w:val="none" w:color="000000" w:sz="4" w:space="0"/>
+          <w:bottom w:val="none" w:color="000000" w:sz="4" w:space="0"/>
           <w:right w:val="single" w:color="000000" w:themeColor="accent4" w:themeTint="9A" w:sz="4" w:space="0"/>
         </w:tcBorders>
       </w:tcPr>
@@ -13755,10 +13795,10 @@
       <w:tcPr>
         <w:shd w:val="clear" w:color="ffffff" w:themeColor="light1" w:fill="ffffff" w:themeFill="light1"/>
         <w:tcBorders>
-          <w:top w:val="none"/>
-          <w:left w:val="none"/>
+          <w:top w:val="none" w:color="000000" w:sz="4" w:space="0"/>
+          <w:left w:val="none" w:color="000000" w:sz="4" w:space="0"/>
           <w:bottom w:val="single" w:color="000000" w:themeColor="accent4" w:themeTint="9A" w:sz="4" w:space="0"/>
-          <w:right w:val="none"/>
+          <w:right w:val="none" w:color="000000" w:sz="4" w:space="0"/>
         </w:tcBorders>
       </w:tcPr>
     </w:tblStylePr>
@@ -13778,12 +13818,12 @@
         <w:tblBorders/>
       </w:tblPr>
       <w:tcPr>
-        <w:shd w:color="ffffff"/>
+        <w:shd w:val="clear" w:color="ffffff"/>
         <w:tcBorders>
-          <w:top w:val="none"/>
+          <w:top w:val="none" w:color="000000" w:sz="4" w:space="0"/>
           <w:left w:val="single" w:color="000000" w:themeColor="accent4" w:themeTint="9A" w:sz="4" w:space="0"/>
-          <w:bottom w:val="none"/>
-          <w:right w:val="none"/>
+          <w:bottom w:val="none" w:color="000000" w:sz="4" w:space="0"/>
+          <w:right w:val="none" w:color="000000" w:sz="4" w:space="0"/>
         </w:tcBorders>
       </w:tcPr>
     </w:tblStylePr>
@@ -13806,9 +13846,9 @@
         <w:shd w:val="clear" w:color="ffffff" w:themeColor="light1" w:fill="ffffff" w:themeFill="light1"/>
         <w:tcBorders>
           <w:top w:val="single" w:color="000000" w:themeColor="accent4" w:themeTint="9A" w:sz="4" w:space="0"/>
-          <w:left w:val="none"/>
-          <w:bottom w:val="none"/>
-          <w:right w:val="none"/>
+          <w:left w:val="none" w:color="000000" w:sz="4" w:space="0"/>
+          <w:bottom w:val="none" w:color="000000" w:sz="4" w:space="0"/>
+          <w:right w:val="none" w:color="000000" w:sz="4" w:space="0"/>
         </w:tcBorders>
       </w:tcPr>
     </w:tblStylePr>
@@ -13878,9 +13918,9 @@
       </w:tcPr>
     </w:tblStylePr>
   </w:style>
-  <w:style w:type="table" w:styleId="66">
+  <w:style w:type="table" w:styleId="757">
     <w:name w:val="Grid Table 7 Colorful - Accent 5"/>
-    <w:basedOn w:val="707"/>
+    <w:basedOn w:val="876"/>
     <w:uiPriority w:val="99"/>
     <w:pPr>
       <w:pBdr/>
@@ -13982,11 +14022,11 @@
         <w:tblBorders/>
       </w:tblPr>
       <w:tcPr>
-        <w:shd w:color="ffffff"/>
+        <w:shd w:val="clear" w:color="ffffff"/>
         <w:tcBorders>
-          <w:top w:val="none"/>
-          <w:left w:val="none"/>
-          <w:bottom w:val="none"/>
+          <w:top w:val="none" w:color="000000" w:sz="4" w:space="0"/>
+          <w:left w:val="none" w:color="000000" w:sz="4" w:space="0"/>
+          <w:bottom w:val="none" w:color="000000" w:sz="4" w:space="0"/>
           <w:right w:val="single" w:color="000000" w:themeColor="accent5" w:themeTint="90" w:sz="4" w:space="0"/>
         </w:tcBorders>
       </w:tcPr>
@@ -14009,10 +14049,10 @@
       <w:tcPr>
         <w:shd w:val="clear" w:color="ffffff" w:themeColor="light1" w:fill="ffffff" w:themeFill="light1"/>
         <w:tcBorders>
-          <w:top w:val="none"/>
-          <w:left w:val="none"/>
+          <w:top w:val="none" w:color="000000" w:sz="4" w:space="0"/>
+          <w:left w:val="none" w:color="000000" w:sz="4" w:space="0"/>
           <w:bottom w:val="single" w:color="000000" w:themeColor="accent5" w:themeTint="90" w:sz="4" w:space="0"/>
-          <w:right w:val="none"/>
+          <w:right w:val="none" w:color="000000" w:sz="4" w:space="0"/>
         </w:tcBorders>
       </w:tcPr>
     </w:tblStylePr>
@@ -14032,12 +14072,12 @@
         <w:tblBorders/>
       </w:tblPr>
       <w:tcPr>
-        <w:shd w:color="ffffff"/>
+        <w:shd w:val="clear" w:color="ffffff"/>
         <w:tcBorders>
-          <w:top w:val="none"/>
+          <w:top w:val="none" w:color="000000" w:sz="4" w:space="0"/>
           <w:left w:val="single" w:color="000000" w:themeColor="accent5" w:themeTint="90" w:sz="4" w:space="0"/>
-          <w:bottom w:val="none"/>
-          <w:right w:val="none"/>
+          <w:bottom w:val="none" w:color="000000" w:sz="4" w:space="0"/>
+          <w:right w:val="none" w:color="000000" w:sz="4" w:space="0"/>
         </w:tcBorders>
       </w:tcPr>
     </w:tblStylePr>
@@ -14060,9 +14100,9 @@
         <w:shd w:val="clear" w:color="ffffff" w:themeColor="light1" w:fill="ffffff" w:themeFill="light1"/>
         <w:tcBorders>
           <w:top w:val="single" w:color="000000" w:themeColor="accent5" w:themeTint="90" w:sz="4" w:space="0"/>
-          <w:left w:val="none"/>
-          <w:bottom w:val="none"/>
-          <w:right w:val="none"/>
+          <w:left w:val="none" w:color="000000" w:sz="4" w:space="0"/>
+          <w:bottom w:val="none" w:color="000000" w:sz="4" w:space="0"/>
+          <w:right w:val="none" w:color="000000" w:sz="4" w:space="0"/>
         </w:tcBorders>
       </w:tcPr>
     </w:tblStylePr>
@@ -14132,9 +14172,9 @@
       </w:tcPr>
     </w:tblStylePr>
   </w:style>
-  <w:style w:type="table" w:styleId="67">
+  <w:style w:type="table" w:styleId="758">
     <w:name w:val="Grid Table 7 Colorful - Accent 6"/>
-    <w:basedOn w:val="707"/>
+    <w:basedOn w:val="876"/>
     <w:uiPriority w:val="99"/>
     <w:pPr>
       <w:pBdr/>
@@ -14236,11 +14276,11 @@
         <w:tblBorders/>
       </w:tblPr>
       <w:tcPr>
-        <w:shd w:color="ffffff"/>
+        <w:shd w:val="clear" w:color="ffffff"/>
         <w:tcBorders>
-          <w:top w:val="none"/>
-          <w:left w:val="none"/>
-          <w:bottom w:val="none"/>
+          <w:top w:val="none" w:color="000000" w:sz="4" w:space="0"/>
+          <w:left w:val="none" w:color="000000" w:sz="4" w:space="0"/>
+          <w:bottom w:val="none" w:color="000000" w:sz="4" w:space="0"/>
           <w:right w:val="single" w:color="000000" w:themeColor="accent6" w:themeTint="90" w:sz="4" w:space="0"/>
         </w:tcBorders>
       </w:tcPr>
@@ -14263,10 +14303,10 @@
       <w:tcPr>
         <w:shd w:val="clear" w:color="ffffff" w:themeColor="light1" w:fill="ffffff" w:themeFill="light1"/>
         <w:tcBorders>
-          <w:top w:val="none"/>
-          <w:left w:val="none"/>
+          <w:top w:val="none" w:color="000000" w:sz="4" w:space="0"/>
+          <w:left w:val="none" w:color="000000" w:sz="4" w:space="0"/>
           <w:bottom w:val="single" w:color="000000" w:themeColor="accent6" w:themeTint="90" w:sz="4" w:space="0"/>
-          <w:right w:val="none"/>
+          <w:right w:val="none" w:color="000000" w:sz="4" w:space="0"/>
         </w:tcBorders>
       </w:tcPr>
     </w:tblStylePr>
@@ -14286,12 +14326,12 @@
         <w:tblBorders/>
       </w:tblPr>
       <w:tcPr>
-        <w:shd w:color="ffffff"/>
+        <w:shd w:val="clear" w:color="ffffff"/>
         <w:tcBorders>
-          <w:top w:val="none"/>
+          <w:top w:val="none" w:color="000000" w:sz="4" w:space="0"/>
           <w:left w:val="single" w:color="000000" w:themeColor="accent6" w:themeTint="90" w:sz="4" w:space="0"/>
-          <w:bottom w:val="none"/>
-          <w:right w:val="none"/>
+          <w:bottom w:val="none" w:color="000000" w:sz="4" w:space="0"/>
+          <w:right w:val="none" w:color="000000" w:sz="4" w:space="0"/>
         </w:tcBorders>
       </w:tcPr>
     </w:tblStylePr>
@@ -14314,9 +14354,9 @@
         <w:shd w:val="clear" w:color="ffffff" w:themeColor="light1" w:fill="ffffff" w:themeFill="light1"/>
         <w:tcBorders>
           <w:top w:val="single" w:color="000000" w:themeColor="accent6" w:themeTint="90" w:sz="4" w:space="0"/>
-          <w:left w:val="none"/>
-          <w:bottom w:val="none"/>
-          <w:right w:val="none"/>
+          <w:left w:val="none" w:color="000000" w:sz="4" w:space="0"/>
+          <w:bottom w:val="none" w:color="000000" w:sz="4" w:space="0"/>
+          <w:right w:val="none" w:color="000000" w:sz="4" w:space="0"/>
         </w:tcBorders>
       </w:tcPr>
     </w:tblStylePr>
@@ -14386,9 +14426,9 @@
       </w:tcPr>
     </w:tblStylePr>
   </w:style>
-  <w:style w:type="table" w:styleId="68">
+  <w:style w:type="table" w:styleId="759">
     <w:name w:val="List Table 1 Light"/>
-    <w:basedOn w:val="707"/>
+    <w:basedOn w:val="876"/>
     <w:uiPriority w:val="99"/>
     <w:pPr>
       <w:pBdr/>
@@ -14602,9 +14642,9 @@
       </w:tcPr>
     </w:tblStylePr>
   </w:style>
-  <w:style w:type="table" w:styleId="69">
+  <w:style w:type="table" w:styleId="760">
     <w:name w:val="List Table 1 Light - Accent 1"/>
-    <w:basedOn w:val="707"/>
+    <w:basedOn w:val="876"/>
     <w:uiPriority w:val="99"/>
     <w:pPr>
       <w:pBdr/>
@@ -14818,9 +14858,9 @@
       </w:tcPr>
     </w:tblStylePr>
   </w:style>
-  <w:style w:type="table" w:styleId="70">
+  <w:style w:type="table" w:styleId="761">
     <w:name w:val="List Table 1 Light - Accent 2"/>
-    <w:basedOn w:val="707"/>
+    <w:basedOn w:val="876"/>
     <w:uiPriority w:val="99"/>
     <w:pPr>
       <w:pBdr/>
@@ -15034,9 +15074,9 @@
       </w:tcPr>
     </w:tblStylePr>
   </w:style>
-  <w:style w:type="table" w:styleId="71">
+  <w:style w:type="table" w:styleId="762">
     <w:name w:val="List Table 1 Light - Accent 3"/>
-    <w:basedOn w:val="707"/>
+    <w:basedOn w:val="876"/>
     <w:uiPriority w:val="99"/>
     <w:pPr>
       <w:pBdr/>
@@ -15250,9 +15290,9 @@
       </w:tcPr>
     </w:tblStylePr>
   </w:style>
-  <w:style w:type="table" w:styleId="72">
+  <w:style w:type="table" w:styleId="763">
     <w:name w:val="List Table 1 Light - Accent 4"/>
-    <w:basedOn w:val="707"/>
+    <w:basedOn w:val="876"/>
     <w:uiPriority w:val="99"/>
     <w:pPr>
       <w:pBdr/>
@@ -15466,9 +15506,9 @@
       </w:tcPr>
     </w:tblStylePr>
   </w:style>
-  <w:style w:type="table" w:styleId="73">
+  <w:style w:type="table" w:styleId="764">
     <w:name w:val="List Table 1 Light - Accent 5"/>
-    <w:basedOn w:val="707"/>
+    <w:basedOn w:val="876"/>
     <w:uiPriority w:val="99"/>
     <w:pPr>
       <w:pBdr/>
@@ -15682,9 +15722,9 @@
       </w:tcPr>
     </w:tblStylePr>
   </w:style>
-  <w:style w:type="table" w:styleId="74">
+  <w:style w:type="table" w:styleId="765">
     <w:name w:val="List Table 1 Light - Accent 6"/>
-    <w:basedOn w:val="707"/>
+    <w:basedOn w:val="876"/>
     <w:uiPriority w:val="99"/>
     <w:pPr>
       <w:pBdr/>
@@ -15898,9 +15938,9 @@
       </w:tcPr>
     </w:tblStylePr>
   </w:style>
-  <w:style w:type="table" w:styleId="75">
+  <w:style w:type="table" w:styleId="766">
     <w:name w:val="List Table 2"/>
-    <w:basedOn w:val="707"/>
+    <w:basedOn w:val="876"/>
     <w:uiPriority w:val="99"/>
     <w:pPr>
       <w:pBdr/>
@@ -16136,9 +16176,9 @@
       </w:tcPr>
     </w:tblStylePr>
   </w:style>
-  <w:style w:type="table" w:styleId="76">
+  <w:style w:type="table" w:styleId="767">
     <w:name w:val="List Table 2 - Accent 1"/>
-    <w:basedOn w:val="707"/>
+    <w:basedOn w:val="876"/>
     <w:uiPriority w:val="99"/>
     <w:pPr>
       <w:pBdr/>
@@ -16374,9 +16414,9 @@
       </w:tcPr>
     </w:tblStylePr>
   </w:style>
-  <w:style w:type="table" w:styleId="77">
+  <w:style w:type="table" w:styleId="768">
     <w:name w:val="List Table 2 - Accent 2"/>
-    <w:basedOn w:val="707"/>
+    <w:basedOn w:val="876"/>
     <w:uiPriority w:val="99"/>
     <w:pPr>
       <w:pBdr/>
@@ -16612,9 +16652,9 @@
       </w:tcPr>
     </w:tblStylePr>
   </w:style>
-  <w:style w:type="table" w:styleId="78">
+  <w:style w:type="table" w:styleId="769">
     <w:name w:val="List Table 2 - Accent 3"/>
-    <w:basedOn w:val="707"/>
+    <w:basedOn w:val="876"/>
     <w:uiPriority w:val="99"/>
     <w:pPr>
       <w:pBdr/>
@@ -16850,9 +16890,9 @@
       </w:tcPr>
     </w:tblStylePr>
   </w:style>
-  <w:style w:type="table" w:styleId="79">
+  <w:style w:type="table" w:styleId="770">
     <w:name w:val="List Table 2 - Accent 4"/>
-    <w:basedOn w:val="707"/>
+    <w:basedOn w:val="876"/>
     <w:uiPriority w:val="99"/>
     <w:pPr>
       <w:pBdr/>
@@ -17088,9 +17128,9 @@
       </w:tcPr>
     </w:tblStylePr>
   </w:style>
-  <w:style w:type="table" w:styleId="80">
+  <w:style w:type="table" w:styleId="771">
     <w:name w:val="List Table 2 - Accent 5"/>
-    <w:basedOn w:val="707"/>
+    <w:basedOn w:val="876"/>
     <w:uiPriority w:val="99"/>
     <w:pPr>
       <w:pBdr/>
@@ -17326,9 +17366,9 @@
       </w:tcPr>
     </w:tblStylePr>
   </w:style>
-  <w:style w:type="table" w:styleId="81">
+  <w:style w:type="table" w:styleId="772">
     <w:name w:val="List Table 2 - Accent 6"/>
-    <w:basedOn w:val="707"/>
+    <w:basedOn w:val="876"/>
     <w:uiPriority w:val="99"/>
     <w:pPr>
       <w:pBdr/>
@@ -17564,9 +17604,9 @@
       </w:tcPr>
     </w:tblStylePr>
   </w:style>
-  <w:style w:type="table" w:styleId="82">
+  <w:style w:type="table" w:styleId="773">
     <w:name w:val="List Table 3"/>
-    <w:basedOn w:val="707"/>
+    <w:basedOn w:val="876"/>
     <w:uiPriority w:val="99"/>
     <w:pPr>
       <w:pBdr/>
@@ -17792,9 +17832,9 @@
       </w:tcPr>
     </w:tblStylePr>
   </w:style>
-  <w:style w:type="table" w:styleId="83">
+  <w:style w:type="table" w:styleId="774">
     <w:name w:val="List Table 3 - Accent 1"/>
-    <w:basedOn w:val="707"/>
+    <w:basedOn w:val="876"/>
     <w:uiPriority w:val="99"/>
     <w:pPr>
       <w:pBdr/>
@@ -18020,9 +18060,9 @@
       </w:tcPr>
     </w:tblStylePr>
   </w:style>
-  <w:style w:type="table" w:styleId="84">
+  <w:style w:type="table" w:styleId="775">
     <w:name w:val="List Table 3 - Accent 2"/>
-    <w:basedOn w:val="707"/>
+    <w:basedOn w:val="876"/>
     <w:uiPriority w:val="99"/>
     <w:pPr>
       <w:pBdr/>
@@ -18248,9 +18288,9 @@
       </w:tcPr>
     </w:tblStylePr>
   </w:style>
-  <w:style w:type="table" w:styleId="85">
+  <w:style w:type="table" w:styleId="776">
     <w:name w:val="List Table 3 - Accent 3"/>
-    <w:basedOn w:val="707"/>
+    <w:basedOn w:val="876"/>
     <w:uiPriority w:val="99"/>
     <w:pPr>
       <w:pBdr/>
@@ -18476,9 +18516,9 @@
       </w:tcPr>
     </w:tblStylePr>
   </w:style>
-  <w:style w:type="table" w:styleId="86">
+  <w:style w:type="table" w:styleId="777">
     <w:name w:val="List Table 3 - Accent 4"/>
-    <w:basedOn w:val="707"/>
+    <w:basedOn w:val="876"/>
     <w:uiPriority w:val="99"/>
     <w:pPr>
       <w:pBdr/>
@@ -18704,9 +18744,9 @@
       </w:tcPr>
     </w:tblStylePr>
   </w:style>
-  <w:style w:type="table" w:styleId="87">
+  <w:style w:type="table" w:styleId="778">
     <w:name w:val="List Table 3 - Accent 5"/>
-    <w:basedOn w:val="707"/>
+    <w:basedOn w:val="876"/>
     <w:uiPriority w:val="99"/>
     <w:pPr>
       <w:pBdr/>
@@ -18932,9 +18972,9 @@
       </w:tcPr>
     </w:tblStylePr>
   </w:style>
-  <w:style w:type="table" w:styleId="88">
+  <w:style w:type="table" w:styleId="779">
     <w:name w:val="List Table 3 - Accent 6"/>
-    <w:basedOn w:val="707"/>
+    <w:basedOn w:val="876"/>
     <w:uiPriority w:val="99"/>
     <w:pPr>
       <w:pBdr/>
@@ -19160,9 +19200,9 @@
       </w:tcPr>
     </w:tblStylePr>
   </w:style>
-  <w:style w:type="table" w:styleId="89">
+  <w:style w:type="table" w:styleId="780">
     <w:name w:val="List Table 4"/>
-    <w:basedOn w:val="707"/>
+    <w:basedOn w:val="876"/>
     <w:uiPriority w:val="99"/>
     <w:pPr>
       <w:pBdr/>
@@ -19385,9 +19425,9 @@
       </w:tcPr>
     </w:tblStylePr>
   </w:style>
-  <w:style w:type="table" w:styleId="90">
+  <w:style w:type="table" w:styleId="781">
     <w:name w:val="List Table 4 - Accent 1"/>
-    <w:basedOn w:val="707"/>
+    <w:basedOn w:val="876"/>
     <w:uiPriority w:val="99"/>
     <w:pPr>
       <w:pBdr/>
@@ -19610,9 +19650,9 @@
       </w:tcPr>
     </w:tblStylePr>
   </w:style>
-  <w:style w:type="table" w:styleId="91">
+  <w:style w:type="table" w:styleId="782">
     <w:name w:val="List Table 4 - Accent 2"/>
-    <w:basedOn w:val="707"/>
+    <w:basedOn w:val="876"/>
     <w:uiPriority w:val="99"/>
     <w:pPr>
       <w:pBdr/>
@@ -19835,9 +19875,9 @@
       </w:tcPr>
     </w:tblStylePr>
   </w:style>
-  <w:style w:type="table" w:styleId="92">
+  <w:style w:type="table" w:styleId="783">
     <w:name w:val="List Table 4 - Accent 3"/>
-    <w:basedOn w:val="707"/>
+    <w:basedOn w:val="876"/>
     <w:uiPriority w:val="99"/>
     <w:pPr>
       <w:pBdr/>
@@ -20060,9 +20100,9 @@
       </w:tcPr>
     </w:tblStylePr>
   </w:style>
-  <w:style w:type="table" w:styleId="93">
+  <w:style w:type="table" w:styleId="784">
     <w:name w:val="List Table 4 - Accent 4"/>
-    <w:basedOn w:val="707"/>
+    <w:basedOn w:val="876"/>
     <w:uiPriority w:val="99"/>
     <w:pPr>
       <w:pBdr/>
@@ -20285,9 +20325,9 @@
       </w:tcPr>
     </w:tblStylePr>
   </w:style>
-  <w:style w:type="table" w:styleId="94">
+  <w:style w:type="table" w:styleId="785">
     <w:name w:val="List Table 4 - Accent 5"/>
-    <w:basedOn w:val="707"/>
+    <w:basedOn w:val="876"/>
     <w:uiPriority w:val="99"/>
     <w:pPr>
       <w:pBdr/>
@@ -20510,9 +20550,9 @@
       </w:tcPr>
     </w:tblStylePr>
   </w:style>
-  <w:style w:type="table" w:styleId="95">
+  <w:style w:type="table" w:styleId="786">
     <w:name w:val="List Table 4 - Accent 6"/>
-    <w:basedOn w:val="707"/>
+    <w:basedOn w:val="876"/>
     <w:uiPriority w:val="99"/>
     <w:pPr>
       <w:pBdr/>
@@ -20735,9 +20775,9 @@
       </w:tcPr>
     </w:tblStylePr>
   </w:style>
-  <w:style w:type="table" w:styleId="96">
+  <w:style w:type="table" w:styleId="787">
     <w:name w:val="List Table 5 Dark"/>
-    <w:basedOn w:val="707"/>
+    <w:basedOn w:val="876"/>
     <w:uiPriority w:val="99"/>
     <w:pPr>
       <w:pBdr/>
@@ -20977,9 +21017,9 @@
       </w:tcPr>
     </w:tblStylePr>
   </w:style>
-  <w:style w:type="table" w:styleId="97">
+  <w:style w:type="table" w:styleId="788">
     <w:name w:val="List Table 5 Dark - Accent 1"/>
-    <w:basedOn w:val="707"/>
+    <w:basedOn w:val="876"/>
     <w:uiPriority w:val="99"/>
     <w:pPr>
       <w:pBdr/>
@@ -21219,9 +21259,9 @@
       </w:tcPr>
     </w:tblStylePr>
   </w:style>
-  <w:style w:type="table" w:styleId="98">
+  <w:style w:type="table" w:styleId="789">
     <w:name w:val="List Table 5 Dark - Accent 2"/>
-    <w:basedOn w:val="707"/>
+    <w:basedOn w:val="876"/>
     <w:uiPriority w:val="99"/>
     <w:pPr>
       <w:pBdr/>
@@ -21461,9 +21501,9 @@
       </w:tcPr>
     </w:tblStylePr>
   </w:style>
-  <w:style w:type="table" w:styleId="99">
+  <w:style w:type="table" w:styleId="790">
     <w:name w:val="List Table 5 Dark - Accent 3"/>
-    <w:basedOn w:val="707"/>
+    <w:basedOn w:val="876"/>
     <w:uiPriority w:val="99"/>
     <w:pPr>
       <w:pBdr/>
@@ -21703,9 +21743,9 @@
       </w:tcPr>
     </w:tblStylePr>
   </w:style>
-  <w:style w:type="table" w:styleId="100">
+  <w:style w:type="table" w:styleId="791">
     <w:name w:val="List Table 5 Dark - Accent 4"/>
-    <w:basedOn w:val="707"/>
+    <w:basedOn w:val="876"/>
     <w:uiPriority w:val="99"/>
     <w:pPr>
       <w:pBdr/>
@@ -21945,9 +21985,9 @@
       </w:tcPr>
     </w:tblStylePr>
   </w:style>
-  <w:style w:type="table" w:styleId="101">
+  <w:style w:type="table" w:styleId="792">
     <w:name w:val="List Table 5 Dark - Accent 5"/>
-    <w:basedOn w:val="707"/>
+    <w:basedOn w:val="876"/>
     <w:uiPriority w:val="99"/>
     <w:pPr>
       <w:pBdr/>
@@ -22187,9 +22227,9 @@
       </w:tcPr>
     </w:tblStylePr>
   </w:style>
-  <w:style w:type="table" w:styleId="102">
+  <w:style w:type="table" w:styleId="793">
     <w:name w:val="List Table 5 Dark - Accent 6"/>
-    <w:basedOn w:val="707"/>
+    <w:basedOn w:val="876"/>
     <w:uiPriority w:val="99"/>
     <w:pPr>
       <w:pBdr/>
@@ -22429,9 +22469,9 @@
       </w:tcPr>
     </w:tblStylePr>
   </w:style>
-  <w:style w:type="table" w:styleId="103">
+  <w:style w:type="table" w:styleId="794">
     <w:name w:val="List Table 6 Colorful"/>
-    <w:basedOn w:val="707"/>
+    <w:basedOn w:val="876"/>
     <w:uiPriority w:val="99"/>
     <w:pPr>
       <w:pBdr/>
@@ -22652,9 +22692,9 @@
       </w:tcPr>
     </w:tblStylePr>
   </w:style>
-  <w:style w:type="table" w:styleId="104">
+  <w:style w:type="table" w:styleId="795">
     <w:name w:val="List Table 6 Colorful - Accent 1"/>
-    <w:basedOn w:val="707"/>
+    <w:basedOn w:val="876"/>
     <w:uiPriority w:val="99"/>
     <w:pPr>
       <w:pBdr/>
@@ -22875,9 +22915,9 @@
       </w:tcPr>
     </w:tblStylePr>
   </w:style>
-  <w:style w:type="table" w:styleId="105">
+  <w:style w:type="table" w:styleId="796">
     <w:name w:val="List Table 6 Colorful - Accent 2"/>
-    <w:basedOn w:val="707"/>
+    <w:basedOn w:val="876"/>
     <w:uiPriority w:val="99"/>
     <w:pPr>
       <w:pBdr/>
@@ -23098,9 +23138,9 @@
       </w:tcPr>
     </w:tblStylePr>
   </w:style>
-  <w:style w:type="table" w:styleId="106">
+  <w:style w:type="table" w:styleId="797">
     <w:name w:val="List Table 6 Colorful - Accent 3"/>
-    <w:basedOn w:val="707"/>
+    <w:basedOn w:val="876"/>
     <w:uiPriority w:val="99"/>
     <w:pPr>
       <w:pBdr/>
@@ -23321,9 +23361,9 @@
       </w:tcPr>
     </w:tblStylePr>
   </w:style>
-  <w:style w:type="table" w:styleId="107">
+  <w:style w:type="table" w:styleId="798">
     <w:name w:val="List Table 6 Colorful - Accent 4"/>
-    <w:basedOn w:val="707"/>
+    <w:basedOn w:val="876"/>
     <w:uiPriority w:val="99"/>
     <w:pPr>
       <w:pBdr/>
@@ -23544,9 +23584,9 @@
       </w:tcPr>
     </w:tblStylePr>
   </w:style>
-  <w:style w:type="table" w:styleId="108">
+  <w:style w:type="table" w:styleId="799">
     <w:name w:val="List Table 6 Colorful - Accent 5"/>
-    <w:basedOn w:val="707"/>
+    <w:basedOn w:val="876"/>
     <w:uiPriority w:val="99"/>
     <w:pPr>
       <w:pBdr/>
@@ -23767,9 +23807,9 @@
       </w:tcPr>
     </w:tblStylePr>
   </w:style>
-  <w:style w:type="table" w:styleId="109">
+  <w:style w:type="table" w:styleId="800">
     <w:name w:val="List Table 6 Colorful - Accent 6"/>
-    <w:basedOn w:val="707"/>
+    <w:basedOn w:val="876"/>
     <w:uiPriority w:val="99"/>
     <w:pPr>
       <w:pBdr/>
@@ -23990,9 +24030,9 @@
       </w:tcPr>
     </w:tblStylePr>
   </w:style>
-  <w:style w:type="table" w:styleId="110">
+  <w:style w:type="table" w:styleId="801">
     <w:name w:val="List Table 7 Colorful"/>
-    <w:basedOn w:val="707"/>
+    <w:basedOn w:val="876"/>
     <w:uiPriority w:val="99"/>
     <w:pPr>
       <w:pBdr/>
@@ -24091,11 +24131,11 @@
         <w:tblBorders/>
       </w:tblPr>
       <w:tcPr>
-        <w:shd w:color="ffffff"/>
+        <w:shd w:val="clear" w:color="ffffff"/>
         <w:tcBorders>
-          <w:top w:val="none"/>
-          <w:left w:val="none"/>
-          <w:bottom w:val="none"/>
+          <w:top w:val="none" w:color="000000" w:sz="4" w:space="0"/>
+          <w:left w:val="none" w:color="000000" w:sz="4" w:space="0"/>
+          <w:bottom w:val="none" w:color="000000" w:sz="4" w:space="0"/>
           <w:right w:val="single" w:color="000000" w:themeColor="text1" w:themeTint="80" w:sz="4" w:space="0"/>
         </w:tcBorders>
       </w:tcPr>
@@ -24118,10 +24158,10 @@
       <w:tcPr>
         <w:shd w:val="clear" w:color="ffffff" w:themeColor="light1" w:fill="ffffff" w:themeFill="light1"/>
         <w:tcBorders>
-          <w:top w:val="none"/>
-          <w:left w:val="none"/>
+          <w:top w:val="none" w:color="000000" w:sz="4" w:space="0"/>
+          <w:left w:val="none" w:color="000000" w:sz="4" w:space="0"/>
           <w:bottom w:val="single" w:color="000000" w:themeColor="text1" w:themeTint="80" w:sz="4" w:space="0"/>
-          <w:right w:val="none"/>
+          <w:right w:val="none" w:color="000000" w:sz="4" w:space="0"/>
         </w:tcBorders>
       </w:tcPr>
     </w:tblStylePr>
@@ -24141,12 +24181,12 @@
         <w:tblBorders/>
       </w:tblPr>
       <w:tcPr>
-        <w:shd w:color="ffffff"/>
+        <w:shd w:val="clear" w:color="ffffff"/>
         <w:tcBorders>
-          <w:top w:val="none"/>
+          <w:top w:val="none" w:color="000000" w:sz="4" w:space="0"/>
           <w:left w:val="single" w:color="000000" w:themeColor="text1" w:themeTint="80" w:sz="4" w:space="0"/>
-          <w:bottom w:val="none"/>
-          <w:right w:val="none"/>
+          <w:bottom w:val="none" w:color="000000" w:sz="4" w:space="0"/>
+          <w:right w:val="none" w:color="000000" w:sz="4" w:space="0"/>
         </w:tcBorders>
       </w:tcPr>
     </w:tblStylePr>
@@ -24169,9 +24209,9 @@
         <w:shd w:val="clear" w:color="ffffff" w:themeColor="light1" w:fill="ffffff" w:themeFill="light1"/>
         <w:tcBorders>
           <w:top w:val="single" w:color="000000" w:themeColor="text1" w:themeTint="80" w:sz="4" w:space="0"/>
-          <w:left w:val="none"/>
-          <w:bottom w:val="none"/>
-          <w:right w:val="none"/>
+          <w:left w:val="none" w:color="000000" w:sz="4" w:space="0"/>
+          <w:bottom w:val="none" w:color="000000" w:sz="4" w:space="0"/>
+          <w:right w:val="none" w:color="000000" w:sz="4" w:space="0"/>
         </w:tcBorders>
       </w:tcPr>
     </w:tblStylePr>
@@ -24246,9 +24286,9 @@
       </w:tcPr>
     </w:tblStylePr>
   </w:style>
-  <w:style w:type="table" w:styleId="111">
+  <w:style w:type="table" w:styleId="802">
     <w:name w:val="List Table 7 Colorful - Accent 1"/>
-    <w:basedOn w:val="707"/>
+    <w:basedOn w:val="876"/>
     <w:uiPriority w:val="99"/>
     <w:pPr>
       <w:pBdr/>
@@ -24347,11 +24387,11 @@
         <w:tblBorders/>
       </w:tblPr>
       <w:tcPr>
-        <w:shd w:color="ffffff"/>
+        <w:shd w:val="clear" w:color="ffffff"/>
         <w:tcBorders>
-          <w:top w:val="none"/>
-          <w:left w:val="none"/>
-          <w:bottom w:val="none"/>
+          <w:top w:val="none" w:color="000000" w:sz="4" w:space="0"/>
+          <w:left w:val="none" w:color="000000" w:sz="4" w:space="0"/>
+          <w:bottom w:val="none" w:color="000000" w:sz="4" w:space="0"/>
           <w:right w:val="single" w:color="000000" w:themeColor="accent1" w:sz="4" w:space="0"/>
         </w:tcBorders>
       </w:tcPr>
@@ -24374,10 +24414,10 @@
       <w:tcPr>
         <w:shd w:val="clear" w:color="ffffff" w:themeColor="light1" w:fill="ffffff" w:themeFill="light1"/>
         <w:tcBorders>
-          <w:top w:val="none"/>
-          <w:left w:val="none"/>
+          <w:top w:val="none" w:color="000000" w:sz="4" w:space="0"/>
+          <w:left w:val="none" w:color="000000" w:sz="4" w:space="0"/>
           <w:bottom w:val="single" w:color="000000" w:themeColor="accent1" w:sz="4" w:space="0"/>
-          <w:right w:val="none"/>
+          <w:right w:val="none" w:color="000000" w:sz="4" w:space="0"/>
         </w:tcBorders>
       </w:tcPr>
     </w:tblStylePr>
@@ -24397,12 +24437,12 @@
         <w:tblBorders/>
       </w:tblPr>
       <w:tcPr>
-        <w:shd w:color="ffffff"/>
+        <w:shd w:val="clear" w:color="ffffff"/>
         <w:tcBorders>
-          <w:top w:val="none"/>
+          <w:top w:val="none" w:color="000000" w:sz="4" w:space="0"/>
           <w:left w:val="single" w:color="000000" w:themeColor="accent1" w:sz="4" w:space="0"/>
-          <w:bottom w:val="none"/>
-          <w:right w:val="none"/>
+          <w:bottom w:val="none" w:color="000000" w:sz="4" w:space="0"/>
+          <w:right w:val="none" w:color="000000" w:sz="4" w:space="0"/>
         </w:tcBorders>
       </w:tcPr>
     </w:tblStylePr>
@@ -24425,9 +24465,9 @@
         <w:shd w:val="clear" w:color="ffffff" w:themeColor="light1" w:fill="ffffff" w:themeFill="light1"/>
         <w:tcBorders>
           <w:top w:val="single" w:color="000000" w:themeColor="accent1" w:sz="4" w:space="0"/>
-          <w:left w:val="none"/>
-          <w:bottom w:val="none"/>
-          <w:right w:val="none"/>
+          <w:left w:val="none" w:color="000000" w:sz="4" w:space="0"/>
+          <w:bottom w:val="none" w:color="000000" w:sz="4" w:space="0"/>
+          <w:right w:val="none" w:color="000000" w:sz="4" w:space="0"/>
         </w:tcBorders>
       </w:tcPr>
     </w:tblStylePr>
@@ -24502,9 +24542,9 @@
       </w:tcPr>
     </w:tblStylePr>
   </w:style>
-  <w:style w:type="table" w:styleId="112">
+  <w:style w:type="table" w:styleId="803">
     <w:name w:val="List Table 7 Colorful - Accent 2"/>
-    <w:basedOn w:val="707"/>
+    <w:basedOn w:val="876"/>
     <w:uiPriority w:val="99"/>
     <w:pPr>
       <w:pBdr/>
@@ -24603,11 +24643,11 @@
         <w:tblBorders/>
       </w:tblPr>
       <w:tcPr>
-        <w:shd w:color="ffffff"/>
+        <w:shd w:val="clear" w:color="ffffff"/>
         <w:tcBorders>
-          <w:top w:val="none"/>
-          <w:left w:val="none"/>
-          <w:bottom w:val="none"/>
+          <w:top w:val="none" w:color="000000" w:sz="4" w:space="0"/>
+          <w:left w:val="none" w:color="000000" w:sz="4" w:space="0"/>
+          <w:bottom w:val="none" w:color="000000" w:sz="4" w:space="0"/>
           <w:right w:val="single" w:color="000000" w:themeColor="accent2" w:themeTint="97" w:sz="4" w:space="0"/>
         </w:tcBorders>
       </w:tcPr>
@@ -24630,10 +24670,10 @@
       <w:tcPr>
         <w:shd w:val="clear" w:color="ffffff" w:themeColor="light1" w:fill="ffffff" w:themeFill="light1"/>
         <w:tcBorders>
-          <w:top w:val="none"/>
-          <w:left w:val="none"/>
+          <w:top w:val="none" w:color="000000" w:sz="4" w:space="0"/>
+          <w:left w:val="none" w:color="000000" w:sz="4" w:space="0"/>
           <w:bottom w:val="single" w:color="000000" w:themeColor="accent2" w:themeTint="97" w:sz="4" w:space="0"/>
-          <w:right w:val="none"/>
+          <w:right w:val="none" w:color="000000" w:sz="4" w:space="0"/>
         </w:tcBorders>
       </w:tcPr>
     </w:tblStylePr>
@@ -24653,12 +24693,12 @@
         <w:tblBorders/>
       </w:tblPr>
       <w:tcPr>
-        <w:shd w:color="ffffff"/>
+        <w:shd w:val="clear" w:color="ffffff"/>
         <w:tcBorders>
-          <w:top w:val="none"/>
+          <w:top w:val="none" w:color="000000" w:sz="4" w:space="0"/>
           <w:left w:val="single" w:color="000000" w:themeColor="accent2" w:themeTint="97" w:sz="4" w:space="0"/>
-          <w:bottom w:val="none"/>
-          <w:right w:val="none"/>
+          <w:bottom w:val="none" w:color="000000" w:sz="4" w:space="0"/>
+          <w:right w:val="none" w:color="000000" w:sz="4" w:space="0"/>
         </w:tcBorders>
       </w:tcPr>
     </w:tblStylePr>
@@ -24681,9 +24721,9 @@
         <w:shd w:val="clear" w:color="ffffff" w:themeColor="light1" w:fill="ffffff" w:themeFill="light1"/>
         <w:tcBorders>
           <w:top w:val="single" w:color="000000" w:themeColor="accent2" w:themeTint="97" w:sz="4" w:space="0"/>
-          <w:left w:val="none"/>
-          <w:bottom w:val="none"/>
-          <w:right w:val="none"/>
+          <w:left w:val="none" w:color="000000" w:sz="4" w:space="0"/>
+          <w:bottom w:val="none" w:color="000000" w:sz="4" w:space="0"/>
+          <w:right w:val="none" w:color="000000" w:sz="4" w:space="0"/>
         </w:tcBorders>
       </w:tcPr>
     </w:tblStylePr>
@@ -24758,9 +24798,9 @@
       </w:tcPr>
     </w:tblStylePr>
   </w:style>
-  <w:style w:type="table" w:styleId="113">
+  <w:style w:type="table" w:styleId="804">
     <w:name w:val="List Table 7 Colorful - Accent 3"/>
-    <w:basedOn w:val="707"/>
+    <w:basedOn w:val="876"/>
     <w:uiPriority w:val="99"/>
     <w:pPr>
       <w:pBdr/>
@@ -24859,11 +24899,11 @@
         <w:tblBorders/>
       </w:tblPr>
       <w:tcPr>
-        <w:shd w:color="ffffff"/>
+        <w:shd w:val="clear" w:color="ffffff"/>
         <w:tcBorders>
-          <w:top w:val="none"/>
-          <w:left w:val="none"/>
-          <w:bottom w:val="none"/>
+          <w:top w:val="none" w:color="000000" w:sz="4" w:space="0"/>
+          <w:left w:val="none" w:color="000000" w:sz="4" w:space="0"/>
+          <w:bottom w:val="none" w:color="000000" w:sz="4" w:space="0"/>
           <w:right w:val="single" w:color="000000" w:themeColor="accent3" w:themeTint="98" w:sz="4" w:space="0"/>
         </w:tcBorders>
       </w:tcPr>
@@ -24886,10 +24926,10 @@
       <w:tcPr>
         <w:shd w:val="clear" w:color="ffffff" w:themeColor="light1" w:fill="ffffff" w:themeFill="light1"/>
         <w:tcBorders>
-          <w:top w:val="none"/>
-          <w:left w:val="none"/>
+          <w:top w:val="none" w:color="000000" w:sz="4" w:space="0"/>
+          <w:left w:val="none" w:color="000000" w:sz="4" w:space="0"/>
           <w:bottom w:val="single" w:color="000000" w:themeColor="accent3" w:themeTint="98" w:sz="4" w:space="0"/>
-          <w:right w:val="none"/>
+          <w:right w:val="none" w:color="000000" w:sz="4" w:space="0"/>
         </w:tcBorders>
       </w:tcPr>
     </w:tblStylePr>
@@ -24909,12 +24949,12 @@
         <w:tblBorders/>
       </w:tblPr>
       <w:tcPr>
-        <w:shd w:color="ffffff"/>
+        <w:shd w:val="clear" w:color="ffffff"/>
         <w:tcBorders>
-          <w:top w:val="none"/>
+          <w:top w:val="none" w:color="000000" w:sz="4" w:space="0"/>
           <w:left w:val="single" w:color="000000" w:themeColor="accent3" w:themeTint="98" w:sz="4" w:space="0"/>
-          <w:bottom w:val="none"/>
-          <w:right w:val="none"/>
+          <w:bottom w:val="none" w:color="000000" w:sz="4" w:space="0"/>
+          <w:right w:val="none" w:color="000000" w:sz="4" w:space="0"/>
         </w:tcBorders>
       </w:tcPr>
     </w:tblStylePr>
@@ -24937,9 +24977,9 @@
         <w:shd w:val="clear" w:color="ffffff" w:themeColor="light1" w:fill="ffffff" w:themeFill="light1"/>
         <w:tcBorders>
           <w:top w:val="single" w:color="000000" w:themeColor="accent3" w:themeTint="98" w:sz="4" w:space="0"/>
-          <w:left w:val="none"/>
-          <w:bottom w:val="none"/>
-          <w:right w:val="none"/>
+          <w:left w:val="none" w:color="000000" w:sz="4" w:space="0"/>
+          <w:bottom w:val="none" w:color="000000" w:sz="4" w:space="0"/>
+          <w:right w:val="none" w:color="000000" w:sz="4" w:space="0"/>
         </w:tcBorders>
       </w:tcPr>
     </w:tblStylePr>
@@ -25014,9 +25054,9 @@
       </w:tcPr>
     </w:tblStylePr>
   </w:style>
-  <w:style w:type="table" w:styleId="114">
+  <w:style w:type="table" w:styleId="805">
     <w:name w:val="List Table 7 Colorful - Accent 4"/>
-    <w:basedOn w:val="707"/>
+    <w:basedOn w:val="876"/>
     <w:uiPriority w:val="99"/>
     <w:pPr>
       <w:pBdr/>
@@ -25115,11 +25155,11 @@
         <w:tblBorders/>
       </w:tblPr>
       <w:tcPr>
-        <w:shd w:color="ffffff"/>
+        <w:shd w:val="clear" w:color="ffffff"/>
         <w:tcBorders>
-          <w:top w:val="none"/>
-          <w:left w:val="none"/>
-          <w:bottom w:val="none"/>
+          <w:top w:val="none" w:color="000000" w:sz="4" w:space="0"/>
+          <w:left w:val="none" w:color="000000" w:sz="4" w:space="0"/>
+          <w:bottom w:val="none" w:color="000000" w:sz="4" w:space="0"/>
           <w:right w:val="single" w:color="000000" w:themeColor="accent4" w:themeTint="9A" w:sz="4" w:space="0"/>
         </w:tcBorders>
       </w:tcPr>
@@ -25142,10 +25182,10 @@
       <w:tcPr>
         <w:shd w:val="clear" w:color="ffffff" w:themeColor="light1" w:fill="ffffff" w:themeFill="light1"/>
         <w:tcBorders>
-          <w:top w:val="none"/>
-          <w:left w:val="none"/>
+          <w:top w:val="none" w:color="000000" w:sz="4" w:space="0"/>
+          <w:left w:val="none" w:color="000000" w:sz="4" w:space="0"/>
           <w:bottom w:val="single" w:color="000000" w:themeColor="accent4" w:themeTint="9A" w:sz="4" w:space="0"/>
-          <w:right w:val="none"/>
+          <w:right w:val="none" w:color="000000" w:sz="4" w:space="0"/>
         </w:tcBorders>
       </w:tcPr>
     </w:tblStylePr>
@@ -25165,12 +25205,12 @@
         <w:tblBorders/>
       </w:tblPr>
       <w:tcPr>
-        <w:shd w:color="ffffff"/>
+        <w:shd w:val="clear" w:color="ffffff"/>
         <w:tcBorders>
-          <w:top w:val="none"/>
+          <w:top w:val="none" w:color="000000" w:sz="4" w:space="0"/>
           <w:left w:val="single" w:color="000000" w:themeColor="accent4" w:themeTint="9A" w:sz="4" w:space="0"/>
-          <w:bottom w:val="none"/>
-          <w:right w:val="none"/>
+          <w:bottom w:val="none" w:color="000000" w:sz="4" w:space="0"/>
+          <w:right w:val="none" w:color="000000" w:sz="4" w:space="0"/>
         </w:tcBorders>
       </w:tcPr>
     </w:tblStylePr>
@@ -25193,9 +25233,9 @@
         <w:shd w:val="clear" w:color="ffffff" w:themeColor="light1" w:fill="ffffff" w:themeFill="light1"/>
         <w:tcBorders>
           <w:top w:val="single" w:color="000000" w:themeColor="accent4" w:themeTint="9A" w:sz="4" w:space="0"/>
-          <w:left w:val="none"/>
-          <w:bottom w:val="none"/>
-          <w:right w:val="none"/>
+          <w:left w:val="none" w:color="000000" w:sz="4" w:space="0"/>
+          <w:bottom w:val="none" w:color="000000" w:sz="4" w:space="0"/>
+          <w:right w:val="none" w:color="000000" w:sz="4" w:space="0"/>
         </w:tcBorders>
       </w:tcPr>
     </w:tblStylePr>
@@ -25270,9 +25310,9 @@
       </w:tcPr>
     </w:tblStylePr>
   </w:style>
-  <w:style w:type="table" w:styleId="115">
+  <w:style w:type="table" w:styleId="806">
     <w:name w:val="List Table 7 Colorful - Accent 5"/>
-    <w:basedOn w:val="707"/>
+    <w:basedOn w:val="876"/>
     <w:uiPriority w:val="99"/>
     <w:pPr>
       <w:pBdr/>
@@ -25371,11 +25411,11 @@
         <w:tblBorders/>
       </w:tblPr>
       <w:tcPr>
-        <w:shd w:color="ffffff"/>
+        <w:shd w:val="clear" w:color="ffffff"/>
         <w:tcBorders>
-          <w:top w:val="none"/>
-          <w:left w:val="none"/>
-          <w:bottom w:val="none"/>
+          <w:top w:val="none" w:color="000000" w:sz="4" w:space="0"/>
+          <w:left w:val="none" w:color="000000" w:sz="4" w:space="0"/>
+          <w:bottom w:val="none" w:color="000000" w:sz="4" w:space="0"/>
           <w:right w:val="single" w:color="000000" w:themeColor="accent5" w:themeTint="9A" w:sz="4" w:space="0"/>
         </w:tcBorders>
       </w:tcPr>
@@ -25398,10 +25438,10 @@
       <w:tcPr>
         <w:shd w:val="clear" w:color="ffffff" w:themeColor="light1" w:fill="ffffff" w:themeFill="light1"/>
         <w:tcBorders>
-          <w:top w:val="none"/>
-          <w:left w:val="none"/>
+          <w:top w:val="none" w:color="000000" w:sz="4" w:space="0"/>
+          <w:left w:val="none" w:color="000000" w:sz="4" w:space="0"/>
           <w:bottom w:val="single" w:color="000000" w:themeColor="accent5" w:themeTint="9A" w:sz="4" w:space="0"/>
-          <w:right w:val="none"/>
+          <w:right w:val="none" w:color="000000" w:sz="4" w:space="0"/>
         </w:tcBorders>
       </w:tcPr>
     </w:tblStylePr>
@@ -25421,12 +25461,12 @@
         <w:tblBorders/>
       </w:tblPr>
       <w:tcPr>
-        <w:shd w:color="ffffff"/>
+        <w:shd w:val="clear" w:color="ffffff"/>
         <w:tcBorders>
-          <w:top w:val="none"/>
+          <w:top w:val="none" w:color="000000" w:sz="4" w:space="0"/>
           <w:left w:val="single" w:color="000000" w:themeColor="accent5" w:themeTint="9A" w:sz="4" w:space="0"/>
-          <w:bottom w:val="none"/>
-          <w:right w:val="none"/>
+          <w:bottom w:val="none" w:color="000000" w:sz="4" w:space="0"/>
+          <w:right w:val="none" w:color="000000" w:sz="4" w:space="0"/>
         </w:tcBorders>
       </w:tcPr>
     </w:tblStylePr>
@@ -25449,9 +25489,9 @@
         <w:shd w:val="clear" w:color="ffffff" w:themeColor="light1" w:fill="ffffff" w:themeFill="light1"/>
         <w:tcBorders>
           <w:top w:val="single" w:color="000000" w:themeColor="accent5" w:themeTint="9A" w:sz="4" w:space="0"/>
-          <w:left w:val="none"/>
-          <w:bottom w:val="none"/>
-          <w:right w:val="none"/>
+          <w:left w:val="none" w:color="000000" w:sz="4" w:space="0"/>
+          <w:bottom w:val="none" w:color="000000" w:sz="4" w:space="0"/>
+          <w:right w:val="none" w:color="000000" w:sz="4" w:space="0"/>
         </w:tcBorders>
       </w:tcPr>
     </w:tblStylePr>
@@ -25526,9 +25566,9 @@
       </w:tcPr>
     </w:tblStylePr>
   </w:style>
-  <w:style w:type="table" w:styleId="116">
+  <w:style w:type="table" w:styleId="807">
     <w:name w:val="List Table 7 Colorful - Accent 6"/>
-    <w:basedOn w:val="707"/>
+    <w:basedOn w:val="876"/>
     <w:uiPriority w:val="99"/>
     <w:pPr>
       <w:pBdr/>
@@ -25627,11 +25667,11 @@
         <w:tblBorders/>
       </w:tblPr>
       <w:tcPr>
-        <w:shd w:color="ffffff"/>
+        <w:shd w:val="clear" w:color="ffffff"/>
         <w:tcBorders>
-          <w:top w:val="none"/>
-          <w:left w:val="none"/>
-          <w:bottom w:val="none"/>
+          <w:top w:val="none" w:color="000000" w:sz="4" w:space="0"/>
+          <w:left w:val="none" w:color="000000" w:sz="4" w:space="0"/>
+          <w:bottom w:val="none" w:color="000000" w:sz="4" w:space="0"/>
           <w:right w:val="single" w:color="000000" w:themeColor="accent6" w:themeTint="98" w:sz="4" w:space="0"/>
         </w:tcBorders>
       </w:tcPr>
@@ -25654,10 +25694,10 @@
       <w:tcPr>
         <w:shd w:val="clear" w:color="ffffff" w:themeColor="light1" w:fill="ffffff" w:themeFill="light1"/>
         <w:tcBorders>
-          <w:top w:val="none"/>
-          <w:left w:val="none"/>
+          <w:top w:val="none" w:color="000000" w:sz="4" w:space="0"/>
+          <w:left w:val="none" w:color="000000" w:sz="4" w:space="0"/>
           <w:bottom w:val="single" w:color="000000" w:themeColor="accent6" w:themeTint="98" w:sz="4" w:space="0"/>
-          <w:right w:val="none"/>
+          <w:right w:val="none" w:color="000000" w:sz="4" w:space="0"/>
         </w:tcBorders>
       </w:tcPr>
     </w:tblStylePr>
@@ -25677,12 +25717,12 @@
         <w:tblBorders/>
       </w:tblPr>
       <w:tcPr>
-        <w:shd w:color="ffffff"/>
+        <w:shd w:val="clear" w:color="ffffff"/>
         <w:tcBorders>
-          <w:top w:val="none"/>
+          <w:top w:val="none" w:color="000000" w:sz="4" w:space="0"/>
           <w:left w:val="single" w:color="000000" w:themeColor="accent6" w:themeTint="98" w:sz="4" w:space="0"/>
-          <w:bottom w:val="none"/>
-          <w:right w:val="none"/>
+          <w:bottom w:val="none" w:color="000000" w:sz="4" w:space="0"/>
+          <w:right w:val="none" w:color="000000" w:sz="4" w:space="0"/>
         </w:tcBorders>
       </w:tcPr>
     </w:tblStylePr>
@@ -25705,9 +25745,9 @@
         <w:shd w:val="clear" w:color="ffffff" w:themeColor="light1" w:fill="ffffff" w:themeFill="light1"/>
         <w:tcBorders>
           <w:top w:val="single" w:color="000000" w:themeColor="accent6" w:themeTint="98" w:sz="4" w:space="0"/>
-          <w:left w:val="none"/>
-          <w:bottom w:val="none"/>
-          <w:right w:val="none"/>
+          <w:left w:val="none" w:color="000000" w:sz="4" w:space="0"/>
+          <w:bottom w:val="none" w:color="000000" w:sz="4" w:space="0"/>
+          <w:right w:val="none" w:color="000000" w:sz="4" w:space="0"/>
         </w:tcBorders>
       </w:tcPr>
     </w:tblStylePr>
@@ -25782,9 +25822,9 @@
       </w:tcPr>
     </w:tblStylePr>
   </w:style>
-  <w:style w:type="table" w:styleId="117">
+  <w:style w:type="table" w:styleId="808">
     <w:name w:val="Lined - Accent"/>
-    <w:basedOn w:val="707"/>
+    <w:basedOn w:val="876"/>
     <w:uiPriority w:val="99"/>
     <w:pPr>
       <w:pBdr/>
@@ -26019,9 +26059,9 @@
       </w:tcPr>
     </w:tblStylePr>
   </w:style>
-  <w:style w:type="table" w:styleId="118">
+  <w:style w:type="table" w:styleId="809">
     <w:name w:val="Lined - Accent 1"/>
-    <w:basedOn w:val="707"/>
+    <w:basedOn w:val="876"/>
     <w:uiPriority w:val="99"/>
     <w:pPr>
       <w:pBdr/>
@@ -26256,9 +26296,9 @@
       </w:tcPr>
     </w:tblStylePr>
   </w:style>
-  <w:style w:type="table" w:styleId="119">
+  <w:style w:type="table" w:styleId="810">
     <w:name w:val="Lined - Accent 2"/>
-    <w:basedOn w:val="707"/>
+    <w:basedOn w:val="876"/>
     <w:uiPriority w:val="99"/>
     <w:pPr>
       <w:pBdr/>
@@ -26493,9 +26533,9 @@
       </w:tcPr>
     </w:tblStylePr>
   </w:style>
-  <w:style w:type="table" w:styleId="120">
+  <w:style w:type="table" w:styleId="811">
     <w:name w:val="Lined - Accent 3"/>
-    <w:basedOn w:val="707"/>
+    <w:basedOn w:val="876"/>
     <w:uiPriority w:val="99"/>
     <w:pPr>
       <w:pBdr/>
@@ -26730,9 +26770,9 @@
       </w:tcPr>
     </w:tblStylePr>
   </w:style>
-  <w:style w:type="table" w:styleId="121">
+  <w:style w:type="table" w:styleId="812">
     <w:name w:val="Lined - Accent 4"/>
-    <w:basedOn w:val="707"/>
+    <w:basedOn w:val="876"/>
     <w:uiPriority w:val="99"/>
     <w:pPr>
       <w:pBdr/>
@@ -26967,9 +27007,9 @@
       </w:tcPr>
     </w:tblStylePr>
   </w:style>
-  <w:style w:type="table" w:styleId="122">
+  <w:style w:type="table" w:styleId="813">
     <w:name w:val="Lined - Accent 5"/>
-    <w:basedOn w:val="707"/>
+    <w:basedOn w:val="876"/>
     <w:uiPriority w:val="99"/>
     <w:pPr>
       <w:pBdr/>
@@ -27204,9 +27244,9 @@
       </w:tcPr>
     </w:tblStylePr>
   </w:style>
-  <w:style w:type="table" w:styleId="123">
+  <w:style w:type="table" w:styleId="814">
     <w:name w:val="Lined - Accent 6"/>
-    <w:basedOn w:val="707"/>
+    <w:basedOn w:val="876"/>
     <w:uiPriority w:val="99"/>
     <w:pPr>
       <w:pBdr/>
@@ -27441,9 +27481,9 @@
       </w:tcPr>
     </w:tblStylePr>
   </w:style>
-  <w:style w:type="table" w:styleId="124">
+  <w:style w:type="table" w:styleId="815">
     <w:name w:val="Bordered &amp; Lined - Accent"/>
-    <w:basedOn w:val="707"/>
+    <w:basedOn w:val="876"/>
     <w:uiPriority w:val="99"/>
     <w:pPr>
       <w:pBdr/>
@@ -27685,9 +27725,9 @@
       </w:tcPr>
     </w:tblStylePr>
   </w:style>
-  <w:style w:type="table" w:styleId="125">
+  <w:style w:type="table" w:styleId="816">
     <w:name w:val="Bordered &amp; Lined - Accent 1"/>
-    <w:basedOn w:val="707"/>
+    <w:basedOn w:val="876"/>
     <w:uiPriority w:val="99"/>
     <w:pPr>
       <w:pBdr/>
@@ -27929,9 +27969,9 @@
       </w:tcPr>
     </w:tblStylePr>
   </w:style>
-  <w:style w:type="table" w:styleId="126">
+  <w:style w:type="table" w:styleId="817">
     <w:name w:val="Bordered &amp; Lined - Accent 2"/>
-    <w:basedOn w:val="707"/>
+    <w:basedOn w:val="876"/>
     <w:uiPriority w:val="99"/>
     <w:pPr>
       <w:pBdr/>
@@ -28173,9 +28213,9 @@
       </w:tcPr>
     </w:tblStylePr>
   </w:style>
-  <w:style w:type="table" w:styleId="127">
+  <w:style w:type="table" w:styleId="818">
     <w:name w:val="Bordered &amp; Lined - Accent 3"/>
-    <w:basedOn w:val="707"/>
+    <w:basedOn w:val="876"/>
     <w:uiPriority w:val="99"/>
     <w:pPr>
       <w:pBdr/>
@@ -28417,9 +28457,9 @@
       </w:tcPr>
     </w:tblStylePr>
   </w:style>
-  <w:style w:type="table" w:styleId="128">
+  <w:style w:type="table" w:styleId="819">
     <w:name w:val="Bordered &amp; Lined - Accent 4"/>
-    <w:basedOn w:val="707"/>
+    <w:basedOn w:val="876"/>
     <w:uiPriority w:val="99"/>
     <w:pPr>
       <w:pBdr/>
@@ -28661,9 +28701,9 @@
       </w:tcPr>
     </w:tblStylePr>
   </w:style>
-  <w:style w:type="table" w:styleId="129">
+  <w:style w:type="table" w:styleId="820">
     <w:name w:val="Bordered &amp; Lined - Accent 5"/>
-    <w:basedOn w:val="707"/>
+    <w:basedOn w:val="876"/>
     <w:uiPriority w:val="99"/>
     <w:pPr>
       <w:pBdr/>
@@ -28905,9 +28945,9 @@
       </w:tcPr>
     </w:tblStylePr>
   </w:style>
-  <w:style w:type="table" w:styleId="130">
+  <w:style w:type="table" w:styleId="821">
     <w:name w:val="Bordered &amp; Lined - Accent 6"/>
-    <w:basedOn w:val="707"/>
+    <w:basedOn w:val="876"/>
     <w:uiPriority w:val="99"/>
     <w:pPr>
       <w:pBdr/>
@@ -29149,9 +29189,9 @@
       </w:tcPr>
     </w:tblStylePr>
   </w:style>
-  <w:style w:type="table" w:styleId="131">
+  <w:style w:type="table" w:styleId="822">
     <w:name w:val="Bordered"/>
-    <w:basedOn w:val="707"/>
+    <w:basedOn w:val="876"/>
     <w:uiPriority w:val="99"/>
     <w:pPr>
       <w:pBdr/>
@@ -29380,9 +29420,9 @@
       </w:tcPr>
     </w:tblStylePr>
   </w:style>
-  <w:style w:type="table" w:styleId="132">
+  <w:style w:type="table" w:styleId="823">
     <w:name w:val="Bordered - Accent 1"/>
-    <w:basedOn w:val="707"/>
+    <w:basedOn w:val="876"/>
     <w:uiPriority w:val="99"/>
     <w:pPr>
       <w:pBdr/>
@@ -29611,9 +29651,9 @@
       </w:tcPr>
     </w:tblStylePr>
   </w:style>
-  <w:style w:type="table" w:styleId="133">
+  <w:style w:type="table" w:styleId="824">
     <w:name w:val="Bordered - Accent 2"/>
-    <w:basedOn w:val="707"/>
+    <w:basedOn w:val="876"/>
     <w:uiPriority w:val="99"/>
     <w:pPr>
       <w:pBdr/>
@@ -29842,9 +29882,9 @@
       </w:tcPr>
     </w:tblStylePr>
   </w:style>
-  <w:style w:type="table" w:styleId="134">
+  <w:style w:type="table" w:styleId="825">
     <w:name w:val="Bordered - Accent 3"/>
-    <w:basedOn w:val="707"/>
+    <w:basedOn w:val="876"/>
     <w:uiPriority w:val="99"/>
     <w:pPr>
       <w:pBdr/>
@@ -30073,9 +30113,9 @@
       </w:tcPr>
     </w:tblStylePr>
   </w:style>
-  <w:style w:type="table" w:styleId="135">
+  <w:style w:type="table" w:styleId="826">
     <w:name w:val="Bordered - Accent 4"/>
-    <w:basedOn w:val="707"/>
+    <w:basedOn w:val="876"/>
     <w:uiPriority w:val="99"/>
     <w:pPr>
       <w:pBdr/>
@@ -30304,9 +30344,9 @@
       </w:tcPr>
     </w:tblStylePr>
   </w:style>
-  <w:style w:type="table" w:styleId="136">
+  <w:style w:type="table" w:styleId="827">
     <w:name w:val="Bordered - Accent 5"/>
-    <w:basedOn w:val="707"/>
+    <w:basedOn w:val="876"/>
     <w:uiPriority w:val="99"/>
     <w:pPr>
       <w:pBdr/>
@@ -30535,9 +30575,9 @@
       </w:tcPr>
     </w:tblStylePr>
   </w:style>
-  <w:style w:type="table" w:styleId="137">
+  <w:style w:type="table" w:styleId="828">
     <w:name w:val="Bordered - Accent 6"/>
-    <w:basedOn w:val="707"/>
+    <w:basedOn w:val="876"/>
     <w:uiPriority w:val="99"/>
     <w:pPr>
       <w:pBdr/>
@@ -30766,11 +30806,11 @@
       </w:tcPr>
     </w:tblStylePr>
   </w:style>
-  <w:style w:type="paragraph" w:styleId="145">
+  <w:style w:type="paragraph" w:styleId="829">
     <w:name w:val="Heading 7"/>
-    <w:basedOn w:val="706"/>
-    <w:next w:val="706"/>
-    <w:link w:val="156"/>
+    <w:basedOn w:val="875"/>
+    <w:next w:val="875"/>
+    <w:link w:val="840"/>
     <w:uiPriority w:val="9"/>
     <w:unhideWhenUsed/>
     <w:qFormat/>
@@ -30787,11 +30827,11 @@
       <w:color w:val="595959" w:themeColor="text1" w:themeTint="A6"/>
     </w:rPr>
   </w:style>
-  <w:style w:type="paragraph" w:styleId="146">
+  <w:style w:type="paragraph" w:styleId="830">
     <w:name w:val="Heading 8"/>
-    <w:basedOn w:val="706"/>
-    <w:next w:val="706"/>
-    <w:link w:val="157"/>
+    <w:basedOn w:val="875"/>
+    <w:next w:val="875"/>
+    <w:link w:val="841"/>
     <w:uiPriority w:val="9"/>
     <w:unhideWhenUsed/>
     <w:qFormat/>
@@ -30810,11 +30850,11 @@
       <w:color w:val="272727" w:themeColor="text1" w:themeTint="D8"/>
     </w:rPr>
   </w:style>
-  <w:style w:type="paragraph" w:styleId="147">
+  <w:style w:type="paragraph" w:styleId="831">
     <w:name w:val="Heading 9"/>
-    <w:basedOn w:val="706"/>
-    <w:next w:val="706"/>
-    <w:link w:val="158"/>
+    <w:basedOn w:val="875"/>
+    <w:next w:val="875"/>
+    <w:link w:val="842"/>
     <w:uiPriority w:val="9"/>
     <w:unhideWhenUsed/>
     <w:qFormat/>
@@ -30833,7 +30873,7 @@
       <w:color w:val="272727" w:themeColor="text1" w:themeTint="D8"/>
     </w:rPr>
   </w:style>
-  <w:style w:type="character" w:styleId="148" w:default="1">
+  <w:style w:type="character" w:styleId="832" w:default="1">
     <w:name w:val="Default Paragraph Font"/>
     <w:uiPriority w:val="1"/>
     <w:semiHidden/>
@@ -30844,7 +30884,7 @@
       <w:ind/>
     </w:pPr>
   </w:style>
-  <w:style w:type="numbering" w:styleId="149" w:default="1">
+  <w:style w:type="numbering" w:styleId="833" w:default="1">
     <w:name w:val="No List"/>
     <w:uiPriority w:val="99"/>
     <w:semiHidden/>
@@ -30855,10 +30895,10 @@
       <w:ind/>
     </w:pPr>
   </w:style>
-  <w:style w:type="character" w:styleId="150">
+  <w:style w:type="character" w:styleId="834">
     <w:name w:val="Heading 1 Char"/>
-    <w:basedOn w:val="148"/>
-    <w:link w:val="709"/>
+    <w:basedOn w:val="832"/>
+    <w:link w:val="878"/>
     <w:uiPriority w:val="9"/>
     <w:pPr>
       <w:pBdr/>
@@ -30872,10 +30912,10 @@
       <w:szCs w:val="40"/>
     </w:rPr>
   </w:style>
-  <w:style w:type="character" w:styleId="151">
+  <w:style w:type="character" w:styleId="835">
     <w:name w:val="Heading 2 Char"/>
-    <w:basedOn w:val="148"/>
-    <w:link w:val="710"/>
+    <w:basedOn w:val="832"/>
+    <w:link w:val="879"/>
     <w:uiPriority w:val="9"/>
     <w:pPr>
       <w:pBdr/>
@@ -30889,10 +30929,10 @@
       <w:szCs w:val="32"/>
     </w:rPr>
   </w:style>
-  <w:style w:type="character" w:styleId="152">
+  <w:style w:type="character" w:styleId="836">
     <w:name w:val="Heading 3 Char"/>
-    <w:basedOn w:val="148"/>
-    <w:link w:val="711"/>
+    <w:basedOn w:val="832"/>
+    <w:link w:val="880"/>
     <w:uiPriority w:val="9"/>
     <w:pPr>
       <w:pBdr/>
@@ -30906,10 +30946,10 @@
       <w:szCs w:val="28"/>
     </w:rPr>
   </w:style>
-  <w:style w:type="character" w:styleId="153">
+  <w:style w:type="character" w:styleId="837">
     <w:name w:val="Heading 4 Char"/>
-    <w:basedOn w:val="148"/>
-    <w:link w:val="712"/>
+    <w:basedOn w:val="832"/>
+    <w:link w:val="881"/>
     <w:uiPriority w:val="9"/>
     <w:pPr>
       <w:pBdr/>
@@ -30923,10 +30963,10 @@
       <w:color w:val="0f4761" w:themeColor="accent1" w:themeShade="BF"/>
     </w:rPr>
   </w:style>
-  <w:style w:type="character" w:styleId="154">
+  <w:style w:type="character" w:styleId="838">
     <w:name w:val="Heading 5 Char"/>
-    <w:basedOn w:val="148"/>
-    <w:link w:val="713"/>
+    <w:basedOn w:val="832"/>
+    <w:link w:val="882"/>
     <w:uiPriority w:val="9"/>
     <w:pPr>
       <w:pBdr/>
@@ -30938,10 +30978,10 @@
       <w:color w:val="0f4761" w:themeColor="accent1" w:themeShade="BF"/>
     </w:rPr>
   </w:style>
-  <w:style w:type="character" w:styleId="155">
+  <w:style w:type="character" w:styleId="839">
     <w:name w:val="Heading 6 Char"/>
-    <w:basedOn w:val="148"/>
-    <w:link w:val="714"/>
+    <w:basedOn w:val="832"/>
+    <w:link w:val="883"/>
     <w:uiPriority w:val="9"/>
     <w:pPr>
       <w:pBdr/>
@@ -30955,10 +30995,10 @@
       <w:color w:val="595959" w:themeColor="text1" w:themeTint="A6"/>
     </w:rPr>
   </w:style>
-  <w:style w:type="character" w:styleId="156">
+  <w:style w:type="character" w:styleId="840">
     <w:name w:val="Heading 7 Char"/>
-    <w:basedOn w:val="148"/>
-    <w:link w:val="145"/>
+    <w:basedOn w:val="832"/>
+    <w:link w:val="829"/>
     <w:uiPriority w:val="9"/>
     <w:pPr>
       <w:pBdr/>
@@ -30970,10 +31010,10 @@
       <w:color w:val="595959" w:themeColor="text1" w:themeTint="A6"/>
     </w:rPr>
   </w:style>
-  <w:style w:type="character" w:styleId="157">
+  <w:style w:type="character" w:styleId="841">
     <w:name w:val="Heading 8 Char"/>
-    <w:basedOn w:val="148"/>
-    <w:link w:val="146"/>
+    <w:basedOn w:val="832"/>
+    <w:link w:val="830"/>
     <w:uiPriority w:val="9"/>
     <w:pPr>
       <w:pBdr/>
@@ -30987,10 +31027,10 @@
       <w:color w:val="272727" w:themeColor="text1" w:themeTint="D8"/>
     </w:rPr>
   </w:style>
-  <w:style w:type="character" w:styleId="158">
+  <w:style w:type="character" w:styleId="842">
     <w:name w:val="Heading 9 Char"/>
-    <w:basedOn w:val="148"/>
-    <w:link w:val="147"/>
+    <w:basedOn w:val="832"/>
+    <w:link w:val="831"/>
     <w:uiPriority w:val="9"/>
     <w:pPr>
       <w:pBdr/>
@@ -31004,10 +31044,10 @@
       <w:color w:val="272727" w:themeColor="text1" w:themeTint="D8"/>
     </w:rPr>
   </w:style>
-  <w:style w:type="character" w:styleId="160">
+  <w:style w:type="character" w:styleId="843">
     <w:name w:val="Title Char"/>
-    <w:basedOn w:val="148"/>
-    <w:link w:val="708"/>
+    <w:basedOn w:val="832"/>
+    <w:link w:val="877"/>
     <w:uiPriority w:val="10"/>
     <w:pPr>
       <w:pBdr/>
@@ -31021,11 +31061,11 @@
       <w:szCs w:val="56"/>
     </w:rPr>
   </w:style>
-  <w:style w:type="paragraph" w:styleId="161">
+  <w:style w:type="paragraph" w:styleId="844">
     <w:name w:val="Subtitle"/>
-    <w:basedOn w:val="706"/>
-    <w:next w:val="706"/>
-    <w:link w:val="162"/>
+    <w:basedOn w:val="875"/>
+    <w:next w:val="875"/>
+    <w:link w:val="845"/>
     <w:uiPriority w:val="11"/>
     <w:qFormat/>
     <w:pPr>
@@ -31043,10 +31083,10 @@
       <w:szCs w:val="28"/>
     </w:rPr>
   </w:style>
-  <w:style w:type="character" w:styleId="162">
+  <w:style w:type="character" w:styleId="845">
     <w:name w:val="Subtitle Char"/>
-    <w:basedOn w:val="148"/>
-    <w:link w:val="161"/>
+    <w:basedOn w:val="832"/>
+    <w:link w:val="844"/>
     <w:uiPriority w:val="11"/>
     <w:pPr>
       <w:pBdr/>
@@ -31060,11 +31100,11 @@
       <w:szCs w:val="28"/>
     </w:rPr>
   </w:style>
-  <w:style w:type="paragraph" w:styleId="163">
+  <w:style w:type="paragraph" w:styleId="846">
     <w:name w:val="Quote"/>
-    <w:basedOn w:val="706"/>
-    <w:next w:val="706"/>
-    <w:link w:val="164"/>
+    <w:basedOn w:val="875"/>
+    <w:next w:val="875"/>
+    <w:link w:val="847"/>
     <w:uiPriority w:val="29"/>
     <w:qFormat/>
     <w:pPr>
@@ -31079,10 +31119,10 @@
       <w:color w:val="404040" w:themeColor="text1" w:themeTint="BF"/>
     </w:rPr>
   </w:style>
-  <w:style w:type="character" w:styleId="164">
+  <w:style w:type="character" w:styleId="847">
     <w:name w:val="Quote Char"/>
-    <w:basedOn w:val="148"/>
-    <w:link w:val="163"/>
+    <w:basedOn w:val="832"/>
+    <w:link w:val="846"/>
     <w:uiPriority w:val="29"/>
     <w:pPr>
       <w:pBdr/>
@@ -31095,9 +31135,9 @@
       <w:color w:val="404040" w:themeColor="text1" w:themeTint="BF"/>
     </w:rPr>
   </w:style>
-  <w:style w:type="character" w:styleId="166">
+  <w:style w:type="character" w:styleId="848">
     <w:name w:val="Intense Emphasis"/>
-    <w:basedOn w:val="148"/>
+    <w:basedOn w:val="832"/>
     <w:uiPriority w:val="21"/>
     <w:qFormat/>
     <w:pPr>
@@ -31111,11 +31151,11 @@
       <w:color w:val="0f4761" w:themeColor="accent1" w:themeShade="BF"/>
     </w:rPr>
   </w:style>
-  <w:style w:type="paragraph" w:styleId="167">
+  <w:style w:type="paragraph" w:styleId="849">
     <w:name w:val="Intense Quote"/>
-    <w:basedOn w:val="706"/>
-    <w:next w:val="706"/>
-    <w:link w:val="168"/>
+    <w:basedOn w:val="875"/>
+    <w:next w:val="875"/>
+    <w:link w:val="850"/>
     <w:uiPriority w:val="30"/>
     <w:qFormat/>
     <w:pPr>
@@ -31133,10 +31173,10 @@
       <w:color w:val="0f4761" w:themeColor="accent1" w:themeShade="BF"/>
     </w:rPr>
   </w:style>
-  <w:style w:type="character" w:styleId="168">
+  <w:style w:type="character" w:styleId="850">
     <w:name w:val="Intense Quote Char"/>
-    <w:basedOn w:val="148"/>
-    <w:link w:val="167"/>
+    <w:basedOn w:val="832"/>
+    <w:link w:val="849"/>
     <w:uiPriority w:val="30"/>
     <w:pPr>
       <w:pBdr/>
@@ -31149,9 +31189,9 @@
       <w:color w:val="0f4761" w:themeColor="accent1" w:themeShade="BF"/>
     </w:rPr>
   </w:style>
-  <w:style w:type="character" w:styleId="169">
+  <w:style w:type="character" w:styleId="851">
     <w:name w:val="Intense Reference"/>
-    <w:basedOn w:val="148"/>
+    <w:basedOn w:val="832"/>
     <w:uiPriority w:val="32"/>
     <w:qFormat/>
     <w:pPr>
@@ -31167,9 +31207,9 @@
       <w:spacing w:val="5"/>
     </w:rPr>
   </w:style>
-  <w:style w:type="paragraph" w:styleId="170">
+  <w:style w:type="paragraph" w:styleId="852">
     <w:name w:val="No Spacing"/>
-    <w:basedOn w:val="706"/>
+    <w:basedOn w:val="875"/>
     <w:uiPriority w:val="1"/>
     <w:qFormat/>
     <w:pPr>
@@ -31178,9 +31218,9 @@
       <w:ind/>
     </w:pPr>
   </w:style>
-  <w:style w:type="character" w:styleId="171">
+  <w:style w:type="character" w:styleId="853">
     <w:name w:val="Subtle Emphasis"/>
-    <w:basedOn w:val="148"/>
+    <w:basedOn w:val="832"/>
     <w:uiPriority w:val="19"/>
     <w:qFormat/>
     <w:pPr>
@@ -31194,9 +31234,9 @@
       <w:color w:val="404040" w:themeColor="text1" w:themeTint="BF"/>
     </w:rPr>
   </w:style>
-  <w:style w:type="character" w:styleId="172">
+  <w:style w:type="character" w:styleId="854">
     <w:name w:val="Emphasis"/>
-    <w:basedOn w:val="148"/>
+    <w:basedOn w:val="832"/>
     <w:uiPriority w:val="20"/>
     <w:qFormat/>
     <w:pPr>
@@ -31209,9 +31249,9 @@
       <w:iCs/>
     </w:rPr>
   </w:style>
-  <w:style w:type="character" w:styleId="174">
+  <w:style w:type="character" w:styleId="855">
     <w:name w:val="Subtle Reference"/>
-    <w:basedOn w:val="148"/>
+    <w:basedOn w:val="832"/>
     <w:uiPriority w:val="31"/>
     <w:qFormat/>
     <w:pPr>
@@ -31224,9 +31264,9 @@
       <w:color w:val="5a5a5a" w:themeColor="text1" w:themeTint="A5"/>
     </w:rPr>
   </w:style>
-  <w:style w:type="character" w:styleId="175">
+  <w:style w:type="character" w:styleId="856">
     <w:name w:val="Book Title"/>
-    <w:basedOn w:val="148"/>
+    <w:basedOn w:val="832"/>
     <w:uiPriority w:val="33"/>
     <w:qFormat/>
     <w:pPr>
@@ -31242,10 +31282,10 @@
       <w:spacing w:val="5"/>
     </w:rPr>
   </w:style>
-  <w:style w:type="paragraph" w:styleId="176">
+  <w:style w:type="paragraph" w:styleId="857">
     <w:name w:val="Header"/>
-    <w:basedOn w:val="706"/>
-    <w:link w:val="177"/>
+    <w:basedOn w:val="875"/>
+    <w:link w:val="858"/>
     <w:uiPriority w:val="99"/>
     <w:unhideWhenUsed/>
     <w:pPr>
@@ -31258,10 +31298,10 @@
       <w:ind/>
     </w:pPr>
   </w:style>
-  <w:style w:type="character" w:styleId="177">
+  <w:style w:type="character" w:styleId="858">
     <w:name w:val="Header Char"/>
-    <w:basedOn w:val="148"/>
-    <w:link w:val="176"/>
+    <w:basedOn w:val="832"/>
+    <w:link w:val="857"/>
     <w:uiPriority w:val="99"/>
     <w:pPr>
       <w:pBdr/>
@@ -31269,10 +31309,10 @@
       <w:ind/>
     </w:pPr>
   </w:style>
-  <w:style w:type="paragraph" w:styleId="178">
+  <w:style w:type="paragraph" w:styleId="859">
     <w:name w:val="Footer"/>
-    <w:basedOn w:val="706"/>
-    <w:link w:val="179"/>
+    <w:basedOn w:val="875"/>
+    <w:link w:val="860"/>
     <w:uiPriority w:val="99"/>
     <w:unhideWhenUsed/>
     <w:pPr>
@@ -31285,10 +31325,10 @@
       <w:ind/>
     </w:pPr>
   </w:style>
-  <w:style w:type="character" w:styleId="179">
+  <w:style w:type="character" w:styleId="860">
     <w:name w:val="Footer Char"/>
-    <w:basedOn w:val="148"/>
-    <w:link w:val="178"/>
+    <w:basedOn w:val="832"/>
+    <w:link w:val="859"/>
     <w:uiPriority w:val="99"/>
     <w:pPr>
       <w:pBdr/>
@@ -31296,10 +31336,10 @@
       <w:ind/>
     </w:pPr>
   </w:style>
-  <w:style w:type="paragraph" w:styleId="180">
+  <w:style w:type="paragraph" w:styleId="861">
     <w:name w:val="Caption"/>
-    <w:basedOn w:val="706"/>
-    <w:next w:val="706"/>
+    <w:basedOn w:val="875"/>
+    <w:next w:val="875"/>
     <w:uiPriority w:val="35"/>
     <w:unhideWhenUsed/>
     <w:qFormat/>
@@ -31316,9 +31356,9 @@
       <w:szCs w:val="18"/>
     </w:rPr>
   </w:style>
-  <w:style w:type="character" w:styleId="188">
+  <w:style w:type="character" w:styleId="862">
     <w:name w:val="FollowedHyperlink"/>
-    <w:basedOn w:val="148"/>
+    <w:basedOn w:val="832"/>
     <w:uiPriority w:val="99"/>
     <w:semiHidden/>
     <w:unhideWhenUsed/>
@@ -31332,10 +31372,10 @@
       <w:u w:val="single"/>
     </w:rPr>
   </w:style>
-  <w:style w:type="paragraph" w:styleId="189">
+  <w:style w:type="paragraph" w:styleId="863">
     <w:name w:val="toc 1"/>
-    <w:basedOn w:val="706"/>
-    <w:next w:val="706"/>
+    <w:basedOn w:val="875"/>
+    <w:next w:val="875"/>
     <w:uiPriority w:val="39"/>
     <w:unhideWhenUsed/>
     <w:pPr>
@@ -31344,10 +31384,10 @@
       <w:ind/>
     </w:pPr>
   </w:style>
-  <w:style w:type="paragraph" w:styleId="190">
+  <w:style w:type="paragraph" w:styleId="864">
     <w:name w:val="toc 2"/>
-    <w:basedOn w:val="706"/>
-    <w:next w:val="706"/>
+    <w:basedOn w:val="875"/>
+    <w:next w:val="875"/>
     <w:uiPriority w:val="39"/>
     <w:unhideWhenUsed/>
     <w:pPr>
@@ -31356,10 +31396,10 @@
       <w:ind w:left="220"/>
     </w:pPr>
   </w:style>
-  <w:style w:type="paragraph" w:styleId="191">
+  <w:style w:type="paragraph" w:styleId="865">
     <w:name w:val="toc 3"/>
-    <w:basedOn w:val="706"/>
-    <w:next w:val="706"/>
+    <w:basedOn w:val="875"/>
+    <w:next w:val="875"/>
     <w:uiPriority w:val="39"/>
     <w:unhideWhenUsed/>
     <w:pPr>
@@ -31368,10 +31408,10 @@
       <w:ind w:left="440"/>
     </w:pPr>
   </w:style>
-  <w:style w:type="paragraph" w:styleId="192">
+  <w:style w:type="paragraph" w:styleId="866">
     <w:name w:val="toc 4"/>
-    <w:basedOn w:val="706"/>
-    <w:next w:val="706"/>
+    <w:basedOn w:val="875"/>
+    <w:next w:val="875"/>
     <w:uiPriority w:val="39"/>
     <w:unhideWhenUsed/>
     <w:pPr>
@@ -31380,10 +31420,10 @@
       <w:ind w:left="660"/>
     </w:pPr>
   </w:style>
-  <w:style w:type="paragraph" w:styleId="193">
+  <w:style w:type="paragraph" w:styleId="867">
     <w:name w:val="toc 5"/>
-    <w:basedOn w:val="706"/>
-    <w:next w:val="706"/>
+    <w:basedOn w:val="875"/>
+    <w:next w:val="875"/>
     <w:uiPriority w:val="39"/>
     <w:unhideWhenUsed/>
     <w:pPr>
@@ -31392,10 +31432,10 @@
       <w:ind w:left="880"/>
     </w:pPr>
   </w:style>
-  <w:style w:type="paragraph" w:styleId="194">
+  <w:style w:type="paragraph" w:styleId="868">
     <w:name w:val="toc 6"/>
-    <w:basedOn w:val="706"/>
-    <w:next w:val="706"/>
+    <w:basedOn w:val="875"/>
+    <w:next w:val="875"/>
     <w:uiPriority w:val="39"/>
     <w:unhideWhenUsed/>
     <w:pPr>
@@ -31404,10 +31444,10 @@
       <w:ind w:left="1100"/>
     </w:pPr>
   </w:style>
-  <w:style w:type="paragraph" w:styleId="195">
+  <w:style w:type="paragraph" w:styleId="869">
     <w:name w:val="toc 7"/>
-    <w:basedOn w:val="706"/>
-    <w:next w:val="706"/>
+    <w:basedOn w:val="875"/>
+    <w:next w:val="875"/>
     <w:uiPriority w:val="39"/>
     <w:unhideWhenUsed/>
     <w:pPr>
@@ -31416,10 +31456,10 @@
       <w:ind w:left="1320"/>
     </w:pPr>
   </w:style>
-  <w:style w:type="paragraph" w:styleId="196">
+  <w:style w:type="paragraph" w:styleId="870">
     <w:name w:val="toc 8"/>
-    <w:basedOn w:val="706"/>
-    <w:next w:val="706"/>
+    <w:basedOn w:val="875"/>
+    <w:next w:val="875"/>
     <w:uiPriority w:val="39"/>
     <w:unhideWhenUsed/>
     <w:pPr>
@@ -31428,10 +31468,10 @@
       <w:ind w:left="1540"/>
     </w:pPr>
   </w:style>
-  <w:style w:type="paragraph" w:styleId="197">
+  <w:style w:type="paragraph" w:styleId="871">
     <w:name w:val="toc 9"/>
-    <w:basedOn w:val="706"/>
-    <w:next w:val="706"/>
+    <w:basedOn w:val="875"/>
+    <w:next w:val="875"/>
     <w:uiPriority w:val="39"/>
     <w:unhideWhenUsed/>
     <w:pPr>
@@ -31440,9 +31480,9 @@
       <w:ind w:left="1760"/>
     </w:pPr>
   </w:style>
-  <w:style w:type="character" w:styleId="198">
+  <w:style w:type="character" w:styleId="872">
     <w:name w:val="Placeholder Text"/>
-    <w:basedOn w:val="148"/>
+    <w:basedOn w:val="832"/>
     <w:uiPriority w:val="99"/>
     <w:semiHidden/>
     <w:pPr>
@@ -31454,7 +31494,7 @@
       <w:color w:val="666666"/>
     </w:rPr>
   </w:style>
-  <w:style w:type="paragraph" w:styleId="208">
+  <w:style w:type="paragraph" w:styleId="873">
     <w:name w:val="TOC Heading"/>
     <w:uiPriority w:val="39"/>
     <w:unhideWhenUsed/>
@@ -31464,10 +31504,10 @@
       <w:ind/>
     </w:pPr>
   </w:style>
-  <w:style w:type="paragraph" w:styleId="209">
+  <w:style w:type="paragraph" w:styleId="874">
     <w:name w:val="table of figures"/>
-    <w:basedOn w:val="706"/>
-    <w:next w:val="706"/>
+    <w:basedOn w:val="875"/>
+    <w:next w:val="875"/>
     <w:uiPriority w:val="99"/>
     <w:unhideWhenUsed/>
     <w:pPr>
@@ -31476,7 +31516,7 @@
       <w:ind/>
     </w:pPr>
   </w:style>
-  <w:style w:type="paragraph" w:styleId="706" w:default="1">
+  <w:style w:type="paragraph" w:styleId="875" w:default="1">
     <w:name w:val="Normal"/>
     <w:qFormat/>
     <w:pPr>
@@ -31485,7 +31525,7 @@
       <w:ind/>
     </w:pPr>
   </w:style>
-  <w:style w:type="table" w:styleId="707" w:default="1">
+  <w:style w:type="table" w:styleId="876" w:default="1">
     <w:name w:val="Normal Table"/>
     <w:uiPriority w:val="99"/>
     <w:semiHidden/>
@@ -31678,10 +31718,10 @@
       </w:tcPr>
     </w:tblStylePr>
   </w:style>
-  <w:style w:type="paragraph" w:styleId="708">
+  <w:style w:type="paragraph" w:styleId="877">
     <w:name w:val="Title"/>
-    <w:basedOn w:val="706"/>
-    <w:next w:val="706"/>
+    <w:basedOn w:val="875"/>
+    <w:next w:val="875"/>
     <w:qFormat/>
     <w:pPr>
       <w:pBdr/>
@@ -31693,10 +31733,10 @@
       <w:szCs w:val="56"/>
     </w:rPr>
   </w:style>
-  <w:style w:type="paragraph" w:styleId="709">
+  <w:style w:type="paragraph" w:styleId="878">
     <w:name w:val="Heading 1"/>
-    <w:basedOn w:val="706"/>
-    <w:next w:val="706"/>
+    <w:basedOn w:val="875"/>
+    <w:next w:val="875"/>
     <w:qFormat/>
     <w:pPr>
       <w:pBdr/>
@@ -31712,10 +31752,10 @@
       <w:szCs w:val="24"/>
     </w:rPr>
   </w:style>
-  <w:style w:type="paragraph" w:styleId="710">
+  <w:style w:type="paragraph" w:styleId="879">
     <w:name w:val="Heading 2"/>
-    <w:basedOn w:val="706"/>
-    <w:next w:val="706"/>
+    <w:basedOn w:val="875"/>
+    <w:next w:val="875"/>
     <w:qFormat/>
     <w:pPr>
       <w:pBdr/>
@@ -31728,10 +31768,10 @@
       <w:szCs w:val="26"/>
     </w:rPr>
   </w:style>
-  <w:style w:type="paragraph" w:styleId="711">
+  <w:style w:type="paragraph" w:styleId="880">
     <w:name w:val="Heading 3"/>
-    <w:basedOn w:val="706"/>
-    <w:next w:val="706"/>
+    <w:basedOn w:val="875"/>
+    <w:next w:val="875"/>
     <w:qFormat/>
     <w:pPr>
       <w:pBdr/>
@@ -31744,10 +31784,10 @@
       <w:szCs w:val="24"/>
     </w:rPr>
   </w:style>
-  <w:style w:type="paragraph" w:styleId="712">
+  <w:style w:type="paragraph" w:styleId="881">
     <w:name w:val="Heading 4"/>
-    <w:basedOn w:val="706"/>
-    <w:next w:val="706"/>
+    <w:basedOn w:val="875"/>
+    <w:next w:val="875"/>
     <w:qFormat/>
     <w:pPr>
       <w:pBdr/>
@@ -31760,10 +31800,10 @@
       <w:color w:val="2e74b5"/>
     </w:rPr>
   </w:style>
-  <w:style w:type="paragraph" w:styleId="713">
+  <w:style w:type="paragraph" w:styleId="882">
     <w:name w:val="Heading 5"/>
-    <w:basedOn w:val="706"/>
-    <w:next w:val="706"/>
+    <w:basedOn w:val="875"/>
+    <w:next w:val="875"/>
     <w:qFormat/>
     <w:pPr>
       <w:pBdr/>
@@ -31774,10 +31814,10 @@
       <w:color w:val="2e74b5"/>
     </w:rPr>
   </w:style>
-  <w:style w:type="paragraph" w:styleId="714">
+  <w:style w:type="paragraph" w:styleId="883">
     <w:name w:val="Heading 6"/>
-    <w:basedOn w:val="706"/>
-    <w:next w:val="706"/>
+    <w:basedOn w:val="875"/>
+    <w:next w:val="875"/>
     <w:qFormat/>
     <w:pPr>
       <w:pBdr/>
@@ -31788,10 +31828,10 @@
       <w:color w:val="1f4d78"/>
     </w:rPr>
   </w:style>
-  <w:style w:type="paragraph" w:styleId="715">
+  <w:style w:type="paragraph" w:styleId="884">
     <w:name w:val="Strong"/>
-    <w:basedOn w:val="706"/>
-    <w:next w:val="706"/>
+    <w:basedOn w:val="875"/>
+    <w:next w:val="875"/>
     <w:qFormat/>
     <w:pPr>
       <w:pBdr/>
@@ -31803,9 +31843,9 @@
       <w:bCs/>
     </w:rPr>
   </w:style>
-  <w:style w:type="paragraph" w:styleId="716">
+  <w:style w:type="paragraph" w:styleId="885">
     <w:name w:val="List Paragraph"/>
-    <w:basedOn w:val="706"/>
+    <w:basedOn w:val="875"/>
     <w:qFormat/>
     <w:pPr>
       <w:pBdr/>
@@ -31813,7 +31853,7 @@
       <w:ind/>
     </w:pPr>
   </w:style>
-  <w:style w:type="character" w:styleId="717">
+  <w:style w:type="character" w:styleId="886">
     <w:name w:val="Hyperlink"/>
     <w:uiPriority w:val="99"/>
     <w:unhideWhenUsed/>
@@ -31827,7 +31867,7 @@
       <w:u w:val="single"/>
     </w:rPr>
   </w:style>
-  <w:style w:type="character" w:styleId="718">
+  <w:style w:type="character" w:styleId="887">
     <w:name w:val="footnote reference"/>
     <w:uiPriority w:val="99"/>
     <w:semiHidden/>
@@ -31841,10 +31881,10 @@
       <w:vertAlign w:val="superscript"/>
     </w:rPr>
   </w:style>
-  <w:style w:type="paragraph" w:styleId="719">
+  <w:style w:type="paragraph" w:styleId="888">
     <w:name w:val="footnote text"/>
-    <w:basedOn w:val="706"/>
-    <w:link w:val="720"/>
+    <w:basedOn w:val="875"/>
+    <w:link w:val="889"/>
     <w:uiPriority w:val="99"/>
     <w:semiHidden/>
     <w:unhideWhenUsed/>
@@ -31858,9 +31898,9 @@
       <w:szCs w:val="20"/>
     </w:rPr>
   </w:style>
-  <w:style w:type="character" w:styleId="720">
+  <w:style w:type="character" w:styleId="889">
     <w:name w:val="Footnote Text Char"/>
-    <w:link w:val="719"/>
+    <w:link w:val="888"/>
     <w:uiPriority w:val="99"/>
     <w:semiHidden/>
     <w:unhideWhenUsed/>
@@ -31874,7 +31914,7 @@
       <w:szCs w:val="20"/>
     </w:rPr>
   </w:style>
-  <w:style w:type="character" w:styleId="721">
+  <w:style w:type="character" w:styleId="890">
     <w:name w:val="endnote reference"/>
     <w:uiPriority w:val="99"/>
     <w:semiHidden/>
@@ -31888,10 +31928,10 @@
       <w:vertAlign w:val="superscript"/>
     </w:rPr>
   </w:style>
-  <w:style w:type="paragraph" w:styleId="722">
+  <w:style w:type="paragraph" w:styleId="891">
     <w:name w:val="endnote text"/>
-    <w:basedOn w:val="706"/>
-    <w:link w:val="723"/>
+    <w:basedOn w:val="875"/>
+    <w:link w:val="892"/>
     <w:uiPriority w:val="99"/>
     <w:semiHidden/>
     <w:unhideWhenUsed/>
@@ -31905,9 +31945,9 @@
       <w:szCs w:val="20"/>
     </w:rPr>
   </w:style>
-  <w:style w:type="character" w:styleId="723">
+  <w:style w:type="character" w:styleId="892">
     <w:name w:val="Endnote Text Char"/>
-    <w:link w:val="722"/>
+    <w:link w:val="891"/>
     <w:uiPriority w:val="99"/>
     <w:semiHidden/>
     <w:unhideWhenUsed/>

</xml_diff>